<commit_message>
Projektstudie angepasst mit GDD inhalt
</commit_message>
<xml_diff>
--- a/docs/inprogress/TD-Shoot_Projektstudie.docx
+++ b/docs/inprogress/TD-Shoot_Projektstudie.docx
@@ -2641,7 +2641,21 @@
             <w:rStyle w:val="Hyperlink"/>
             <w:noProof/>
           </w:rPr>
-          <w:t>Beschreibung Spiel</w:t>
+          <w:t>Besch</w:t>
+        </w:r>
+        <w:r>
+          <w:rPr>
+            <w:rStyle w:val="Hyperlink"/>
+            <w:noProof/>
+          </w:rPr>
+          <w:t>r</w:t>
+        </w:r>
+        <w:r>
+          <w:rPr>
+            <w:rStyle w:val="Hyperlink"/>
+            <w:noProof/>
+          </w:rPr>
+          <w:t>eibung Spiel</w:t>
         </w:r>
         <w:r>
           <w:rPr>
@@ -10393,7 +10407,7 @@
             <v:imagedata r:id="rId27" o:title=""/>
             <w10:wrap type="square" side="right"/>
           </v:shape>
-          <o:OLEObject Type="Embed" ProgID="Excel.Sheet.12" ShapeID="_x0000_s2050" DrawAspect="Content" ObjectID="_1834661321" r:id="rId28"/>
+          <o:OLEObject Type="Embed" ProgID="Excel.Sheet.12" ShapeID="_x0000_s2050" DrawAspect="Content" ObjectID="_1835095748" r:id="rId28"/>
         </w:object>
       </w:r>
       <w:r>
@@ -12807,9 +12821,707 @@
     </w:p>
     <w:p>
       <w:pPr>
-        <w:rPr>
-          <w:rFonts w:eastAsia="Times New Roman"/>
-          <w:color w:val="B2A1C7" w:themeColor="accent4" w:themeTint="99"/>
+        <w:pStyle w:val="berschrift2"/>
+        <w:numPr>
+          <w:ilvl w:val="1"/>
+          <w:numId w:val="19"/>
+        </w:numPr>
+      </w:pPr>
+      <w:r>
+        <w:t>Game Loop</w:t>
+      </w:r>
+    </w:p>
+    <w:p>
+      <w:pPr>
+        <w:rPr>
+          <w:lang w:eastAsia="de-CH"/>
+        </w:rPr>
+      </w:pPr>
+    </w:p>
+    <w:p>
+      <w:pPr>
+        <w:rPr>
+          <w:lang w:eastAsia="de-CH"/>
+        </w:rPr>
+      </w:pPr>
+      <w:r>
+        <w:rPr>
+          <w:lang w:eastAsia="de-CH"/>
+        </w:rPr>
+        <w:t>Der Kern des Spiels besteht aus dem Überlebenskampf gegen kontinuierlich spawnende Gegnerwellen.</w:t>
+      </w:r>
+    </w:p>
+    <w:p>
+      <w:pPr>
+        <w:rPr>
+          <w:lang w:eastAsia="de-CH"/>
+        </w:rPr>
+      </w:pPr>
+    </w:p>
+    <w:p>
+      <w:pPr>
+        <w:pStyle w:val="Listenabsatz"/>
+        <w:numPr>
+          <w:ilvl w:val="0"/>
+          <w:numId w:val="39"/>
+        </w:numPr>
+        <w:rPr>
+          <w:lang w:eastAsia="de-CH"/>
+        </w:rPr>
+      </w:pPr>
+      <w:r>
+        <w:rPr>
+          <w:b/>
+          <w:bCs/>
+          <w:lang w:eastAsia="de-CH"/>
+        </w:rPr>
+        <w:t>Progression</w:t>
+      </w:r>
+      <w:r>
+        <w:rPr>
+          <w:lang w:eastAsia="de-CH"/>
+        </w:rPr>
+        <w:t>: Durch das Eliminieren von Gegnern erhält der Spieler Punkte (+1 Score). Das Ziel ist das Erreichen von Level 2 und ein möglichst hoher Highscore.</w:t>
+      </w:r>
+    </w:p>
+    <w:p>
+      <w:pPr>
+        <w:pStyle w:val="Listenabsatz"/>
+        <w:numPr>
+          <w:ilvl w:val="0"/>
+          <w:numId w:val="39"/>
+        </w:numPr>
+        <w:rPr>
+          <w:lang w:eastAsia="de-CH"/>
+        </w:rPr>
+      </w:pPr>
+      <w:r>
+        <w:rPr>
+          <w:b/>
+          <w:bCs/>
+          <w:lang w:eastAsia="de-CH"/>
+        </w:rPr>
+        <w:t>Zustandssteuerung (</w:t>
+      </w:r>
+      <w:r>
+        <w:rPr>
+          <w:b/>
+          <w:bCs/>
+          <w:lang w:eastAsia="de-CH"/>
+        </w:rPr>
+        <w:t>Pause)</w:t>
+      </w:r>
+      <w:r>
+        <w:rPr>
+          <w:lang w:eastAsia="de-CH"/>
+        </w:rPr>
+        <w:t>: Das Spiel nutzt eine State-</w:t>
+      </w:r>
+      <w:proofErr w:type="spellStart"/>
+      <w:r>
+        <w:rPr>
+          <w:lang w:eastAsia="de-CH"/>
+        </w:rPr>
+        <w:t>Machine</w:t>
+      </w:r>
+      <w:proofErr w:type="spellEnd"/>
+      <w:r>
+        <w:rPr>
+          <w:lang w:eastAsia="de-CH"/>
+        </w:rPr>
+        <w:t xml:space="preserve">. Über die ESC-Taste kann das Spiel jederzeit pausiert werden. Dabei wird die Update-Logik (Bewegung, </w:t>
+      </w:r>
+      <w:proofErr w:type="spellStart"/>
+      <w:r>
+        <w:rPr>
+          <w:lang w:eastAsia="de-CH"/>
+        </w:rPr>
+        <w:t>Spawning</w:t>
+      </w:r>
+      <w:proofErr w:type="spellEnd"/>
+      <w:r>
+        <w:rPr>
+          <w:lang w:eastAsia="de-CH"/>
+        </w:rPr>
+        <w:t xml:space="preserve">, </w:t>
+      </w:r>
+      <w:proofErr w:type="spellStart"/>
+      <w:r>
+        <w:rPr>
+          <w:lang w:eastAsia="de-CH"/>
+        </w:rPr>
+        <w:t>Timer</w:t>
+      </w:r>
+      <w:proofErr w:type="spellEnd"/>
+      <w:r>
+        <w:rPr>
+          <w:lang w:eastAsia="de-CH"/>
+        </w:rPr>
+        <w:t>) eingefroren, während das aktuelle Spielfeld im Hintergrund sichtbar bleibt.</w:t>
+      </w:r>
+    </w:p>
+    <w:p>
+      <w:pPr>
+        <w:rPr>
+          <w:lang w:eastAsia="de-CH"/>
+        </w:rPr>
+      </w:pPr>
+    </w:p>
+    <w:p>
+      <w:pPr>
+        <w:pStyle w:val="berschrift2"/>
+        <w:numPr>
+          <w:ilvl w:val="1"/>
+          <w:numId w:val="19"/>
+        </w:numPr>
+        <w:rPr>
+          <w:lang w:eastAsia="de-CH"/>
+        </w:rPr>
+      </w:pPr>
+      <w:r>
+        <w:rPr>
+          <w:lang w:eastAsia="de-CH"/>
+        </w:rPr>
+        <w:t>Entity</w:t>
+      </w:r>
+    </w:p>
+    <w:p>
+      <w:pPr>
+        <w:pStyle w:val="berschrift3"/>
+        <w:numPr>
+          <w:ilvl w:val="2"/>
+          <w:numId w:val="19"/>
+        </w:numPr>
+        <w:rPr>
+          <w:sz w:val="24"/>
+          <w:szCs w:val="24"/>
+          <w:lang w:eastAsia="de-CH"/>
+        </w:rPr>
+      </w:pPr>
+      <w:r>
+        <w:rPr>
+          <w:sz w:val="24"/>
+          <w:szCs w:val="24"/>
+          <w:lang w:eastAsia="de-CH"/>
+        </w:rPr>
+        <w:t>Spieler</w:t>
+      </w:r>
+    </w:p>
+    <w:p>
+      <w:pPr>
+        <w:rPr>
+          <w:lang w:eastAsia="de-CH"/>
+        </w:rPr>
+      </w:pPr>
+    </w:p>
+    <w:p>
+      <w:pPr>
+        <w:pStyle w:val="Listenabsatz"/>
+        <w:numPr>
+          <w:ilvl w:val="0"/>
+          <w:numId w:val="40"/>
+        </w:numPr>
+        <w:rPr>
+          <w:lang w:eastAsia="de-CH"/>
+        </w:rPr>
+      </w:pPr>
+      <w:r>
+        <w:rPr>
+          <w:b/>
+          <w:bCs/>
+          <w:lang w:eastAsia="de-CH"/>
+        </w:rPr>
+        <w:t>Leben</w:t>
+      </w:r>
+      <w:r>
+        <w:rPr>
+          <w:lang w:eastAsia="de-CH"/>
+        </w:rPr>
+        <w:t>: Maximal 3 Lebenspunkte.</w:t>
+      </w:r>
+    </w:p>
+    <w:p>
+      <w:pPr>
+        <w:pStyle w:val="Listenabsatz"/>
+        <w:numPr>
+          <w:ilvl w:val="0"/>
+          <w:numId w:val="40"/>
+        </w:numPr>
+        <w:rPr>
+          <w:lang w:eastAsia="de-CH"/>
+        </w:rPr>
+      </w:pPr>
+      <w:r>
+        <w:rPr>
+          <w:b/>
+          <w:bCs/>
+          <w:lang w:eastAsia="de-CH"/>
+        </w:rPr>
+        <w:t>Munition</w:t>
+      </w:r>
+      <w:r>
+        <w:rPr>
+          <w:lang w:eastAsia="de-CH"/>
+        </w:rPr>
+        <w:t xml:space="preserve">: Begrenztes Magazin mit manuellem/automatischem </w:t>
+      </w:r>
+      <w:proofErr w:type="spellStart"/>
+      <w:r>
+        <w:rPr>
+          <w:lang w:eastAsia="de-CH"/>
+        </w:rPr>
+        <w:t>Reload</w:t>
+      </w:r>
+      <w:proofErr w:type="spellEnd"/>
+      <w:r>
+        <w:rPr>
+          <w:lang w:eastAsia="de-CH"/>
+        </w:rPr>
+        <w:t xml:space="preserve"> (R-Taste). Als Belohnung für den Fortschritt erhöht sich die maximale Magazinkapazität alle 100 Punkte um +5 Schuss.</w:t>
+      </w:r>
+    </w:p>
+    <w:p>
+      <w:pPr>
+        <w:pStyle w:val="Listenabsatz"/>
+        <w:numPr>
+          <w:ilvl w:val="0"/>
+          <w:numId w:val="40"/>
+        </w:numPr>
+        <w:rPr>
+          <w:lang w:eastAsia="de-CH"/>
+        </w:rPr>
+      </w:pPr>
+      <w:r>
+        <w:rPr>
+          <w:b/>
+          <w:bCs/>
+          <w:lang w:eastAsia="de-CH"/>
+        </w:rPr>
+        <w:t>Score</w:t>
+      </w:r>
+      <w:r>
+        <w:rPr>
+          <w:lang w:eastAsia="de-CH"/>
+        </w:rPr>
+        <w:t xml:space="preserve"> Akkumulierte Punkte durch besiegte Gegner.</w:t>
+      </w:r>
+    </w:p>
+    <w:p>
+      <w:pPr>
+        <w:pStyle w:val="Listenabsatz"/>
+        <w:numPr>
+          <w:ilvl w:val="0"/>
+          <w:numId w:val="40"/>
+        </w:numPr>
+        <w:rPr>
+          <w:lang w:eastAsia="de-CH"/>
+        </w:rPr>
+      </w:pPr>
+      <w:r>
+        <w:rPr>
+          <w:b/>
+          <w:bCs/>
+          <w:lang w:eastAsia="de-CH"/>
+        </w:rPr>
+        <w:t>Waffe</w:t>
+      </w:r>
+      <w:r>
+        <w:rPr>
+          <w:lang w:eastAsia="de-CH"/>
+        </w:rPr>
+        <w:t>: Eine Fernkampfwaffe (</w:t>
+      </w:r>
+      <w:r>
+        <w:rPr>
+          <w:lang w:eastAsia="de-CH"/>
+        </w:rPr>
+        <w:t>Projektil Basis</w:t>
+      </w:r>
+      <w:r>
+        <w:rPr>
+          <w:lang w:eastAsia="de-CH"/>
+        </w:rPr>
+        <w:t>).</w:t>
+      </w:r>
+    </w:p>
+    <w:p>
+      <w:pPr>
+        <w:rPr>
+          <w:lang w:eastAsia="de-CH"/>
+        </w:rPr>
+      </w:pPr>
+    </w:p>
+    <w:p>
+      <w:pPr>
+        <w:pStyle w:val="berschrift3"/>
+        <w:numPr>
+          <w:ilvl w:val="2"/>
+          <w:numId w:val="19"/>
+        </w:numPr>
+        <w:rPr>
+          <w:sz w:val="24"/>
+          <w:szCs w:val="24"/>
+          <w:lang w:eastAsia="de-CH"/>
+        </w:rPr>
+      </w:pPr>
+      <w:r>
+        <w:rPr>
+          <w:sz w:val="24"/>
+          <w:szCs w:val="24"/>
+          <w:lang w:eastAsia="de-CH"/>
+        </w:rPr>
+        <w:t>Gegner</w:t>
+      </w:r>
+    </w:p>
+    <w:p>
+      <w:pPr>
+        <w:rPr>
+          <w:lang w:eastAsia="de-CH"/>
+        </w:rPr>
+      </w:pPr>
+    </w:p>
+    <w:p>
+      <w:pPr>
+        <w:pStyle w:val="Listenabsatz"/>
+        <w:numPr>
+          <w:ilvl w:val="0"/>
+          <w:numId w:val="41"/>
+        </w:numPr>
+        <w:rPr>
+          <w:lang w:eastAsia="de-CH"/>
+        </w:rPr>
+      </w:pPr>
+      <w:r>
+        <w:rPr>
+          <w:b/>
+          <w:bCs/>
+          <w:lang w:eastAsia="de-CH"/>
+        </w:rPr>
+        <w:t>Skalierung</w:t>
+      </w:r>
+      <w:r>
+        <w:rPr>
+          <w:lang w:eastAsia="de-CH"/>
+        </w:rPr>
+        <w:t xml:space="preserve">: Mit steigendem Score erhöhen sich die Geschwindigkeit und die </w:t>
+      </w:r>
+      <w:proofErr w:type="spellStart"/>
+      <w:r>
+        <w:rPr>
+          <w:lang w:eastAsia="de-CH"/>
+        </w:rPr>
+        <w:t>Spawnmenge</w:t>
+      </w:r>
+      <w:proofErr w:type="spellEnd"/>
+      <w:r>
+        <w:rPr>
+          <w:lang w:eastAsia="de-CH"/>
+        </w:rPr>
+        <w:t xml:space="preserve"> und die Schwierigkeit der Gegner.</w:t>
+      </w:r>
+    </w:p>
+    <w:p>
+      <w:pPr>
+        <w:pStyle w:val="Listenabsatz"/>
+        <w:numPr>
+          <w:ilvl w:val="0"/>
+          <w:numId w:val="41"/>
+        </w:numPr>
+        <w:rPr>
+          <w:lang w:eastAsia="de-CH"/>
+        </w:rPr>
+      </w:pPr>
+      <w:r>
+        <w:rPr>
+          <w:b/>
+          <w:bCs/>
+          <w:lang w:eastAsia="de-CH"/>
+        </w:rPr>
+        <w:t>Leben</w:t>
+      </w:r>
+      <w:r>
+        <w:rPr>
+          <w:lang w:eastAsia="de-CH"/>
+        </w:rPr>
+        <w:t>: Startwert beträgt 1 HP.</w:t>
+      </w:r>
+    </w:p>
+    <w:p>
+      <w:pPr>
+        <w:pStyle w:val="Listenabsatz"/>
+        <w:numPr>
+          <w:ilvl w:val="0"/>
+          <w:numId w:val="41"/>
+        </w:numPr>
+        <w:rPr>
+          <w:lang w:eastAsia="de-CH"/>
+        </w:rPr>
+      </w:pPr>
+      <w:r>
+        <w:rPr>
+          <w:b/>
+          <w:bCs/>
+          <w:lang w:eastAsia="de-CH"/>
+        </w:rPr>
+        <w:t>Nahkampfschaden</w:t>
+      </w:r>
+      <w:r>
+        <w:rPr>
+          <w:lang w:eastAsia="de-CH"/>
+        </w:rPr>
+        <w:t>: Bei physischem Kontakt mit dem Spieler verliert dieser Lebenspunkte.</w:t>
+      </w:r>
+    </w:p>
+    <w:p>
+      <w:pPr>
+        <w:pStyle w:val="Listenabsatz"/>
+        <w:numPr>
+          <w:ilvl w:val="0"/>
+          <w:numId w:val="41"/>
+        </w:numPr>
+        <w:rPr>
+          <w:lang w:eastAsia="de-CH"/>
+        </w:rPr>
+      </w:pPr>
+      <w:r>
+        <w:rPr>
+          <w:b/>
+          <w:bCs/>
+          <w:lang w:eastAsia="de-CH"/>
+        </w:rPr>
+        <w:t>Bewegung</w:t>
+      </w:r>
+      <w:r>
+        <w:rPr>
+          <w:lang w:eastAsia="de-CH"/>
+        </w:rPr>
+        <w:t>: Gegner verfolgen den Spieler aktiv auf der Karte.</w:t>
+      </w:r>
+    </w:p>
+    <w:p>
+      <w:pPr>
+        <w:pStyle w:val="Listenabsatz"/>
+        <w:numPr>
+          <w:ilvl w:val="0"/>
+          <w:numId w:val="41"/>
+        </w:numPr>
+        <w:rPr>
+          <w:lang w:eastAsia="de-CH"/>
+        </w:rPr>
+      </w:pPr>
+      <w:r>
+        <w:rPr>
+          <w:b/>
+          <w:bCs/>
+          <w:lang w:eastAsia="de-CH"/>
+        </w:rPr>
+        <w:t>Spawn-System</w:t>
+      </w:r>
+      <w:r>
+        <w:rPr>
+          <w:lang w:eastAsia="de-CH"/>
+        </w:rPr>
+        <w:t>: Gegner erscheinen an den Kartenrändern, jedoch außerhalb eines Sicherheitsradius um den Spieler.</w:t>
+      </w:r>
+    </w:p>
+    <w:p>
+      <w:pPr>
+        <w:rPr>
+          <w:lang w:eastAsia="de-CH"/>
+        </w:rPr>
+      </w:pPr>
+    </w:p>
+    <w:p>
+      <w:pPr>
+        <w:pStyle w:val="berschrift3"/>
+        <w:numPr>
+          <w:ilvl w:val="2"/>
+          <w:numId w:val="19"/>
+        </w:numPr>
+        <w:rPr>
+          <w:sz w:val="24"/>
+          <w:szCs w:val="24"/>
+          <w:lang w:eastAsia="de-CH"/>
+        </w:rPr>
+      </w:pPr>
+      <w:r>
+        <w:rPr>
+          <w:sz w:val="24"/>
+          <w:szCs w:val="24"/>
+          <w:lang w:eastAsia="de-CH"/>
+        </w:rPr>
+        <w:t>Projektile (Schüsse)</w:t>
+      </w:r>
+    </w:p>
+    <w:p>
+      <w:pPr>
+        <w:rPr>
+          <w:lang w:eastAsia="de-CH"/>
+        </w:rPr>
+      </w:pPr>
+    </w:p>
+    <w:p>
+      <w:pPr>
+        <w:pStyle w:val="Listenabsatz"/>
+        <w:numPr>
+          <w:ilvl w:val="0"/>
+          <w:numId w:val="42"/>
+        </w:numPr>
+        <w:rPr>
+          <w:lang w:eastAsia="de-CH"/>
+        </w:rPr>
+      </w:pPr>
+      <w:r>
+        <w:rPr>
+          <w:lang w:eastAsia="de-CH"/>
+        </w:rPr>
+        <w:t>Kleine Projektile, die bei Kollision Schaden verursachen.</w:t>
+      </w:r>
+    </w:p>
+    <w:p>
+      <w:pPr>
+        <w:pStyle w:val="Listenabsatz"/>
+        <w:numPr>
+          <w:ilvl w:val="0"/>
+          <w:numId w:val="42"/>
+        </w:numPr>
+        <w:rPr>
+          <w:lang w:eastAsia="de-CH"/>
+        </w:rPr>
+      </w:pPr>
+      <w:r>
+        <w:rPr>
+          <w:b/>
+          <w:bCs/>
+          <w:lang w:eastAsia="de-CH"/>
+        </w:rPr>
+        <w:t>Kollisionsverhalten</w:t>
+      </w:r>
+    </w:p>
+    <w:p>
+      <w:pPr>
+        <w:pStyle w:val="Listenabsatz"/>
+        <w:numPr>
+          <w:ilvl w:val="1"/>
+          <w:numId w:val="42"/>
+        </w:numPr>
+        <w:rPr>
+          <w:lang w:eastAsia="de-CH"/>
+        </w:rPr>
+      </w:pPr>
+      <w:r>
+        <w:rPr>
+          <w:b/>
+          <w:bCs/>
+          <w:lang w:eastAsia="de-CH"/>
+        </w:rPr>
+        <w:t>Hindernisse</w:t>
+      </w:r>
+      <w:r>
+        <w:rPr>
+          <w:lang w:eastAsia="de-CH"/>
+        </w:rPr>
+        <w:t>: Das Projektil wird bei Kontakt mit der Umgebung zerstört.</w:t>
+      </w:r>
+    </w:p>
+    <w:p>
+      <w:pPr>
+        <w:pStyle w:val="Listenabsatz"/>
+        <w:numPr>
+          <w:ilvl w:val="1"/>
+          <w:numId w:val="42"/>
+        </w:numPr>
+        <w:rPr>
+          <w:lang w:eastAsia="de-CH"/>
+        </w:rPr>
+      </w:pPr>
+      <w:r>
+        <w:rPr>
+          <w:b/>
+          <w:bCs/>
+          <w:lang w:eastAsia="de-CH"/>
+        </w:rPr>
+        <w:t>Gegner</w:t>
+      </w:r>
+      <w:r>
+        <w:rPr>
+          <w:lang w:eastAsia="de-CH"/>
+        </w:rPr>
+        <w:t>: Das Projektil fügt dem Gegner Schaden zu und wird meist zerstört.</w:t>
+      </w:r>
+    </w:p>
+    <w:p>
+      <w:pPr>
+        <w:rPr>
+          <w:lang w:eastAsia="de-CH"/>
+        </w:rPr>
+      </w:pPr>
+    </w:p>
+    <w:p>
+      <w:pPr>
+        <w:pStyle w:val="berschrift3"/>
+        <w:numPr>
+          <w:ilvl w:val="2"/>
+          <w:numId w:val="19"/>
+        </w:numPr>
+        <w:rPr>
+          <w:sz w:val="24"/>
+          <w:szCs w:val="24"/>
+          <w:lang w:eastAsia="de-CH"/>
+        </w:rPr>
+      </w:pPr>
+      <w:r>
+        <w:rPr>
+          <w:sz w:val="24"/>
+          <w:szCs w:val="24"/>
+          <w:lang w:eastAsia="de-CH"/>
+        </w:rPr>
+        <w:t>U</w:t>
+      </w:r>
+      <w:r>
+        <w:rPr>
+          <w:sz w:val="24"/>
+          <w:szCs w:val="24"/>
+          <w:lang w:eastAsia="de-CH"/>
+        </w:rPr>
+        <w:t>mgebung</w:t>
+      </w:r>
+    </w:p>
+    <w:p>
+      <w:pPr>
+        <w:rPr>
+          <w:lang w:eastAsia="de-CH"/>
+        </w:rPr>
+      </w:pPr>
+    </w:p>
+    <w:p>
+      <w:pPr>
+        <w:rPr>
+          <w:lang w:eastAsia="de-CH"/>
+        </w:rPr>
+      </w:pPr>
+      <w:r>
+        <w:rPr>
+          <w:lang w:eastAsia="de-CH"/>
+        </w:rPr>
+        <w:t>Die Karten werden manuell erstellt und enthalten statische Hindernisse, die weder von Spielern noch von Gegnern oder Projektilen passiert werden können.</w:t>
+      </w:r>
+    </w:p>
+    <w:p>
+      <w:pPr>
+        <w:rPr>
+          <w:lang w:eastAsia="de-CH"/>
+        </w:rPr>
+      </w:pPr>
+    </w:p>
+    <w:p>
+      <w:pPr>
+        <w:pStyle w:val="berschrift4"/>
+        <w:numPr>
+          <w:ilvl w:val="3"/>
+          <w:numId w:val="19"/>
+        </w:numPr>
+        <w:rPr>
           <w:sz w:val="22"/>
           <w:szCs w:val="22"/>
           <w:lang w:eastAsia="de-CH"/>
@@ -12817,107 +13529,16 @@
       </w:pPr>
       <w:r>
         <w:rPr>
-          <w:rFonts w:eastAsia="Times New Roman"/>
-          <w:color w:val="B2A1C7" w:themeColor="accent4" w:themeTint="99"/>
           <w:sz w:val="22"/>
           <w:szCs w:val="22"/>
           <w:lang w:eastAsia="de-CH"/>
         </w:rPr>
-        <w:t>Das Projekt „TD</w:t>
-      </w:r>
-      <w:r>
-        <w:rPr>
-          <w:rFonts w:eastAsia="Times New Roman"/>
-          <w:color w:val="B2A1C7" w:themeColor="accent4" w:themeTint="99"/>
-          <w:sz w:val="22"/>
-          <w:szCs w:val="22"/>
-          <w:lang w:eastAsia="de-CH"/>
-        </w:rPr>
-        <w:noBreakHyphen/>
-        <w:t>Shooter“ ist ein einfaches 2D</w:t>
-      </w:r>
-      <w:r>
-        <w:rPr>
-          <w:rFonts w:eastAsia="Times New Roman"/>
-          <w:color w:val="B2A1C7" w:themeColor="accent4" w:themeTint="99"/>
-          <w:sz w:val="22"/>
-          <w:szCs w:val="22"/>
-          <w:lang w:eastAsia="de-CH"/>
-        </w:rPr>
-        <w:noBreakHyphen/>
-        <w:t>Top</w:t>
-      </w:r>
-      <w:r>
-        <w:rPr>
-          <w:rFonts w:eastAsia="Times New Roman"/>
-          <w:color w:val="B2A1C7" w:themeColor="accent4" w:themeTint="99"/>
-          <w:sz w:val="22"/>
-          <w:szCs w:val="22"/>
-          <w:lang w:eastAsia="de-CH"/>
-        </w:rPr>
-        <w:noBreakHyphen/>
-        <w:t>Down</w:t>
-      </w:r>
-      <w:r>
-        <w:rPr>
-          <w:rFonts w:eastAsia="Times New Roman"/>
-          <w:color w:val="B2A1C7" w:themeColor="accent4" w:themeTint="99"/>
-          <w:sz w:val="22"/>
-          <w:szCs w:val="22"/>
-          <w:lang w:eastAsia="de-CH"/>
-        </w:rPr>
-        <w:noBreakHyphen/>
-        <w:t>Shooter</w:t>
-      </w:r>
-      <w:r>
-        <w:rPr>
-          <w:rFonts w:eastAsia="Times New Roman"/>
-          <w:color w:val="B2A1C7" w:themeColor="accent4" w:themeTint="99"/>
-          <w:sz w:val="22"/>
-          <w:szCs w:val="22"/>
-          <w:lang w:eastAsia="de-CH"/>
-        </w:rPr>
-        <w:noBreakHyphen/>
-        <w:t xml:space="preserve">Spiel, in dem der Spieler eine Figur aus der Vogelperspektive über ein Spielfeld steuert und gegen auftauchende Gegner antritt. Gesteuert wird die Spielfigur mit der Tastatur (z.B. WASD für Bewegung, </w:t>
-      </w:r>
-      <w:r>
-        <w:rPr>
-          <w:rFonts w:eastAsia="Times New Roman"/>
-          <w:color w:val="B2A1C7" w:themeColor="accent4" w:themeTint="99"/>
-          <w:sz w:val="22"/>
-          <w:szCs w:val="22"/>
-          <w:lang w:eastAsia="de-CH"/>
-        </w:rPr>
-        <w:t>und Maus</w:t>
-      </w:r>
-      <w:r>
-        <w:rPr>
-          <w:rFonts w:eastAsia="Times New Roman"/>
-          <w:color w:val="B2A1C7" w:themeColor="accent4" w:themeTint="99"/>
-          <w:sz w:val="22"/>
-          <w:szCs w:val="22"/>
-          <w:lang w:eastAsia="de-CH"/>
-        </w:rPr>
-        <w:t xml:space="preserve"> zum Schiessen), während Gegner den Spieler verfolgen oder beschiessen und bei Kollision bzw. Treffern Lebenspunkte abziehen. Durch das Ausschalten von Gegnern erhält der Spieler Punkte; bei Erreichen einer definierten Punktzahl oder nach einer bestimmten Überlebenszeit gilt das Level als gewonnen, bei Verlust aller Lebenspunkte als verloren</w:t>
-      </w:r>
-      <w:r>
-        <w:rPr>
-          <w:rFonts w:eastAsia="Times New Roman"/>
-          <w:color w:val="B2A1C7" w:themeColor="accent4" w:themeTint="99"/>
-          <w:sz w:val="22"/>
-          <w:szCs w:val="22"/>
-          <w:lang w:eastAsia="de-CH"/>
-        </w:rPr>
-        <w:t>.</w:t>
+        <w:t>Level 1</w:t>
       </w:r>
     </w:p>
     <w:p>
       <w:pPr>
         <w:rPr>
-          <w:rFonts w:eastAsia="Times New Roman"/>
-          <w:color w:val="B2A1C7" w:themeColor="accent4" w:themeTint="99"/>
-          <w:sz w:val="22"/>
-          <w:szCs w:val="22"/>
           <w:lang w:eastAsia="de-CH"/>
         </w:rPr>
       </w:pPr>
@@ -12925,106 +13546,672 @@
     <w:p>
       <w:pPr>
         <w:rPr>
-          <w:rFonts w:eastAsia="Times New Roman"/>
-          <w:color w:val="B2A1C7" w:themeColor="accent4" w:themeTint="99"/>
-          <w:sz w:val="22"/>
-          <w:szCs w:val="22"/>
-          <w:lang w:eastAsia="de-CH"/>
-        </w:rPr>
-      </w:pPr>
-      <w:r>
-        <w:rPr>
-          <w:rFonts w:eastAsia="Times New Roman"/>
-          <w:color w:val="B2A1C7" w:themeColor="accent4" w:themeTint="99"/>
-          <w:sz w:val="22"/>
-          <w:szCs w:val="22"/>
-          <w:lang w:eastAsia="de-CH"/>
-        </w:rPr>
-        <w:t>Technisch wird das Spiel als 2D</w:t>
-      </w:r>
-      <w:r>
-        <w:rPr>
-          <w:rFonts w:eastAsia="Times New Roman"/>
-          <w:color w:val="B2A1C7" w:themeColor="accent4" w:themeTint="99"/>
-          <w:sz w:val="22"/>
-          <w:szCs w:val="22"/>
-          <w:lang w:eastAsia="de-CH"/>
-        </w:rPr>
-        <w:noBreakHyphen/>
-        <w:t>Spiel mit einer Python</w:t>
-      </w:r>
-      <w:r>
-        <w:rPr>
-          <w:rFonts w:eastAsia="Times New Roman"/>
-          <w:color w:val="B2A1C7" w:themeColor="accent4" w:themeTint="99"/>
-          <w:sz w:val="22"/>
-          <w:szCs w:val="22"/>
-          <w:lang w:eastAsia="de-CH"/>
-        </w:rPr>
-        <w:noBreakHyphen/>
-        <w:t>Bibliothek (</w:t>
-      </w:r>
-      <w:proofErr w:type="spellStart"/>
-      <w:r>
-        <w:rPr>
-          <w:rFonts w:eastAsia="Times New Roman"/>
-          <w:color w:val="B2A1C7" w:themeColor="accent4" w:themeTint="99"/>
-          <w:sz w:val="22"/>
-          <w:szCs w:val="22"/>
-          <w:lang w:eastAsia="de-CH"/>
-        </w:rPr>
-        <w:t>Pygame</w:t>
-      </w:r>
-      <w:proofErr w:type="spellEnd"/>
-      <w:r>
-        <w:rPr>
-          <w:rFonts w:eastAsia="Times New Roman"/>
-          <w:color w:val="B2A1C7" w:themeColor="accent4" w:themeTint="99"/>
-          <w:sz w:val="22"/>
-          <w:szCs w:val="22"/>
-          <w:lang w:eastAsia="de-CH"/>
-        </w:rPr>
-        <w:t>) umgesetzt und als ausführbare EXE für die Zielumgebung bereitgestellt, sodass es ohne Entwicklungsumgebung gestartet werden kann. Grafiken und Sounds sind bewusst einfach gehalten, um den Fokus auf eine stabile, gut steuerbare Spiellogik und die Umsetzung der Projekt</w:t>
-      </w:r>
-      <w:r>
-        <w:rPr>
-          <w:rFonts w:eastAsia="Times New Roman"/>
-          <w:color w:val="B2A1C7" w:themeColor="accent4" w:themeTint="99"/>
-          <w:sz w:val="22"/>
-          <w:szCs w:val="22"/>
-          <w:lang w:eastAsia="de-CH"/>
-        </w:rPr>
-        <w:noBreakHyphen/>
-        <w:t xml:space="preserve"> und Qualitätsanforderungen im Rahmen der sechs Kurstage zu legen</w:t>
-      </w:r>
-      <w:r>
-        <w:rPr>
-          <w:rFonts w:eastAsia="Times New Roman"/>
-          <w:color w:val="B2A1C7" w:themeColor="accent4" w:themeTint="99"/>
-          <w:sz w:val="22"/>
-          <w:szCs w:val="22"/>
-          <w:lang w:eastAsia="de-CH"/>
-        </w:rPr>
-        <w:t>.</w:t>
+          <w:lang w:eastAsia="de-CH"/>
+        </w:rPr>
+      </w:pPr>
+      <w:r>
+        <w:rPr>
+          <w:lang w:eastAsia="de-CH"/>
+        </w:rPr>
+        <w:t>Wenige Hindernisse; dient als Tutorial zur Einführung in die Steuerung und Mechaniken.</w:t>
       </w:r>
     </w:p>
     <w:p>
       <w:pPr>
-        <w:pStyle w:val="TextCDB"/>
-        <w:tabs>
-          <w:tab w:val="left" w:pos="3262"/>
-        </w:tabs>
-        <w:rPr>
-          <w:lang w:val="de-CH"/>
+        <w:rPr>
+          <w:lang w:eastAsia="de-CH"/>
         </w:rPr>
       </w:pPr>
     </w:p>
+    <w:p>
+      <w:pPr>
+        <w:pStyle w:val="berschrift4"/>
+        <w:numPr>
+          <w:ilvl w:val="3"/>
+          <w:numId w:val="19"/>
+        </w:numPr>
+        <w:rPr>
+          <w:sz w:val="22"/>
+          <w:szCs w:val="32"/>
+          <w:lang w:eastAsia="de-CH"/>
+        </w:rPr>
+      </w:pPr>
+      <w:r>
+        <w:rPr>
+          <w:sz w:val="22"/>
+          <w:szCs w:val="32"/>
+          <w:lang w:eastAsia="de-CH"/>
+        </w:rPr>
+        <w:t>Level 2</w:t>
+      </w:r>
+    </w:p>
+    <w:p>
+      <w:pPr>
+        <w:rPr>
+          <w:lang w:eastAsia="de-CH"/>
+        </w:rPr>
+      </w:pPr>
+    </w:p>
+    <w:p>
+      <w:pPr>
+        <w:rPr>
+          <w:lang w:eastAsia="de-CH"/>
+        </w:rPr>
+      </w:pPr>
+      <w:r>
+        <w:rPr>
+          <w:lang w:eastAsia="de-CH"/>
+        </w:rPr>
+        <w:t>Erhöhte Komplexität durch viele Hindernisse und Sackgassen, um den Spieler strategisch zu fordern.</w:t>
+      </w:r>
+    </w:p>
+    <w:p>
+      <w:pPr>
+        <w:rPr>
+          <w:lang w:eastAsia="de-CH"/>
+        </w:rPr>
+      </w:pPr>
+    </w:p>
+    <w:p>
+      <w:pPr>
+        <w:pStyle w:val="berschrift2"/>
+        <w:numPr>
+          <w:ilvl w:val="1"/>
+          <w:numId w:val="19"/>
+        </w:numPr>
+        <w:rPr>
+          <w:lang w:eastAsia="de-CH"/>
+        </w:rPr>
+      </w:pPr>
+      <w:r>
+        <w:rPr>
+          <w:lang w:eastAsia="de-CH"/>
+        </w:rPr>
+        <w:t>Benutzeroberfläche (Details)</w:t>
+      </w:r>
+    </w:p>
+    <w:p>
+      <w:pPr>
+        <w:rPr>
+          <w:lang w:eastAsia="de-CH"/>
+        </w:rPr>
+      </w:pPr>
+    </w:p>
+    <w:p>
+      <w:pPr>
+        <w:rPr>
+          <w:lang w:eastAsia="de-CH"/>
+        </w:rPr>
+      </w:pPr>
+      <w:r>
+        <w:rPr>
+          <w:lang w:eastAsia="de-CH"/>
+        </w:rPr>
+        <w:t xml:space="preserve">Bei einem Munitionserhöhung oder wenn die Gegneranzahl pro Welle </w:t>
+      </w:r>
+      <w:r>
+        <w:rPr>
+          <w:lang w:eastAsia="de-CH"/>
+        </w:rPr>
+        <w:t>erhöht,</w:t>
+      </w:r>
+      <w:r>
+        <w:rPr>
+          <w:lang w:eastAsia="de-CH"/>
+        </w:rPr>
+        <w:t xml:space="preserve"> werden kommt eine Benachrichtigung.</w:t>
+      </w:r>
+    </w:p>
+    <w:p>
+      <w:pPr>
+        <w:rPr>
+          <w:lang w:eastAsia="de-CH"/>
+        </w:rPr>
+      </w:pPr>
+      <w:r>
+        <w:rPr>
+          <w:lang w:eastAsia="de-CH"/>
+        </w:rPr>
+        <w:t>Das HUD besteht aus vier Kernelementen:</w:t>
+      </w:r>
+    </w:p>
+    <w:p>
+      <w:pPr>
+        <w:rPr>
+          <w:lang w:eastAsia="de-CH"/>
+        </w:rPr>
+      </w:pPr>
+    </w:p>
+    <w:p>
+      <w:pPr>
+        <w:pStyle w:val="Listenabsatz"/>
+        <w:numPr>
+          <w:ilvl w:val="1"/>
+          <w:numId w:val="38"/>
+        </w:numPr>
+        <w:rPr>
+          <w:lang w:eastAsia="de-CH"/>
+        </w:rPr>
+      </w:pPr>
+      <w:r>
+        <w:rPr>
+          <w:b/>
+          <w:bCs/>
+          <w:lang w:eastAsia="de-CH"/>
+        </w:rPr>
+        <w:t>Lebensanzeige</w:t>
+      </w:r>
+      <w:r>
+        <w:rPr>
+          <w:lang w:eastAsia="de-CH"/>
+        </w:rPr>
+        <w:t>: Horizontal am oberen linken Bildschirmrand.</w:t>
+      </w:r>
+    </w:p>
+    <w:p>
+      <w:pPr>
+        <w:pStyle w:val="Listenabsatz"/>
+        <w:numPr>
+          <w:ilvl w:val="1"/>
+          <w:numId w:val="38"/>
+        </w:numPr>
+        <w:rPr>
+          <w:lang w:eastAsia="de-CH"/>
+        </w:rPr>
+      </w:pPr>
+      <w:r>
+        <w:rPr>
+          <w:b/>
+          <w:bCs/>
+          <w:lang w:eastAsia="de-CH"/>
+        </w:rPr>
+        <w:t>Score</w:t>
+      </w:r>
+      <w:r>
+        <w:rPr>
+          <w:lang w:eastAsia="de-CH"/>
+        </w:rPr>
+        <w:t>: Direkt unter der Lebensanzeige.</w:t>
+      </w:r>
+    </w:p>
+    <w:p>
+      <w:pPr>
+        <w:pStyle w:val="Listenabsatz"/>
+        <w:numPr>
+          <w:ilvl w:val="1"/>
+          <w:numId w:val="38"/>
+        </w:numPr>
+        <w:rPr>
+          <w:lang w:eastAsia="de-CH"/>
+        </w:rPr>
+      </w:pPr>
+      <w:r>
+        <w:rPr>
+          <w:b/>
+          <w:bCs/>
+          <w:lang w:eastAsia="de-CH"/>
+        </w:rPr>
+        <w:t>Munitionsanzeige</w:t>
+      </w:r>
+      <w:r>
+        <w:rPr>
+          <w:lang w:eastAsia="de-CH"/>
+        </w:rPr>
+        <w:t>: Vertikaler Balken in der unteren rechten Ecke.</w:t>
+      </w:r>
+    </w:p>
+    <w:p>
+      <w:pPr>
+        <w:pStyle w:val="Listenabsatz"/>
+        <w:numPr>
+          <w:ilvl w:val="1"/>
+          <w:numId w:val="38"/>
+        </w:numPr>
+        <w:rPr>
+          <w:lang w:eastAsia="de-CH"/>
+        </w:rPr>
+      </w:pPr>
+      <w:r>
+        <w:rPr>
+          <w:b/>
+          <w:bCs/>
+          <w:lang w:eastAsia="de-CH"/>
+        </w:rPr>
+        <w:lastRenderedPageBreak/>
+        <w:t>Spielfeld</w:t>
+      </w:r>
+      <w:r>
+        <w:rPr>
+          <w:lang w:eastAsia="de-CH"/>
+        </w:rPr>
+        <w:t>: Zentraler Bereich für die Action.</w:t>
+      </w:r>
+    </w:p>
+    <w:p>
+      <w:pPr>
+        <w:rPr>
+          <w:lang w:eastAsia="de-CH"/>
+        </w:rPr>
+      </w:pPr>
+    </w:p>
+    <w:p>
+      <w:pPr>
+        <w:keepNext/>
+      </w:pPr>
+      <w:r>
+        <w:rPr>
+          <w:lang w:eastAsia="de-CH"/>
+        </w:rPr>
+        <w:drawing>
+          <wp:inline distT="0" distB="0" distL="0" distR="0" wp14:anchorId="5CB37B36" wp14:editId="779B4E69">
+            <wp:extent cx="6119495" cy="4475480"/>
+            <wp:effectExtent l="0" t="0" r="0" b="1270"/>
+            <wp:docPr id="2060489089" name="Grafik 1"/>
+            <wp:cNvGraphicFramePr>
+              <a:graphicFrameLocks xmlns:a="http://schemas.openxmlformats.org/drawingml/2006/main" noChangeAspect="1"/>
+            </wp:cNvGraphicFramePr>
+            <a:graphic xmlns:a="http://schemas.openxmlformats.org/drawingml/2006/main">
+              <a:graphicData uri="http://schemas.openxmlformats.org/drawingml/2006/picture">
+                <pic:pic xmlns:pic="http://schemas.openxmlformats.org/drawingml/2006/picture">
+                  <pic:nvPicPr>
+                    <pic:cNvPr id="2060489089" name=""/>
+                    <pic:cNvPicPr/>
+                  </pic:nvPicPr>
+                  <pic:blipFill>
+                    <a:blip r:embed="rId30"/>
+                    <a:stretch>
+                      <a:fillRect/>
+                    </a:stretch>
+                  </pic:blipFill>
+                  <pic:spPr>
+                    <a:xfrm>
+                      <a:off x="0" y="0"/>
+                      <a:ext cx="6119495" cy="4475480"/>
+                    </a:xfrm>
+                    <a:prstGeom prst="rect">
+                      <a:avLst/>
+                    </a:prstGeom>
+                  </pic:spPr>
+                </pic:pic>
+              </a:graphicData>
+            </a:graphic>
+          </wp:inline>
+        </w:drawing>
+      </w:r>
+    </w:p>
+    <w:p>
+      <w:pPr>
+        <w:pStyle w:val="Beschriftung"/>
+      </w:pPr>
+      <w:r>
+        <w:t xml:space="preserve">Abbildung </w:t>
+      </w:r>
+      <w:r>
+        <w:fldChar w:fldCharType="begin"/>
+      </w:r>
+      <w:r>
+        <w:instrText xml:space="preserve"> SEQ Abbildung \* ARABIC </w:instrText>
+      </w:r>
+      <w:r>
+        <w:fldChar w:fldCharType="separate"/>
+      </w:r>
+      <w:r>
+        <w:rPr>
+          <w:noProof/>
+        </w:rPr>
+        <w:t>1</w:t>
+      </w:r>
+      <w:r>
+        <w:fldChar w:fldCharType="end"/>
+      </w:r>
+      <w:r>
+        <w:t>: HUD-Anordnung</w:t>
+      </w:r>
+    </w:p>
+    <w:p>
+      <w:pPr>
+        <w:rPr>
+          <w:lang w:eastAsia="de-CH"/>
+        </w:rPr>
+      </w:pPr>
+      <w:r>
+        <w:rPr>
+          <w:b/>
+          <w:bCs/>
+          <w:lang w:eastAsia="de-CH"/>
+        </w:rPr>
+        <w:t>Design-Update</w:t>
+      </w:r>
+      <w:r>
+        <w:rPr>
+          <w:i/>
+          <w:iCs/>
+          <w:lang w:eastAsia="de-CH"/>
+        </w:rPr>
+        <w:t>: Zur Verbesserung der visuellen Klarheit und Hitbox-Präzision wird der Spieler als minimalistisches Quadrat dargestellt</w:t>
+      </w:r>
+    </w:p>
+    <w:p>
+      <w:pPr>
+        <w:rPr>
+          <w:lang w:eastAsia="de-CH"/>
+        </w:rPr>
+      </w:pPr>
+    </w:p>
+    <w:p>
+      <w:pPr>
+        <w:pStyle w:val="berschrift2"/>
+        <w:numPr>
+          <w:ilvl w:val="1"/>
+          <w:numId w:val="19"/>
+        </w:numPr>
+        <w:rPr>
+          <w:lang w:eastAsia="de-CH"/>
+        </w:rPr>
+      </w:pPr>
+      <w:r>
+        <w:rPr>
+          <w:lang w:eastAsia="de-CH"/>
+        </w:rPr>
+        <w:t>Software-Architektur</w:t>
+      </w:r>
+    </w:p>
+    <w:p>
+      <w:pPr>
+        <w:rPr>
+          <w:lang w:eastAsia="de-CH"/>
+        </w:rPr>
+      </w:pPr>
+    </w:p>
+    <w:p>
+      <w:pPr>
+        <w:rPr>
+          <w:lang w:eastAsia="de-CH"/>
+        </w:rPr>
+      </w:pPr>
+      <w:r>
+        <w:rPr>
+          <w:lang w:eastAsia="de-CH"/>
+        </w:rPr>
+        <w:t>Das Spiel folgt dem EVA-Prinzip (Eingabe, Verarbeitung, Ausgabe) und nutzt eine klassenbasierte Struktur:</w:t>
+      </w:r>
+    </w:p>
+    <w:p>
+      <w:pPr>
+        <w:rPr>
+          <w:lang w:eastAsia="de-CH"/>
+        </w:rPr>
+      </w:pPr>
+    </w:p>
+    <w:p>
+      <w:pPr>
+        <w:pStyle w:val="Listenabsatz"/>
+        <w:numPr>
+          <w:ilvl w:val="0"/>
+          <w:numId w:val="44"/>
+        </w:numPr>
+        <w:rPr>
+          <w:lang w:eastAsia="de-CH"/>
+        </w:rPr>
+      </w:pPr>
+      <w:r>
+        <w:rPr>
+          <w:b/>
+          <w:bCs/>
+          <w:lang w:eastAsia="de-CH"/>
+        </w:rPr>
+        <w:t>Game-Klasse (Controller)</w:t>
+      </w:r>
+      <w:r>
+        <w:rPr>
+          <w:lang w:eastAsia="de-CH"/>
+        </w:rPr>
+        <w:t>: Zentrales Management des Main-Loops, des Event-Handlings (Input) und der Level-Übergänge.</w:t>
+      </w:r>
+    </w:p>
+    <w:p>
+      <w:pPr>
+        <w:pStyle w:val="Listenabsatz"/>
+        <w:numPr>
+          <w:ilvl w:val="0"/>
+          <w:numId w:val="44"/>
+        </w:numPr>
+        <w:rPr>
+          <w:lang w:eastAsia="de-CH"/>
+        </w:rPr>
+      </w:pPr>
+      <w:r>
+        <w:rPr>
+          <w:b/>
+          <w:bCs/>
+          <w:lang w:eastAsia="de-CH"/>
+        </w:rPr>
+        <w:t>Sprite-System</w:t>
+      </w:r>
+      <w:r>
+        <w:rPr>
+          <w:lang w:eastAsia="de-CH"/>
+        </w:rPr>
+        <w:t>: Nutzung von `</w:t>
+      </w:r>
+      <w:proofErr w:type="spellStart"/>
+      <w:proofErr w:type="gramStart"/>
+      <w:r>
+        <w:rPr>
+          <w:lang w:eastAsia="de-CH"/>
+        </w:rPr>
+        <w:t>pygame.sprite</w:t>
+      </w:r>
+      <w:proofErr w:type="gramEnd"/>
+      <w:r>
+        <w:rPr>
+          <w:lang w:eastAsia="de-CH"/>
+        </w:rPr>
+        <w:t>.Sprite</w:t>
+      </w:r>
+      <w:proofErr w:type="spellEnd"/>
+      <w:r>
+        <w:rPr>
+          <w:lang w:eastAsia="de-CH"/>
+        </w:rPr>
+        <w:t>` für:</w:t>
+      </w:r>
+    </w:p>
+    <w:p>
+      <w:pPr>
+        <w:pStyle w:val="Listenabsatz"/>
+        <w:numPr>
+          <w:ilvl w:val="1"/>
+          <w:numId w:val="44"/>
+        </w:numPr>
+        <w:rPr>
+          <w:lang w:eastAsia="de-CH"/>
+        </w:rPr>
+      </w:pPr>
+      <w:r>
+        <w:rPr>
+          <w:i/>
+          <w:iCs/>
+          <w:lang w:eastAsia="de-CH"/>
+        </w:rPr>
+        <w:t>Player</w:t>
+      </w:r>
+      <w:r>
+        <w:rPr>
+          <w:lang w:eastAsia="de-CH"/>
+        </w:rPr>
+        <w:t>: Inklusive HP-Management und Bewegungslogik.</w:t>
+      </w:r>
+    </w:p>
+    <w:p>
+      <w:pPr>
+        <w:pStyle w:val="Listenabsatz"/>
+        <w:numPr>
+          <w:ilvl w:val="1"/>
+          <w:numId w:val="44"/>
+        </w:numPr>
+        <w:rPr>
+          <w:lang w:eastAsia="de-CH"/>
+        </w:rPr>
+      </w:pPr>
+      <w:r>
+        <w:rPr>
+          <w:i/>
+          <w:iCs/>
+          <w:lang w:eastAsia="de-CH"/>
+        </w:rPr>
+        <w:t>Enemy</w:t>
+      </w:r>
+      <w:r>
+        <w:rPr>
+          <w:lang w:eastAsia="de-CH"/>
+        </w:rPr>
+        <w:t xml:space="preserve">: Inklusive </w:t>
+      </w:r>
+      <w:proofErr w:type="spellStart"/>
+      <w:r>
+        <w:rPr>
+          <w:lang w:eastAsia="de-CH"/>
+        </w:rPr>
+        <w:t>Pathfinding</w:t>
+      </w:r>
+      <w:proofErr w:type="spellEnd"/>
+      <w:r>
+        <w:rPr>
+          <w:lang w:eastAsia="de-CH"/>
+        </w:rPr>
+        <w:t>/KI und Schadenslogik.</w:t>
+      </w:r>
+    </w:p>
+    <w:p>
+      <w:pPr>
+        <w:pStyle w:val="Listenabsatz"/>
+        <w:numPr>
+          <w:ilvl w:val="1"/>
+          <w:numId w:val="44"/>
+        </w:numPr>
+        <w:rPr>
+          <w:lang w:eastAsia="de-CH"/>
+        </w:rPr>
+      </w:pPr>
+      <w:proofErr w:type="spellStart"/>
+      <w:r>
+        <w:rPr>
+          <w:i/>
+          <w:iCs/>
+          <w:lang w:eastAsia="de-CH"/>
+        </w:rPr>
+        <w:t>Projectile</w:t>
+      </w:r>
+      <w:proofErr w:type="spellEnd"/>
+      <w:r>
+        <w:rPr>
+          <w:lang w:eastAsia="de-CH"/>
+        </w:rPr>
+        <w:t>: Berechnung der Flugbahn und Kollisionsabfrage.</w:t>
+      </w:r>
+    </w:p>
+    <w:p>
+      <w:pPr>
+        <w:pStyle w:val="Listenabsatz"/>
+        <w:numPr>
+          <w:ilvl w:val="0"/>
+          <w:numId w:val="44"/>
+        </w:numPr>
+        <w:rPr>
+          <w:lang w:eastAsia="de-CH"/>
+        </w:rPr>
+      </w:pPr>
+      <w:r>
+        <w:rPr>
+          <w:b/>
+          <w:bCs/>
+          <w:lang w:eastAsia="de-CH"/>
+        </w:rPr>
+        <w:t>Level-Manager</w:t>
+      </w:r>
+      <w:r>
+        <w:rPr>
+          <w:lang w:eastAsia="de-CH"/>
+        </w:rPr>
+        <w:t xml:space="preserve">: Verantwortlich für das Laden der </w:t>
+      </w:r>
+      <w:proofErr w:type="spellStart"/>
+      <w:r>
+        <w:rPr>
+          <w:lang w:eastAsia="de-CH"/>
+        </w:rPr>
+        <w:t>Map</w:t>
+      </w:r>
+      <w:proofErr w:type="spellEnd"/>
+      <w:r>
+        <w:rPr>
+          <w:lang w:eastAsia="de-CH"/>
+        </w:rPr>
+        <w:t>-Daten (Kollisionsmatrix).</w:t>
+      </w:r>
+    </w:p>
+    <w:p>
+      <w:pPr>
+        <w:pStyle w:val="Listenabsatz"/>
+        <w:numPr>
+          <w:ilvl w:val="0"/>
+          <w:numId w:val="44"/>
+        </w:numPr>
+        <w:rPr>
+          <w:lang w:eastAsia="de-CH"/>
+        </w:rPr>
+      </w:pPr>
+      <w:r>
+        <w:rPr>
+          <w:b/>
+          <w:bCs/>
+          <w:lang w:eastAsia="de-CH"/>
+        </w:rPr>
+        <w:t>UI-Manager</w:t>
+      </w:r>
+      <w:r>
+        <w:rPr>
+          <w:lang w:eastAsia="de-CH"/>
+        </w:rPr>
+        <w:t>: Rendering des HUDs als Overlay über dem Spielgeschehen.</w:t>
+      </w:r>
+    </w:p>
+    <w:p>
+      <w:pPr>
+        <w:pStyle w:val="Listenabsatz"/>
+        <w:numPr>
+          <w:ilvl w:val="0"/>
+          <w:numId w:val="44"/>
+        </w:numPr>
+        <w:rPr>
+          <w:lang w:eastAsia="de-CH"/>
+        </w:rPr>
+      </w:pPr>
+      <w:proofErr w:type="spellStart"/>
+      <w:r>
+        <w:rPr>
+          <w:b/>
+          <w:bCs/>
+          <w:lang w:eastAsia="de-CH"/>
+        </w:rPr>
+        <w:t>Config</w:t>
+      </w:r>
+      <w:proofErr w:type="spellEnd"/>
+      <w:r>
+        <w:rPr>
+          <w:lang w:eastAsia="de-CH"/>
+        </w:rPr>
+        <w:t>: Alle Konstanten befinden sich dort.</w:t>
+      </w:r>
+    </w:p>
+    <w:p/>
     <w:p>
       <w:pPr>
         <w:pStyle w:val="berschrift1"/>
         <w:numPr>
           <w:ilvl w:val="0"/>
-          <w:numId w:val="19"/>
+          <w:numId w:val="38"/>
         </w:numPr>
         <w:tabs>
           <w:tab w:val="left" w:pos="850"/>
@@ -13049,7 +14236,7 @@
         <w:pStyle w:val="berschrift1"/>
         <w:numPr>
           <w:ilvl w:val="0"/>
-          <w:numId w:val="19"/>
+          <w:numId w:val="38"/>
         </w:numPr>
         <w:tabs>
           <w:tab w:val="left" w:pos="850"/>
@@ -13070,7 +14257,7 @@
         <w:pStyle w:val="berschrift1"/>
         <w:numPr>
           <w:ilvl w:val="1"/>
-          <w:numId w:val="19"/>
+          <w:numId w:val="38"/>
         </w:numPr>
         <w:tabs>
           <w:tab w:val="left" w:pos="850"/>
@@ -13259,7 +14446,7 @@
         <w:pStyle w:val="berschrift1"/>
         <w:numPr>
           <w:ilvl w:val="1"/>
-          <w:numId w:val="19"/>
+          <w:numId w:val="38"/>
         </w:numPr>
         <w:tabs>
           <w:tab w:val="left" w:pos="850"/>
@@ -14173,7 +15360,7 @@
         <w:pStyle w:val="berschrift1"/>
         <w:numPr>
           <w:ilvl w:val="0"/>
-          <w:numId w:val="19"/>
+          <w:numId w:val="38"/>
         </w:numPr>
         <w:tabs>
           <w:tab w:val="left" w:pos="850"/>
@@ -14198,7 +15385,7 @@
         <w:pStyle w:val="berschrift1"/>
         <w:numPr>
           <w:ilvl w:val="0"/>
-          <w:numId w:val="19"/>
+          <w:numId w:val="38"/>
         </w:numPr>
         <w:tabs>
           <w:tab w:val="left" w:pos="850"/>
@@ -14245,7 +15432,7 @@
         <w:pStyle w:val="berschrift1"/>
         <w:numPr>
           <w:ilvl w:val="1"/>
-          <w:numId w:val="19"/>
+          <w:numId w:val="38"/>
         </w:numPr>
         <w:tabs>
           <w:tab w:val="left" w:pos="850"/>
@@ -15208,7 +16395,7 @@
               </w:rPr>
               <w:t xml:space="preserve">Zusatzaufgabe: </w:t>
             </w:r>
-            <w:hyperlink r:id="rId30" w:history="1">
+            <w:hyperlink r:id="rId31" w:history="1">
               <w:r>
                 <w:rPr>
                   <w:rStyle w:val="Hyperlink"/>
@@ -15584,7 +16771,7 @@
         <w:pStyle w:val="berschrift1"/>
         <w:numPr>
           <w:ilvl w:val="1"/>
-          <w:numId w:val="19"/>
+          <w:numId w:val="38"/>
         </w:numPr>
         <w:tabs>
           <w:tab w:val="left" w:pos="850"/>
@@ -16799,7 +17986,7 @@
         <w:pStyle w:val="berschrift1"/>
         <w:numPr>
           <w:ilvl w:val="1"/>
-          <w:numId w:val="19"/>
+          <w:numId w:val="38"/>
         </w:numPr>
         <w:tabs>
           <w:tab w:val="left" w:pos="850"/>
@@ -18019,7 +19206,7 @@
         <w:pStyle w:val="berschrift1"/>
         <w:numPr>
           <w:ilvl w:val="0"/>
-          <w:numId w:val="19"/>
+          <w:numId w:val="38"/>
         </w:numPr>
         <w:tabs>
           <w:tab w:val="left" w:pos="850"/>
@@ -18450,7 +19637,7 @@
               <w:sz w:val="20"/>
               <w:szCs w:val="20"/>
             </w:rPr>
-            <w:t>10. März 2026</w:t>
+            <w:t>15. März 2026</w:t>
           </w:r>
           <w:r>
             <w:rPr>
@@ -20134,6 +21321,119 @@
     </w:lvl>
   </w:abstractNum>
   <w:abstractNum w:abstractNumId="8" w15:restartNumberingAfterBreak="0">
+    <w:nsid w:val="129A48A0"/>
+    <w:multiLevelType w:val="hybridMultilevel"/>
+    <w:tmpl w:val="B5425DE8"/>
+    <w:lvl w:ilvl="0" w:tplc="08070001">
+      <w:start w:val="1"/>
+      <w:numFmt w:val="bullet"/>
+      <w:lvlText w:val=""/>
+      <w:lvlJc w:val="left"/>
+      <w:pPr>
+        <w:ind w:left="720" w:hanging="360"/>
+      </w:pPr>
+      <w:rPr>
+        <w:rFonts w:ascii="Symbol" w:hAnsi="Symbol" w:hint="default"/>
+      </w:rPr>
+    </w:lvl>
+    <w:lvl w:ilvl="1" w:tplc="08070003" w:tentative="1">
+      <w:start w:val="1"/>
+      <w:numFmt w:val="bullet"/>
+      <w:lvlText w:val="o"/>
+      <w:lvlJc w:val="left"/>
+      <w:pPr>
+        <w:ind w:left="1440" w:hanging="360"/>
+      </w:pPr>
+      <w:rPr>
+        <w:rFonts w:ascii="Courier New" w:hAnsi="Courier New" w:cs="Courier New" w:hint="default"/>
+      </w:rPr>
+    </w:lvl>
+    <w:lvl w:ilvl="2" w:tplc="08070005" w:tentative="1">
+      <w:start w:val="1"/>
+      <w:numFmt w:val="bullet"/>
+      <w:lvlText w:val=""/>
+      <w:lvlJc w:val="left"/>
+      <w:pPr>
+        <w:ind w:left="2160" w:hanging="360"/>
+      </w:pPr>
+      <w:rPr>
+        <w:rFonts w:ascii="Wingdings" w:hAnsi="Wingdings" w:hint="default"/>
+      </w:rPr>
+    </w:lvl>
+    <w:lvl w:ilvl="3" w:tplc="08070001" w:tentative="1">
+      <w:start w:val="1"/>
+      <w:numFmt w:val="bullet"/>
+      <w:lvlText w:val=""/>
+      <w:lvlJc w:val="left"/>
+      <w:pPr>
+        <w:ind w:left="2880" w:hanging="360"/>
+      </w:pPr>
+      <w:rPr>
+        <w:rFonts w:ascii="Symbol" w:hAnsi="Symbol" w:hint="default"/>
+      </w:rPr>
+    </w:lvl>
+    <w:lvl w:ilvl="4" w:tplc="08070003" w:tentative="1">
+      <w:start w:val="1"/>
+      <w:numFmt w:val="bullet"/>
+      <w:lvlText w:val="o"/>
+      <w:lvlJc w:val="left"/>
+      <w:pPr>
+        <w:ind w:left="3600" w:hanging="360"/>
+      </w:pPr>
+      <w:rPr>
+        <w:rFonts w:ascii="Courier New" w:hAnsi="Courier New" w:cs="Courier New" w:hint="default"/>
+      </w:rPr>
+    </w:lvl>
+    <w:lvl w:ilvl="5" w:tplc="08070005" w:tentative="1">
+      <w:start w:val="1"/>
+      <w:numFmt w:val="bullet"/>
+      <w:lvlText w:val=""/>
+      <w:lvlJc w:val="left"/>
+      <w:pPr>
+        <w:ind w:left="4320" w:hanging="360"/>
+      </w:pPr>
+      <w:rPr>
+        <w:rFonts w:ascii="Wingdings" w:hAnsi="Wingdings" w:hint="default"/>
+      </w:rPr>
+    </w:lvl>
+    <w:lvl w:ilvl="6" w:tplc="08070001" w:tentative="1">
+      <w:start w:val="1"/>
+      <w:numFmt w:val="bullet"/>
+      <w:lvlText w:val=""/>
+      <w:lvlJc w:val="left"/>
+      <w:pPr>
+        <w:ind w:left="5040" w:hanging="360"/>
+      </w:pPr>
+      <w:rPr>
+        <w:rFonts w:ascii="Symbol" w:hAnsi="Symbol" w:hint="default"/>
+      </w:rPr>
+    </w:lvl>
+    <w:lvl w:ilvl="7" w:tplc="08070003" w:tentative="1">
+      <w:start w:val="1"/>
+      <w:numFmt w:val="bullet"/>
+      <w:lvlText w:val="o"/>
+      <w:lvlJc w:val="left"/>
+      <w:pPr>
+        <w:ind w:left="5760" w:hanging="360"/>
+      </w:pPr>
+      <w:rPr>
+        <w:rFonts w:ascii="Courier New" w:hAnsi="Courier New" w:cs="Courier New" w:hint="default"/>
+      </w:rPr>
+    </w:lvl>
+    <w:lvl w:ilvl="8" w:tplc="08070005" w:tentative="1">
+      <w:start w:val="1"/>
+      <w:numFmt w:val="bullet"/>
+      <w:lvlText w:val=""/>
+      <w:lvlJc w:val="left"/>
+      <w:pPr>
+        <w:ind w:left="6480" w:hanging="360"/>
+      </w:pPr>
+      <w:rPr>
+        <w:rFonts w:ascii="Wingdings" w:hAnsi="Wingdings" w:hint="default"/>
+      </w:rPr>
+    </w:lvl>
+  </w:abstractNum>
+  <w:abstractNum w:abstractNumId="9" w15:restartNumberingAfterBreak="0">
     <w:nsid w:val="21AB444C"/>
     <w:multiLevelType w:val="multilevel"/>
     <w:tmpl w:val="9E66557E"/>
@@ -20282,7 +21582,120 @@
       </w:rPr>
     </w:lvl>
   </w:abstractNum>
-  <w:abstractNum w:abstractNumId="9" w15:restartNumberingAfterBreak="0">
+  <w:abstractNum w:abstractNumId="10" w15:restartNumberingAfterBreak="0">
+    <w:nsid w:val="26345599"/>
+    <w:multiLevelType w:val="hybridMultilevel"/>
+    <w:tmpl w:val="B8CE50CC"/>
+    <w:lvl w:ilvl="0" w:tplc="08070001">
+      <w:start w:val="1"/>
+      <w:numFmt w:val="bullet"/>
+      <w:lvlText w:val=""/>
+      <w:lvlJc w:val="left"/>
+      <w:pPr>
+        <w:ind w:left="720" w:hanging="360"/>
+      </w:pPr>
+      <w:rPr>
+        <w:rFonts w:ascii="Symbol" w:hAnsi="Symbol" w:hint="default"/>
+      </w:rPr>
+    </w:lvl>
+    <w:lvl w:ilvl="1" w:tplc="08070003">
+      <w:start w:val="1"/>
+      <w:numFmt w:val="bullet"/>
+      <w:lvlText w:val="o"/>
+      <w:lvlJc w:val="left"/>
+      <w:pPr>
+        <w:ind w:left="1440" w:hanging="360"/>
+      </w:pPr>
+      <w:rPr>
+        <w:rFonts w:ascii="Courier New" w:hAnsi="Courier New" w:cs="Courier New" w:hint="default"/>
+      </w:rPr>
+    </w:lvl>
+    <w:lvl w:ilvl="2" w:tplc="08070005" w:tentative="1">
+      <w:start w:val="1"/>
+      <w:numFmt w:val="bullet"/>
+      <w:lvlText w:val=""/>
+      <w:lvlJc w:val="left"/>
+      <w:pPr>
+        <w:ind w:left="2160" w:hanging="360"/>
+      </w:pPr>
+      <w:rPr>
+        <w:rFonts w:ascii="Wingdings" w:hAnsi="Wingdings" w:hint="default"/>
+      </w:rPr>
+    </w:lvl>
+    <w:lvl w:ilvl="3" w:tplc="08070001" w:tentative="1">
+      <w:start w:val="1"/>
+      <w:numFmt w:val="bullet"/>
+      <w:lvlText w:val=""/>
+      <w:lvlJc w:val="left"/>
+      <w:pPr>
+        <w:ind w:left="2880" w:hanging="360"/>
+      </w:pPr>
+      <w:rPr>
+        <w:rFonts w:ascii="Symbol" w:hAnsi="Symbol" w:hint="default"/>
+      </w:rPr>
+    </w:lvl>
+    <w:lvl w:ilvl="4" w:tplc="08070003" w:tentative="1">
+      <w:start w:val="1"/>
+      <w:numFmt w:val="bullet"/>
+      <w:lvlText w:val="o"/>
+      <w:lvlJc w:val="left"/>
+      <w:pPr>
+        <w:ind w:left="3600" w:hanging="360"/>
+      </w:pPr>
+      <w:rPr>
+        <w:rFonts w:ascii="Courier New" w:hAnsi="Courier New" w:cs="Courier New" w:hint="default"/>
+      </w:rPr>
+    </w:lvl>
+    <w:lvl w:ilvl="5" w:tplc="08070005" w:tentative="1">
+      <w:start w:val="1"/>
+      <w:numFmt w:val="bullet"/>
+      <w:lvlText w:val=""/>
+      <w:lvlJc w:val="left"/>
+      <w:pPr>
+        <w:ind w:left="4320" w:hanging="360"/>
+      </w:pPr>
+      <w:rPr>
+        <w:rFonts w:ascii="Wingdings" w:hAnsi="Wingdings" w:hint="default"/>
+      </w:rPr>
+    </w:lvl>
+    <w:lvl w:ilvl="6" w:tplc="08070001" w:tentative="1">
+      <w:start w:val="1"/>
+      <w:numFmt w:val="bullet"/>
+      <w:lvlText w:val=""/>
+      <w:lvlJc w:val="left"/>
+      <w:pPr>
+        <w:ind w:left="5040" w:hanging="360"/>
+      </w:pPr>
+      <w:rPr>
+        <w:rFonts w:ascii="Symbol" w:hAnsi="Symbol" w:hint="default"/>
+      </w:rPr>
+    </w:lvl>
+    <w:lvl w:ilvl="7" w:tplc="08070003" w:tentative="1">
+      <w:start w:val="1"/>
+      <w:numFmt w:val="bullet"/>
+      <w:lvlText w:val="o"/>
+      <w:lvlJc w:val="left"/>
+      <w:pPr>
+        <w:ind w:left="5760" w:hanging="360"/>
+      </w:pPr>
+      <w:rPr>
+        <w:rFonts w:ascii="Courier New" w:hAnsi="Courier New" w:cs="Courier New" w:hint="default"/>
+      </w:rPr>
+    </w:lvl>
+    <w:lvl w:ilvl="8" w:tplc="08070005" w:tentative="1">
+      <w:start w:val="1"/>
+      <w:numFmt w:val="bullet"/>
+      <w:lvlText w:val=""/>
+      <w:lvlJc w:val="left"/>
+      <w:pPr>
+        <w:ind w:left="6480" w:hanging="360"/>
+      </w:pPr>
+      <w:rPr>
+        <w:rFonts w:ascii="Wingdings" w:hAnsi="Wingdings" w:hint="default"/>
+      </w:rPr>
+    </w:lvl>
+  </w:abstractNum>
+  <w:abstractNum w:abstractNumId="11" w15:restartNumberingAfterBreak="0">
     <w:nsid w:val="293046D8"/>
     <w:multiLevelType w:val="multilevel"/>
     <w:tmpl w:val="268405DE"/>
@@ -20395,7 +21808,7 @@
       </w:pPr>
     </w:lvl>
   </w:abstractNum>
-  <w:abstractNum w:abstractNumId="10" w15:restartNumberingAfterBreak="0">
+  <w:abstractNum w:abstractNumId="12" w15:restartNumberingAfterBreak="0">
     <w:nsid w:val="34D62EF0"/>
     <w:multiLevelType w:val="multilevel"/>
     <w:tmpl w:val="39666F7C"/>
@@ -20573,7 +21986,120 @@
       </w:rPr>
     </w:lvl>
   </w:abstractNum>
-  <w:abstractNum w:abstractNumId="11" w15:restartNumberingAfterBreak="0">
+  <w:abstractNum w:abstractNumId="13" w15:restartNumberingAfterBreak="0">
+    <w:nsid w:val="3D9111FA"/>
+    <w:multiLevelType w:val="hybridMultilevel"/>
+    <w:tmpl w:val="8AF8F0B2"/>
+    <w:lvl w:ilvl="0" w:tplc="08070001">
+      <w:start w:val="1"/>
+      <w:numFmt w:val="bullet"/>
+      <w:lvlText w:val=""/>
+      <w:lvlJc w:val="left"/>
+      <w:pPr>
+        <w:ind w:left="720" w:hanging="360"/>
+      </w:pPr>
+      <w:rPr>
+        <w:rFonts w:ascii="Symbol" w:hAnsi="Symbol" w:hint="default"/>
+      </w:rPr>
+    </w:lvl>
+    <w:lvl w:ilvl="1" w:tplc="08070003">
+      <w:start w:val="1"/>
+      <w:numFmt w:val="bullet"/>
+      <w:lvlText w:val="o"/>
+      <w:lvlJc w:val="left"/>
+      <w:pPr>
+        <w:ind w:left="1440" w:hanging="360"/>
+      </w:pPr>
+      <w:rPr>
+        <w:rFonts w:ascii="Courier New" w:hAnsi="Courier New" w:cs="Courier New" w:hint="default"/>
+      </w:rPr>
+    </w:lvl>
+    <w:lvl w:ilvl="2" w:tplc="08070005" w:tentative="1">
+      <w:start w:val="1"/>
+      <w:numFmt w:val="bullet"/>
+      <w:lvlText w:val=""/>
+      <w:lvlJc w:val="left"/>
+      <w:pPr>
+        <w:ind w:left="2160" w:hanging="360"/>
+      </w:pPr>
+      <w:rPr>
+        <w:rFonts w:ascii="Wingdings" w:hAnsi="Wingdings" w:hint="default"/>
+      </w:rPr>
+    </w:lvl>
+    <w:lvl w:ilvl="3" w:tplc="08070001" w:tentative="1">
+      <w:start w:val="1"/>
+      <w:numFmt w:val="bullet"/>
+      <w:lvlText w:val=""/>
+      <w:lvlJc w:val="left"/>
+      <w:pPr>
+        <w:ind w:left="2880" w:hanging="360"/>
+      </w:pPr>
+      <w:rPr>
+        <w:rFonts w:ascii="Symbol" w:hAnsi="Symbol" w:hint="default"/>
+      </w:rPr>
+    </w:lvl>
+    <w:lvl w:ilvl="4" w:tplc="08070003" w:tentative="1">
+      <w:start w:val="1"/>
+      <w:numFmt w:val="bullet"/>
+      <w:lvlText w:val="o"/>
+      <w:lvlJc w:val="left"/>
+      <w:pPr>
+        <w:ind w:left="3600" w:hanging="360"/>
+      </w:pPr>
+      <w:rPr>
+        <w:rFonts w:ascii="Courier New" w:hAnsi="Courier New" w:cs="Courier New" w:hint="default"/>
+      </w:rPr>
+    </w:lvl>
+    <w:lvl w:ilvl="5" w:tplc="08070005" w:tentative="1">
+      <w:start w:val="1"/>
+      <w:numFmt w:val="bullet"/>
+      <w:lvlText w:val=""/>
+      <w:lvlJc w:val="left"/>
+      <w:pPr>
+        <w:ind w:left="4320" w:hanging="360"/>
+      </w:pPr>
+      <w:rPr>
+        <w:rFonts w:ascii="Wingdings" w:hAnsi="Wingdings" w:hint="default"/>
+      </w:rPr>
+    </w:lvl>
+    <w:lvl w:ilvl="6" w:tplc="08070001" w:tentative="1">
+      <w:start w:val="1"/>
+      <w:numFmt w:val="bullet"/>
+      <w:lvlText w:val=""/>
+      <w:lvlJc w:val="left"/>
+      <w:pPr>
+        <w:ind w:left="5040" w:hanging="360"/>
+      </w:pPr>
+      <w:rPr>
+        <w:rFonts w:ascii="Symbol" w:hAnsi="Symbol" w:hint="default"/>
+      </w:rPr>
+    </w:lvl>
+    <w:lvl w:ilvl="7" w:tplc="08070003" w:tentative="1">
+      <w:start w:val="1"/>
+      <w:numFmt w:val="bullet"/>
+      <w:lvlText w:val="o"/>
+      <w:lvlJc w:val="left"/>
+      <w:pPr>
+        <w:ind w:left="5760" w:hanging="360"/>
+      </w:pPr>
+      <w:rPr>
+        <w:rFonts w:ascii="Courier New" w:hAnsi="Courier New" w:cs="Courier New" w:hint="default"/>
+      </w:rPr>
+    </w:lvl>
+    <w:lvl w:ilvl="8" w:tplc="08070005" w:tentative="1">
+      <w:start w:val="1"/>
+      <w:numFmt w:val="bullet"/>
+      <w:lvlText w:val=""/>
+      <w:lvlJc w:val="left"/>
+      <w:pPr>
+        <w:ind w:left="6480" w:hanging="360"/>
+      </w:pPr>
+      <w:rPr>
+        <w:rFonts w:ascii="Wingdings" w:hAnsi="Wingdings" w:hint="default"/>
+      </w:rPr>
+    </w:lvl>
+  </w:abstractNum>
+  <w:abstractNum w:abstractNumId="14" w15:restartNumberingAfterBreak="0">
     <w:nsid w:val="44E600C3"/>
     <w:multiLevelType w:val="multilevel"/>
     <w:tmpl w:val="B268F2F6"/>
@@ -20686,10 +22212,156 @@
       </w:pPr>
     </w:lvl>
   </w:abstractNum>
-  <w:abstractNum w:abstractNumId="12" w15:restartNumberingAfterBreak="0">
+  <w:abstractNum w:abstractNumId="15" w15:restartNumberingAfterBreak="0">
     <w:nsid w:val="4717135D"/>
     <w:multiLevelType w:val="multilevel"/>
-    <w:tmpl w:val="16143F62"/>
+    <w:tmpl w:val="570E2F50"/>
+    <w:lvl w:ilvl="0">
+      <w:start w:val="1"/>
+      <w:numFmt w:val="bullet"/>
+      <w:lvlText w:val=""/>
+      <w:lvlJc w:val="left"/>
+      <w:pPr>
+        <w:tabs>
+          <w:tab w:val="num" w:pos="720"/>
+        </w:tabs>
+        <w:ind w:left="720" w:hanging="360"/>
+      </w:pPr>
+      <w:rPr>
+        <w:rFonts w:ascii="Symbol" w:hAnsi="Symbol" w:hint="default"/>
+        <w:sz w:val="20"/>
+      </w:rPr>
+    </w:lvl>
+    <w:lvl w:ilvl="1">
+      <w:start w:val="1"/>
+      <w:numFmt w:val="decimal"/>
+      <w:lvlText w:val="%2"/>
+      <w:lvlJc w:val="left"/>
+      <w:pPr>
+        <w:ind w:left="1440" w:hanging="360"/>
+      </w:pPr>
+      <w:rPr>
+        <w:rFonts w:hint="default"/>
+        <w:b/>
+      </w:rPr>
+    </w:lvl>
+    <w:lvl w:ilvl="2" w:tentative="1">
+      <w:start w:val="1"/>
+      <w:numFmt w:val="bullet"/>
+      <w:lvlText w:val=""/>
+      <w:lvlJc w:val="left"/>
+      <w:pPr>
+        <w:tabs>
+          <w:tab w:val="num" w:pos="2160"/>
+        </w:tabs>
+        <w:ind w:left="2160" w:hanging="360"/>
+      </w:pPr>
+      <w:rPr>
+        <w:rFonts w:ascii="Symbol" w:hAnsi="Symbol" w:hint="default"/>
+        <w:sz w:val="20"/>
+      </w:rPr>
+    </w:lvl>
+    <w:lvl w:ilvl="3" w:tentative="1">
+      <w:start w:val="1"/>
+      <w:numFmt w:val="bullet"/>
+      <w:lvlText w:val=""/>
+      <w:lvlJc w:val="left"/>
+      <w:pPr>
+        <w:tabs>
+          <w:tab w:val="num" w:pos="2880"/>
+        </w:tabs>
+        <w:ind w:left="2880" w:hanging="360"/>
+      </w:pPr>
+      <w:rPr>
+        <w:rFonts w:ascii="Symbol" w:hAnsi="Symbol" w:hint="default"/>
+        <w:sz w:val="20"/>
+      </w:rPr>
+    </w:lvl>
+    <w:lvl w:ilvl="4" w:tentative="1">
+      <w:start w:val="1"/>
+      <w:numFmt w:val="bullet"/>
+      <w:lvlText w:val=""/>
+      <w:lvlJc w:val="left"/>
+      <w:pPr>
+        <w:tabs>
+          <w:tab w:val="num" w:pos="3600"/>
+        </w:tabs>
+        <w:ind w:left="3600" w:hanging="360"/>
+      </w:pPr>
+      <w:rPr>
+        <w:rFonts w:ascii="Symbol" w:hAnsi="Symbol" w:hint="default"/>
+        <w:sz w:val="20"/>
+      </w:rPr>
+    </w:lvl>
+    <w:lvl w:ilvl="5" w:tentative="1">
+      <w:start w:val="1"/>
+      <w:numFmt w:val="bullet"/>
+      <w:lvlText w:val=""/>
+      <w:lvlJc w:val="left"/>
+      <w:pPr>
+        <w:tabs>
+          <w:tab w:val="num" w:pos="4320"/>
+        </w:tabs>
+        <w:ind w:left="4320" w:hanging="360"/>
+      </w:pPr>
+      <w:rPr>
+        <w:rFonts w:ascii="Symbol" w:hAnsi="Symbol" w:hint="default"/>
+        <w:sz w:val="20"/>
+      </w:rPr>
+    </w:lvl>
+    <w:lvl w:ilvl="6" w:tentative="1">
+      <w:start w:val="1"/>
+      <w:numFmt w:val="bullet"/>
+      <w:lvlText w:val=""/>
+      <w:lvlJc w:val="left"/>
+      <w:pPr>
+        <w:tabs>
+          <w:tab w:val="num" w:pos="5040"/>
+        </w:tabs>
+        <w:ind w:left="5040" w:hanging="360"/>
+      </w:pPr>
+      <w:rPr>
+        <w:rFonts w:ascii="Symbol" w:hAnsi="Symbol" w:hint="default"/>
+        <w:sz w:val="20"/>
+      </w:rPr>
+    </w:lvl>
+    <w:lvl w:ilvl="7" w:tentative="1">
+      <w:start w:val="1"/>
+      <w:numFmt w:val="bullet"/>
+      <w:lvlText w:val=""/>
+      <w:lvlJc w:val="left"/>
+      <w:pPr>
+        <w:tabs>
+          <w:tab w:val="num" w:pos="5760"/>
+        </w:tabs>
+        <w:ind w:left="5760" w:hanging="360"/>
+      </w:pPr>
+      <w:rPr>
+        <w:rFonts w:ascii="Symbol" w:hAnsi="Symbol" w:hint="default"/>
+        <w:sz w:val="20"/>
+      </w:rPr>
+    </w:lvl>
+    <w:lvl w:ilvl="8" w:tentative="1">
+      <w:start w:val="1"/>
+      <w:numFmt w:val="bullet"/>
+      <w:lvlText w:val=""/>
+      <w:lvlJc w:val="left"/>
+      <w:pPr>
+        <w:tabs>
+          <w:tab w:val="num" w:pos="6480"/>
+        </w:tabs>
+        <w:ind w:left="6480" w:hanging="360"/>
+      </w:pPr>
+      <w:rPr>
+        <w:rFonts w:ascii="Symbol" w:hAnsi="Symbol" w:hint="default"/>
+        <w:sz w:val="20"/>
+      </w:rPr>
+    </w:lvl>
+  </w:abstractNum>
+  <w:abstractNum w:abstractNumId="16" w15:restartNumberingAfterBreak="0">
+    <w:nsid w:val="562B7C97"/>
+    <w:multiLevelType w:val="multilevel"/>
+    <w:tmpl w:val="DF8A7340"/>
     <w:lvl w:ilvl="0">
       <w:start w:val="1"/>
       <w:numFmt w:val="bullet"/>
@@ -20835,10 +22507,123 @@
       </w:rPr>
     </w:lvl>
   </w:abstractNum>
-  <w:abstractNum w:abstractNumId="13" w15:restartNumberingAfterBreak="0">
-    <w:nsid w:val="562B7C97"/>
+  <w:abstractNum w:abstractNumId="17" w15:restartNumberingAfterBreak="0">
+    <w:nsid w:val="5C4E76D9"/>
+    <w:multiLevelType w:val="hybridMultilevel"/>
+    <w:tmpl w:val="93F49EF4"/>
+    <w:lvl w:ilvl="0" w:tplc="08070001">
+      <w:start w:val="1"/>
+      <w:numFmt w:val="bullet"/>
+      <w:lvlText w:val=""/>
+      <w:lvlJc w:val="left"/>
+      <w:pPr>
+        <w:ind w:left="720" w:hanging="360"/>
+      </w:pPr>
+      <w:rPr>
+        <w:rFonts w:ascii="Symbol" w:hAnsi="Symbol" w:hint="default"/>
+      </w:rPr>
+    </w:lvl>
+    <w:lvl w:ilvl="1" w:tplc="08070003" w:tentative="1">
+      <w:start w:val="1"/>
+      <w:numFmt w:val="bullet"/>
+      <w:lvlText w:val="o"/>
+      <w:lvlJc w:val="left"/>
+      <w:pPr>
+        <w:ind w:left="1440" w:hanging="360"/>
+      </w:pPr>
+      <w:rPr>
+        <w:rFonts w:ascii="Courier New" w:hAnsi="Courier New" w:cs="Courier New" w:hint="default"/>
+      </w:rPr>
+    </w:lvl>
+    <w:lvl w:ilvl="2" w:tplc="08070005" w:tentative="1">
+      <w:start w:val="1"/>
+      <w:numFmt w:val="bullet"/>
+      <w:lvlText w:val=""/>
+      <w:lvlJc w:val="left"/>
+      <w:pPr>
+        <w:ind w:left="2160" w:hanging="360"/>
+      </w:pPr>
+      <w:rPr>
+        <w:rFonts w:ascii="Wingdings" w:hAnsi="Wingdings" w:hint="default"/>
+      </w:rPr>
+    </w:lvl>
+    <w:lvl w:ilvl="3" w:tplc="08070001" w:tentative="1">
+      <w:start w:val="1"/>
+      <w:numFmt w:val="bullet"/>
+      <w:lvlText w:val=""/>
+      <w:lvlJc w:val="left"/>
+      <w:pPr>
+        <w:ind w:left="2880" w:hanging="360"/>
+      </w:pPr>
+      <w:rPr>
+        <w:rFonts w:ascii="Symbol" w:hAnsi="Symbol" w:hint="default"/>
+      </w:rPr>
+    </w:lvl>
+    <w:lvl w:ilvl="4" w:tplc="08070003" w:tentative="1">
+      <w:start w:val="1"/>
+      <w:numFmt w:val="bullet"/>
+      <w:lvlText w:val="o"/>
+      <w:lvlJc w:val="left"/>
+      <w:pPr>
+        <w:ind w:left="3600" w:hanging="360"/>
+      </w:pPr>
+      <w:rPr>
+        <w:rFonts w:ascii="Courier New" w:hAnsi="Courier New" w:cs="Courier New" w:hint="default"/>
+      </w:rPr>
+    </w:lvl>
+    <w:lvl w:ilvl="5" w:tplc="08070005" w:tentative="1">
+      <w:start w:val="1"/>
+      <w:numFmt w:val="bullet"/>
+      <w:lvlText w:val=""/>
+      <w:lvlJc w:val="left"/>
+      <w:pPr>
+        <w:ind w:left="4320" w:hanging="360"/>
+      </w:pPr>
+      <w:rPr>
+        <w:rFonts w:ascii="Wingdings" w:hAnsi="Wingdings" w:hint="default"/>
+      </w:rPr>
+    </w:lvl>
+    <w:lvl w:ilvl="6" w:tplc="08070001" w:tentative="1">
+      <w:start w:val="1"/>
+      <w:numFmt w:val="bullet"/>
+      <w:lvlText w:val=""/>
+      <w:lvlJc w:val="left"/>
+      <w:pPr>
+        <w:ind w:left="5040" w:hanging="360"/>
+      </w:pPr>
+      <w:rPr>
+        <w:rFonts w:ascii="Symbol" w:hAnsi="Symbol" w:hint="default"/>
+      </w:rPr>
+    </w:lvl>
+    <w:lvl w:ilvl="7" w:tplc="08070003" w:tentative="1">
+      <w:start w:val="1"/>
+      <w:numFmt w:val="bullet"/>
+      <w:lvlText w:val="o"/>
+      <w:lvlJc w:val="left"/>
+      <w:pPr>
+        <w:ind w:left="5760" w:hanging="360"/>
+      </w:pPr>
+      <w:rPr>
+        <w:rFonts w:ascii="Courier New" w:hAnsi="Courier New" w:cs="Courier New" w:hint="default"/>
+      </w:rPr>
+    </w:lvl>
+    <w:lvl w:ilvl="8" w:tplc="08070005" w:tentative="1">
+      <w:start w:val="1"/>
+      <w:numFmt w:val="bullet"/>
+      <w:lvlText w:val=""/>
+      <w:lvlJc w:val="left"/>
+      <w:pPr>
+        <w:ind w:left="6480" w:hanging="360"/>
+      </w:pPr>
+      <w:rPr>
+        <w:rFonts w:ascii="Wingdings" w:hAnsi="Wingdings" w:hint="default"/>
+      </w:rPr>
+    </w:lvl>
+  </w:abstractNum>
+  <w:abstractNum w:abstractNumId="18" w15:restartNumberingAfterBreak="0">
+    <w:nsid w:val="605B4623"/>
     <w:multiLevelType w:val="multilevel"/>
-    <w:tmpl w:val="DF8A7340"/>
+    <w:tmpl w:val="EC10CB8A"/>
     <w:lvl w:ilvl="0">
       <w:start w:val="1"/>
       <w:numFmt w:val="bullet"/>
@@ -20984,156 +22769,7 @@
       </w:rPr>
     </w:lvl>
   </w:abstractNum>
-  <w:abstractNum w:abstractNumId="14" w15:restartNumberingAfterBreak="0">
-    <w:nsid w:val="605B4623"/>
-    <w:multiLevelType w:val="multilevel"/>
-    <w:tmpl w:val="EC10CB8A"/>
-    <w:lvl w:ilvl="0">
-      <w:start w:val="1"/>
-      <w:numFmt w:val="bullet"/>
-      <w:lvlText w:val=""/>
-      <w:lvlJc w:val="left"/>
-      <w:pPr>
-        <w:tabs>
-          <w:tab w:val="num" w:pos="720"/>
-        </w:tabs>
-        <w:ind w:left="720" w:hanging="360"/>
-      </w:pPr>
-      <w:rPr>
-        <w:rFonts w:ascii="Symbol" w:hAnsi="Symbol" w:hint="default"/>
-        <w:sz w:val="20"/>
-      </w:rPr>
-    </w:lvl>
-    <w:lvl w:ilvl="1" w:tentative="1">
-      <w:start w:val="1"/>
-      <w:numFmt w:val="bullet"/>
-      <w:lvlText w:val=""/>
-      <w:lvlJc w:val="left"/>
-      <w:pPr>
-        <w:tabs>
-          <w:tab w:val="num" w:pos="1440"/>
-        </w:tabs>
-        <w:ind w:left="1440" w:hanging="360"/>
-      </w:pPr>
-      <w:rPr>
-        <w:rFonts w:ascii="Symbol" w:hAnsi="Symbol" w:hint="default"/>
-        <w:sz w:val="20"/>
-      </w:rPr>
-    </w:lvl>
-    <w:lvl w:ilvl="2" w:tentative="1">
-      <w:start w:val="1"/>
-      <w:numFmt w:val="bullet"/>
-      <w:lvlText w:val=""/>
-      <w:lvlJc w:val="left"/>
-      <w:pPr>
-        <w:tabs>
-          <w:tab w:val="num" w:pos="2160"/>
-        </w:tabs>
-        <w:ind w:left="2160" w:hanging="360"/>
-      </w:pPr>
-      <w:rPr>
-        <w:rFonts w:ascii="Symbol" w:hAnsi="Symbol" w:hint="default"/>
-        <w:sz w:val="20"/>
-      </w:rPr>
-    </w:lvl>
-    <w:lvl w:ilvl="3" w:tentative="1">
-      <w:start w:val="1"/>
-      <w:numFmt w:val="bullet"/>
-      <w:lvlText w:val=""/>
-      <w:lvlJc w:val="left"/>
-      <w:pPr>
-        <w:tabs>
-          <w:tab w:val="num" w:pos="2880"/>
-        </w:tabs>
-        <w:ind w:left="2880" w:hanging="360"/>
-      </w:pPr>
-      <w:rPr>
-        <w:rFonts w:ascii="Symbol" w:hAnsi="Symbol" w:hint="default"/>
-        <w:sz w:val="20"/>
-      </w:rPr>
-    </w:lvl>
-    <w:lvl w:ilvl="4" w:tentative="1">
-      <w:start w:val="1"/>
-      <w:numFmt w:val="bullet"/>
-      <w:lvlText w:val=""/>
-      <w:lvlJc w:val="left"/>
-      <w:pPr>
-        <w:tabs>
-          <w:tab w:val="num" w:pos="3600"/>
-        </w:tabs>
-        <w:ind w:left="3600" w:hanging="360"/>
-      </w:pPr>
-      <w:rPr>
-        <w:rFonts w:ascii="Symbol" w:hAnsi="Symbol" w:hint="default"/>
-        <w:sz w:val="20"/>
-      </w:rPr>
-    </w:lvl>
-    <w:lvl w:ilvl="5" w:tentative="1">
-      <w:start w:val="1"/>
-      <w:numFmt w:val="bullet"/>
-      <w:lvlText w:val=""/>
-      <w:lvlJc w:val="left"/>
-      <w:pPr>
-        <w:tabs>
-          <w:tab w:val="num" w:pos="4320"/>
-        </w:tabs>
-        <w:ind w:left="4320" w:hanging="360"/>
-      </w:pPr>
-      <w:rPr>
-        <w:rFonts w:ascii="Symbol" w:hAnsi="Symbol" w:hint="default"/>
-        <w:sz w:val="20"/>
-      </w:rPr>
-    </w:lvl>
-    <w:lvl w:ilvl="6" w:tentative="1">
-      <w:start w:val="1"/>
-      <w:numFmt w:val="bullet"/>
-      <w:lvlText w:val=""/>
-      <w:lvlJc w:val="left"/>
-      <w:pPr>
-        <w:tabs>
-          <w:tab w:val="num" w:pos="5040"/>
-        </w:tabs>
-        <w:ind w:left="5040" w:hanging="360"/>
-      </w:pPr>
-      <w:rPr>
-        <w:rFonts w:ascii="Symbol" w:hAnsi="Symbol" w:hint="default"/>
-        <w:sz w:val="20"/>
-      </w:rPr>
-    </w:lvl>
-    <w:lvl w:ilvl="7" w:tentative="1">
-      <w:start w:val="1"/>
-      <w:numFmt w:val="bullet"/>
-      <w:lvlText w:val=""/>
-      <w:lvlJc w:val="left"/>
-      <w:pPr>
-        <w:tabs>
-          <w:tab w:val="num" w:pos="5760"/>
-        </w:tabs>
-        <w:ind w:left="5760" w:hanging="360"/>
-      </w:pPr>
-      <w:rPr>
-        <w:rFonts w:ascii="Symbol" w:hAnsi="Symbol" w:hint="default"/>
-        <w:sz w:val="20"/>
-      </w:rPr>
-    </w:lvl>
-    <w:lvl w:ilvl="8" w:tentative="1">
-      <w:start w:val="1"/>
-      <w:numFmt w:val="bullet"/>
-      <w:lvlText w:val=""/>
-      <w:lvlJc w:val="left"/>
-      <w:pPr>
-        <w:tabs>
-          <w:tab w:val="num" w:pos="6480"/>
-        </w:tabs>
-        <w:ind w:left="6480" w:hanging="360"/>
-      </w:pPr>
-      <w:rPr>
-        <w:rFonts w:ascii="Symbol" w:hAnsi="Symbol" w:hint="default"/>
-        <w:sz w:val="20"/>
-      </w:rPr>
-    </w:lvl>
-  </w:abstractNum>
-  <w:abstractNum w:abstractNumId="15" w15:restartNumberingAfterBreak="0">
+  <w:abstractNum w:abstractNumId="19" w15:restartNumberingAfterBreak="0">
     <w:nsid w:val="685E19CD"/>
     <w:multiLevelType w:val="multilevel"/>
     <w:tmpl w:val="250E0862"/>
@@ -21246,7 +22882,120 @@
       </w:pPr>
     </w:lvl>
   </w:abstractNum>
-  <w:abstractNum w:abstractNumId="16" w15:restartNumberingAfterBreak="0">
+  <w:abstractNum w:abstractNumId="20" w15:restartNumberingAfterBreak="0">
+    <w:nsid w:val="6F7D5AC1"/>
+    <w:multiLevelType w:val="hybridMultilevel"/>
+    <w:tmpl w:val="D2D6F064"/>
+    <w:lvl w:ilvl="0" w:tplc="08070001">
+      <w:start w:val="1"/>
+      <w:numFmt w:val="bullet"/>
+      <w:lvlText w:val=""/>
+      <w:lvlJc w:val="left"/>
+      <w:pPr>
+        <w:ind w:left="720" w:hanging="360"/>
+      </w:pPr>
+      <w:rPr>
+        <w:rFonts w:ascii="Symbol" w:hAnsi="Symbol" w:hint="default"/>
+      </w:rPr>
+    </w:lvl>
+    <w:lvl w:ilvl="1" w:tplc="08070003" w:tentative="1">
+      <w:start w:val="1"/>
+      <w:numFmt w:val="bullet"/>
+      <w:lvlText w:val="o"/>
+      <w:lvlJc w:val="left"/>
+      <w:pPr>
+        <w:ind w:left="1440" w:hanging="360"/>
+      </w:pPr>
+      <w:rPr>
+        <w:rFonts w:ascii="Courier New" w:hAnsi="Courier New" w:cs="Courier New" w:hint="default"/>
+      </w:rPr>
+    </w:lvl>
+    <w:lvl w:ilvl="2" w:tplc="08070005" w:tentative="1">
+      <w:start w:val="1"/>
+      <w:numFmt w:val="bullet"/>
+      <w:lvlText w:val=""/>
+      <w:lvlJc w:val="left"/>
+      <w:pPr>
+        <w:ind w:left="2160" w:hanging="360"/>
+      </w:pPr>
+      <w:rPr>
+        <w:rFonts w:ascii="Wingdings" w:hAnsi="Wingdings" w:hint="default"/>
+      </w:rPr>
+    </w:lvl>
+    <w:lvl w:ilvl="3" w:tplc="08070001" w:tentative="1">
+      <w:start w:val="1"/>
+      <w:numFmt w:val="bullet"/>
+      <w:lvlText w:val=""/>
+      <w:lvlJc w:val="left"/>
+      <w:pPr>
+        <w:ind w:left="2880" w:hanging="360"/>
+      </w:pPr>
+      <w:rPr>
+        <w:rFonts w:ascii="Symbol" w:hAnsi="Symbol" w:hint="default"/>
+      </w:rPr>
+    </w:lvl>
+    <w:lvl w:ilvl="4" w:tplc="08070003" w:tentative="1">
+      <w:start w:val="1"/>
+      <w:numFmt w:val="bullet"/>
+      <w:lvlText w:val="o"/>
+      <w:lvlJc w:val="left"/>
+      <w:pPr>
+        <w:ind w:left="3600" w:hanging="360"/>
+      </w:pPr>
+      <w:rPr>
+        <w:rFonts w:ascii="Courier New" w:hAnsi="Courier New" w:cs="Courier New" w:hint="default"/>
+      </w:rPr>
+    </w:lvl>
+    <w:lvl w:ilvl="5" w:tplc="08070005" w:tentative="1">
+      <w:start w:val="1"/>
+      <w:numFmt w:val="bullet"/>
+      <w:lvlText w:val=""/>
+      <w:lvlJc w:val="left"/>
+      <w:pPr>
+        <w:ind w:left="4320" w:hanging="360"/>
+      </w:pPr>
+      <w:rPr>
+        <w:rFonts w:ascii="Wingdings" w:hAnsi="Wingdings" w:hint="default"/>
+      </w:rPr>
+    </w:lvl>
+    <w:lvl w:ilvl="6" w:tplc="08070001" w:tentative="1">
+      <w:start w:val="1"/>
+      <w:numFmt w:val="bullet"/>
+      <w:lvlText w:val=""/>
+      <w:lvlJc w:val="left"/>
+      <w:pPr>
+        <w:ind w:left="5040" w:hanging="360"/>
+      </w:pPr>
+      <w:rPr>
+        <w:rFonts w:ascii="Symbol" w:hAnsi="Symbol" w:hint="default"/>
+      </w:rPr>
+    </w:lvl>
+    <w:lvl w:ilvl="7" w:tplc="08070003" w:tentative="1">
+      <w:start w:val="1"/>
+      <w:numFmt w:val="bullet"/>
+      <w:lvlText w:val="o"/>
+      <w:lvlJc w:val="left"/>
+      <w:pPr>
+        <w:ind w:left="5760" w:hanging="360"/>
+      </w:pPr>
+      <w:rPr>
+        <w:rFonts w:ascii="Courier New" w:hAnsi="Courier New" w:cs="Courier New" w:hint="default"/>
+      </w:rPr>
+    </w:lvl>
+    <w:lvl w:ilvl="8" w:tplc="08070005" w:tentative="1">
+      <w:start w:val="1"/>
+      <w:numFmt w:val="bullet"/>
+      <w:lvlText w:val=""/>
+      <w:lvlJc w:val="left"/>
+      <w:pPr>
+        <w:ind w:left="6480" w:hanging="360"/>
+      </w:pPr>
+      <w:rPr>
+        <w:rFonts w:ascii="Wingdings" w:hAnsi="Wingdings" w:hint="default"/>
+      </w:rPr>
+    </w:lvl>
+  </w:abstractNum>
+  <w:abstractNum w:abstractNumId="21" w15:restartNumberingAfterBreak="0">
     <w:nsid w:val="776F4194"/>
     <w:multiLevelType w:val="multilevel"/>
     <w:tmpl w:val="3ADC7FF6"/>
@@ -21359,7 +23108,185 @@
       </w:pPr>
     </w:lvl>
   </w:abstractNum>
-  <w:abstractNum w:abstractNumId="17" w15:restartNumberingAfterBreak="0">
+  <w:abstractNum w:abstractNumId="22" w15:restartNumberingAfterBreak="0">
+    <w:nsid w:val="7823393F"/>
+    <w:multiLevelType w:val="multilevel"/>
+    <w:tmpl w:val="39666F7C"/>
+    <w:lvl w:ilvl="0">
+      <w:start w:val="1"/>
+      <w:numFmt w:val="decimal"/>
+      <w:lvlText w:val="%1"/>
+      <w:lvlJc w:val="left"/>
+      <w:pPr>
+        <w:tabs>
+          <w:tab w:val="num" w:pos="1134"/>
+        </w:tabs>
+        <w:ind w:left="851" w:hanging="851"/>
+      </w:pPr>
+      <w:rPr>
+        <w:rFonts w:ascii="Arial" w:hAnsi="Arial" w:cs="Times New Roman" w:hint="default"/>
+        <w:b/>
+        <w:i w:val="0"/>
+        <w:kern w:val="32"/>
+        <w:sz w:val="24"/>
+        <w:szCs w:val="32"/>
+      </w:rPr>
+    </w:lvl>
+    <w:lvl w:ilvl="1">
+      <w:start w:val="1"/>
+      <w:numFmt w:val="decimal"/>
+      <w:lvlText w:val="%1.%2"/>
+      <w:lvlJc w:val="left"/>
+      <w:pPr>
+        <w:tabs>
+          <w:tab w:val="num" w:pos="1134"/>
+        </w:tabs>
+        <w:ind w:left="851" w:hanging="851"/>
+      </w:pPr>
+      <w:rPr>
+        <w:rFonts w:ascii="Arial" w:hAnsi="Arial" w:cs="Times New Roman" w:hint="default"/>
+        <w:b/>
+        <w:i w:val="0"/>
+        <w:kern w:val="28"/>
+        <w:sz w:val="22"/>
+        <w:szCs w:val="28"/>
+      </w:rPr>
+    </w:lvl>
+    <w:lvl w:ilvl="2">
+      <w:start w:val="1"/>
+      <w:numFmt w:val="decimal"/>
+      <w:lvlText w:val="%1.%2.%3"/>
+      <w:lvlJc w:val="left"/>
+      <w:pPr>
+        <w:tabs>
+          <w:tab w:val="num" w:pos="1374"/>
+        </w:tabs>
+        <w:ind w:left="851" w:hanging="851"/>
+      </w:pPr>
+      <w:rPr>
+        <w:rFonts w:ascii="Arial" w:hAnsi="Arial" w:cs="Times New Roman" w:hint="default"/>
+        <w:b/>
+        <w:i w:val="0"/>
+        <w:sz w:val="24"/>
+        <w:szCs w:val="24"/>
+      </w:rPr>
+    </w:lvl>
+    <w:lvl w:ilvl="3">
+      <w:start w:val="1"/>
+      <w:numFmt w:val="decimal"/>
+      <w:lvlText w:val="%1.%2.%3.%4"/>
+      <w:lvlJc w:val="left"/>
+      <w:pPr>
+        <w:tabs>
+          <w:tab w:val="num" w:pos="1134"/>
+        </w:tabs>
+        <w:ind w:left="851" w:hanging="851"/>
+      </w:pPr>
+      <w:rPr>
+        <w:rFonts w:ascii="Arial" w:hAnsi="Arial" w:cs="Times New Roman" w:hint="default"/>
+        <w:b/>
+        <w:i w:val="0"/>
+        <w:sz w:val="22"/>
+        <w:szCs w:val="22"/>
+      </w:rPr>
+    </w:lvl>
+    <w:lvl w:ilvl="4">
+      <w:start w:val="1"/>
+      <w:numFmt w:val="decimal"/>
+      <w:lvlText w:val="%1.%2.%3.%4.%5"/>
+      <w:lvlJc w:val="left"/>
+      <w:pPr>
+        <w:tabs>
+          <w:tab w:val="num" w:pos="1134"/>
+        </w:tabs>
+        <w:ind w:left="1134" w:hanging="1134"/>
+      </w:pPr>
+      <w:rPr>
+        <w:rFonts w:ascii="Arial" w:hAnsi="Arial" w:cs="Times New Roman" w:hint="default"/>
+        <w:b/>
+        <w:i w:val="0"/>
+        <w:sz w:val="22"/>
+        <w:szCs w:val="22"/>
+      </w:rPr>
+    </w:lvl>
+    <w:lvl w:ilvl="5">
+      <w:start w:val="1"/>
+      <w:numFmt w:val="decimal"/>
+      <w:lvlText w:val="%1.%2.%3.%4.%5.%6"/>
+      <w:lvlJc w:val="left"/>
+      <w:pPr>
+        <w:tabs>
+          <w:tab w:val="num" w:pos="1134"/>
+        </w:tabs>
+        <w:ind w:left="1134" w:hanging="1134"/>
+      </w:pPr>
+      <w:rPr>
+        <w:rFonts w:ascii="Arial" w:hAnsi="Arial" w:cs="Times New Roman" w:hint="default"/>
+        <w:b w:val="0"/>
+        <w:i w:val="0"/>
+        <w:sz w:val="22"/>
+        <w:szCs w:val="22"/>
+      </w:rPr>
+    </w:lvl>
+    <w:lvl w:ilvl="6">
+      <w:start w:val="1"/>
+      <w:numFmt w:val="decimal"/>
+      <w:lvlText w:val="%1.%2.%3.%4.%5.%6.%7"/>
+      <w:lvlJc w:val="left"/>
+      <w:pPr>
+        <w:tabs>
+          <w:tab w:val="num" w:pos="1701"/>
+        </w:tabs>
+        <w:ind w:left="1701" w:hanging="1701"/>
+      </w:pPr>
+      <w:rPr>
+        <w:rFonts w:ascii="Arial" w:hAnsi="Arial" w:cs="Times New Roman" w:hint="default"/>
+        <w:b w:val="0"/>
+        <w:i w:val="0"/>
+        <w:sz w:val="22"/>
+        <w:szCs w:val="22"/>
+      </w:rPr>
+    </w:lvl>
+    <w:lvl w:ilvl="7">
+      <w:start w:val="1"/>
+      <w:numFmt w:val="decimal"/>
+      <w:lvlText w:val="%1.%2.%3.%4.%5.%6.%7.%8"/>
+      <w:lvlJc w:val="left"/>
+      <w:pPr>
+        <w:tabs>
+          <w:tab w:val="num" w:pos="1701"/>
+        </w:tabs>
+        <w:ind w:left="1701" w:hanging="1701"/>
+      </w:pPr>
+      <w:rPr>
+        <w:rFonts w:ascii="Arial" w:hAnsi="Arial" w:cs="Times New Roman" w:hint="default"/>
+        <w:b w:val="0"/>
+        <w:i w:val="0"/>
+        <w:sz w:val="22"/>
+        <w:szCs w:val="22"/>
+      </w:rPr>
+    </w:lvl>
+    <w:lvl w:ilvl="8">
+      <w:start w:val="1"/>
+      <w:numFmt w:val="decimal"/>
+      <w:lvlText w:val="%1.%2.%3.%4.%5.%6.%7.%8.%9"/>
+      <w:lvlJc w:val="left"/>
+      <w:pPr>
+        <w:tabs>
+          <w:tab w:val="num" w:pos="1701"/>
+        </w:tabs>
+        <w:ind w:left="1701" w:hanging="1701"/>
+      </w:pPr>
+      <w:rPr>
+        <w:rFonts w:ascii="Arial" w:hAnsi="Arial" w:cs="Times New Roman" w:hint="default"/>
+        <w:b w:val="0"/>
+        <w:i w:val="0"/>
+        <w:sz w:val="22"/>
+        <w:szCs w:val="22"/>
+      </w:rPr>
+    </w:lvl>
+  </w:abstractNum>
+  <w:abstractNum w:abstractNumId="23" w15:restartNumberingAfterBreak="0">
     <w:nsid w:val="7F320735"/>
     <w:multiLevelType w:val="multilevel"/>
     <w:tmpl w:val="97E2243C"/>
@@ -21585,37 +23512,10 @@
     <w:abstractNumId w:val="0"/>
   </w:num>
   <w:num w:numId="18" w16cid:durableId="189228653">
-    <w:abstractNumId w:val="17"/>
+    <w:abstractNumId w:val="23"/>
   </w:num>
   <w:num w:numId="19" w16cid:durableId="1287665530">
-    <w:abstractNumId w:val="10"/>
-    <w:lvlOverride w:ilvl="0">
-      <w:startOverride w:val="1"/>
-    </w:lvlOverride>
-    <w:lvlOverride w:ilvl="1">
-      <w:startOverride w:val="1"/>
-    </w:lvlOverride>
-    <w:lvlOverride w:ilvl="2">
-      <w:startOverride w:val="1"/>
-    </w:lvlOverride>
-    <w:lvlOverride w:ilvl="3">
-      <w:startOverride w:val="1"/>
-    </w:lvlOverride>
-    <w:lvlOverride w:ilvl="4">
-      <w:startOverride w:val="1"/>
-    </w:lvlOverride>
-    <w:lvlOverride w:ilvl="5">
-      <w:startOverride w:val="1"/>
-    </w:lvlOverride>
-    <w:lvlOverride w:ilvl="6">
-      <w:startOverride w:val="1"/>
-    </w:lvlOverride>
-    <w:lvlOverride w:ilvl="7">
-      <w:startOverride w:val="1"/>
-    </w:lvlOverride>
-    <w:lvlOverride w:ilvl="8">
-      <w:startOverride w:val="1"/>
-    </w:lvlOverride>
+    <w:abstractNumId w:val="12"/>
   </w:num>
   <w:num w:numId="20" w16cid:durableId="674117725">
     <w:abstractNumId w:val="0"/>
@@ -21639,7 +23539,7 @@
     <w:abstractNumId w:val="0"/>
   </w:num>
   <w:num w:numId="27" w16cid:durableId="765344840">
-    <w:abstractNumId w:val="10"/>
+    <w:abstractNumId w:val="12"/>
   </w:num>
   <w:num w:numId="28" w16cid:durableId="1357080163">
     <w:abstractNumId w:val="0"/>
@@ -21651,28 +23551,46 @@
     <w:abstractNumId w:val="0"/>
   </w:num>
   <w:num w:numId="31" w16cid:durableId="132255942">
+    <w:abstractNumId w:val="19"/>
+  </w:num>
+  <w:num w:numId="32" w16cid:durableId="399715933">
+    <w:abstractNumId w:val="9"/>
+  </w:num>
+  <w:num w:numId="33" w16cid:durableId="1016885734">
+    <w:abstractNumId w:val="11"/>
+  </w:num>
+  <w:num w:numId="34" w16cid:durableId="1763448326">
+    <w:abstractNumId w:val="16"/>
+  </w:num>
+  <w:num w:numId="35" w16cid:durableId="908997861">
+    <w:abstractNumId w:val="14"/>
+  </w:num>
+  <w:num w:numId="36" w16cid:durableId="2140343056">
+    <w:abstractNumId w:val="18"/>
+  </w:num>
+  <w:num w:numId="37" w16cid:durableId="1215771005">
+    <w:abstractNumId w:val="21"/>
+  </w:num>
+  <w:num w:numId="38" w16cid:durableId="1986541778">
     <w:abstractNumId w:val="15"/>
   </w:num>
-  <w:num w:numId="32" w16cid:durableId="399715933">
+  <w:num w:numId="39" w16cid:durableId="728698545">
+    <w:abstractNumId w:val="17"/>
+  </w:num>
+  <w:num w:numId="40" w16cid:durableId="1975065263">
+    <w:abstractNumId w:val="20"/>
+  </w:num>
+  <w:num w:numId="41" w16cid:durableId="688988692">
     <w:abstractNumId w:val="8"/>
   </w:num>
-  <w:num w:numId="33" w16cid:durableId="1016885734">
-    <w:abstractNumId w:val="9"/>
+  <w:num w:numId="42" w16cid:durableId="358236088">
+    <w:abstractNumId w:val="10"/>
   </w:num>
-  <w:num w:numId="34" w16cid:durableId="1763448326">
+  <w:num w:numId="43" w16cid:durableId="1842046689">
+    <w:abstractNumId w:val="22"/>
+  </w:num>
+  <w:num w:numId="44" w16cid:durableId="1599364847">
     <w:abstractNumId w:val="13"/>
-  </w:num>
-  <w:num w:numId="35" w16cid:durableId="908997861">
-    <w:abstractNumId w:val="11"/>
-  </w:num>
-  <w:num w:numId="36" w16cid:durableId="2140343056">
-    <w:abstractNumId w:val="14"/>
-  </w:num>
-  <w:num w:numId="37" w16cid:durableId="1215771005">
-    <w:abstractNumId w:val="16"/>
-  </w:num>
-  <w:num w:numId="38" w16cid:durableId="1986541778">
-    <w:abstractNumId w:val="12"/>
   </w:num>
 </w:numbering>
 </file>
@@ -21777,7 +23695,7 @@
     <w:lsdException w:name="E-mail Signature" w:semiHidden="1" w:unhideWhenUsed="1"/>
     <w:lsdException w:name="HTML Top of Form" w:semiHidden="1" w:unhideWhenUsed="1"/>
     <w:lsdException w:name="HTML Bottom of Form" w:semiHidden="1" w:unhideWhenUsed="1"/>
-    <w:lsdException w:name="Normal (Web)" w:semiHidden="1" w:unhideWhenUsed="1"/>
+    <w:lsdException w:name="Normal (Web)" w:semiHidden="1" w:uiPriority="99" w:unhideWhenUsed="1"/>
     <w:lsdException w:name="HTML Acronym" w:semiHidden="1" w:unhideWhenUsed="1"/>
     <w:lsdException w:name="HTML Address" w:semiHidden="1" w:unhideWhenUsed="1"/>
     <w:lsdException w:name="HTML Cite" w:semiHidden="1" w:unhideWhenUsed="1"/>
@@ -22852,6 +24770,43 @@
       <w:shd w:val="clear" w:color="auto" w:fill="E1DFDD"/>
     </w:rPr>
   </w:style>
+  <w:style w:type="paragraph" w:styleId="Beschriftung">
+    <w:name w:val="caption"/>
+    <w:basedOn w:val="Standard"/>
+    <w:next w:val="Standard"/>
+    <w:semiHidden/>
+    <w:unhideWhenUsed/>
+    <w:qFormat/>
+    <w:rsid w:val="00282776"/>
+    <w:pPr>
+      <w:spacing w:after="200"/>
+    </w:pPr>
+    <w:rPr>
+      <w:i/>
+      <w:iCs/>
+      <w:color w:val="1F497D" w:themeColor="text2"/>
+      <w:sz w:val="18"/>
+      <w:szCs w:val="18"/>
+    </w:rPr>
+  </w:style>
+  <w:style w:type="paragraph" w:styleId="StandardWeb">
+    <w:name w:val="Normal (Web)"/>
+    <w:basedOn w:val="Standard"/>
+    <w:uiPriority w:val="99"/>
+    <w:semiHidden/>
+    <w:unhideWhenUsed/>
+    <w:rsid w:val="00282776"/>
+    <w:pPr>
+      <w:suppressAutoHyphens w:val="0"/>
+      <w:spacing w:before="100" w:beforeAutospacing="1" w:after="100" w:afterAutospacing="1"/>
+    </w:pPr>
+    <w:rPr>
+      <w:rFonts w:ascii="Times New Roman" w:eastAsiaTheme="minorEastAsia" w:hAnsi="Times New Roman"/>
+      <w:sz w:val="24"/>
+      <w:szCs w:val="24"/>
+      <w:lang w:eastAsia="de-CH"/>
+    </w:rPr>
+  </w:style>
 </w:styles>
 </file>
 
@@ -23140,7 +25095,36 @@
 </a:theme>
 </file>
 
+<file path=word/webextensions/taskpanes.xml><?xml version="1.0" encoding="utf-8"?>
+<wetp:taskpanes xmlns:wetp="http://schemas.microsoft.com/office/webextensions/taskpanes/2010/11">
+  <wetp:taskpane dockstate="right" visibility="0" width="350" row="5">
+    <wetp:webextensionref xmlns:r="http://schemas.openxmlformats.org/officeDocument/2006/relationships" r:id="rId1"/>
+  </wetp:taskpane>
+</wetp:taskpanes>
+</file>
+
+<file path=word/webextensions/webextension1.xml><?xml version="1.0" encoding="utf-8"?>
+<we:webextension xmlns:we="http://schemas.microsoft.com/office/webextensions/webextension/2010/11" id="{5B53B628-C4F3-44A6-85AF-216CDA81A95E}">
+  <we:reference id="wa104382008" version="1.1.0.2" store="de-DE" storeType="OMEX"/>
+  <we:alternateReferences>
+    <we:reference id="WA104382008" version="1.1.0.2" store="WA104382008" storeType="OMEX"/>
+  </we:alternateReferences>
+  <we:properties/>
+  <we:bindings/>
+  <we:snapshot xmlns:r="http://schemas.openxmlformats.org/officeDocument/2006/relationships"/>
+</we:webextension>
+</file>
+
 <file path=customXml/item1.xml><?xml version="1.0" encoding="utf-8"?>
+<?mso-contentType ?>
+<FormTemplates xmlns="http://schemas.microsoft.com/sharepoint/v3/contenttype/forms">
+  <Display>DocumentLibraryForm</Display>
+  <Edit>DocumentLibraryForm</Edit>
+  <New>DocumentLibraryForm</New>
+</FormTemplates>
+</file>
+
+<file path=customXml/item2.xml><?xml version="1.0" encoding="utf-8"?>
 <ct:contentTypeSchema xmlns:ct="http://schemas.microsoft.com/office/2006/metadata/contentType" xmlns:ma="http://schemas.microsoft.com/office/2006/metadata/properties/metaAttributes" ct:_="" ma:_="" ma:contentTypeName="Dokument" ma:contentTypeID="0x010100C89A348DBC280C4BB08D29548E58533C" ma:contentTypeVersion="10" ma:contentTypeDescription="Ein neues Dokument erstellen." ma:contentTypeScope="" ma:versionID="46a6087d9fea8580f185a0ea868da469">
   <xsd:schema xmlns:xsd="http://www.w3.org/2001/XMLSchema" xmlns:xs="http://www.w3.org/2001/XMLSchema" xmlns:p="http://schemas.microsoft.com/office/2006/metadata/properties" xmlns:ns2="83c7e37f-cb9c-4af6-99b9-72a827d5e6dc" xmlns:ns3="5030cb7a-6be5-477a-957d-975e4d3028a7" targetNamespace="http://schemas.microsoft.com/office/2006/metadata/properties" ma:root="true" ma:fieldsID="b2782d6ccc790305c9f50df66f3552fa" ns2:_="" ns3:_="">
     <xsd:import namespace="83c7e37f-cb9c-4af6-99b9-72a827d5e6dc"/>
@@ -23329,15 +25313,6 @@
 </ct:contentTypeSchema>
 </file>
 
-<file path=customXml/item2.xml><?xml version="1.0" encoding="utf-8"?>
-<?mso-contentType ?>
-<FormTemplates xmlns="http://schemas.microsoft.com/sharepoint/v3/contenttype/forms">
-  <Display>DocumentLibraryForm</Display>
-  <Edit>DocumentLibraryForm</Edit>
-  <New>DocumentLibraryForm</New>
-</FormTemplates>
-</file>
-
 <file path=customXml/item3.xml><?xml version="1.0" encoding="utf-8"?>
 <p:properties xmlns:p="http://schemas.microsoft.com/office/2006/metadata/properties" xmlns:xsi="http://www.w3.org/2001/XMLSchema-instance" xmlns:pc="http://schemas.microsoft.com/office/infopath/2007/PartnerControls">
   <documentManagement>
@@ -23350,6 +25325,14 @@
 </file>
 
 <file path=customXml/itemProps1.xml><?xml version="1.0" encoding="utf-8"?>
+<ds:datastoreItem xmlns:ds="http://schemas.openxmlformats.org/officeDocument/2006/customXml" ds:itemID="{85027515-5CF2-46FD-9F7F-FD7641D2836E}">
+  <ds:schemaRefs>
+    <ds:schemaRef ds:uri="http://schemas.microsoft.com/sharepoint/v3/contenttype/forms"/>
+  </ds:schemaRefs>
+</ds:datastoreItem>
+</file>
+
+<file path=customXml/itemProps2.xml><?xml version="1.0" encoding="utf-8"?>
 <ds:datastoreItem xmlns:ds="http://schemas.openxmlformats.org/officeDocument/2006/customXml" ds:itemID="{1B4D8889-5F63-4244-BBAC-17C1296DC3C9}">
   <ds:schemaRefs>
     <ds:schemaRef ds:uri="http://schemas.microsoft.com/office/2006/metadata/contentType"/>
@@ -23368,14 +25351,6 @@
 </ds:datastoreItem>
 </file>
 
-<file path=customXml/itemProps2.xml><?xml version="1.0" encoding="utf-8"?>
-<ds:datastoreItem xmlns:ds="http://schemas.openxmlformats.org/officeDocument/2006/customXml" ds:itemID="{85027515-5CF2-46FD-9F7F-FD7641D2836E}">
-  <ds:schemaRefs>
-    <ds:schemaRef ds:uri="http://schemas.microsoft.com/sharepoint/v3/contenttype/forms"/>
-  </ds:schemaRefs>
-</ds:datastoreItem>
-</file>
-
 <file path=customXml/itemProps3.xml><?xml version="1.0" encoding="utf-8"?>
 <ds:datastoreItem xmlns:ds="http://schemas.openxmlformats.org/officeDocument/2006/customXml" ds:itemID="{DD10C81C-5102-4A78-A03C-91060A758387}">
   <ds:schemaRefs>

</xml_diff>

<commit_message>
added test und import anpassungen im main.py
</commit_message>
<xml_diff>
--- a/docs/inprogress/TD-Shoot_Projektstudie.docx
+++ b/docs/inprogress/TD-Shoot_Projektstudie.docx
@@ -19288,7 +19288,7 @@
             <v:imagedata r:id="rId29" o:title=""/>
             <w10:wrap type="square" side="right"/>
           </v:shape>
-          <o:OLEObject Type="Embed" ProgID="Excel.Sheet.12" ShapeID="_x0000_s2050" DrawAspect="Content" ObjectID="_1835284891" r:id="rId30"/>
+          <o:OLEObject Type="Embed" ProgID="Excel.Sheet.12" ShapeID="_x0000_s2050" DrawAspect="Content" ObjectID="_1835446724" r:id="rId30"/>
         </w:object>
       </w:r>
       <w:r>
@@ -23568,7 +23568,7 @@
           <w:noProof/>
         </w:rPr>
         <w:drawing>
-          <wp:inline distT="0" distB="0" distL="0" distR="0" wp14:anchorId="1479462D" wp14:editId="3760F443">
+          <wp:inline distT="0" distB="0" distL="0" distR="0" wp14:anchorId="1479462D" wp14:editId="7110D9C5">
             <wp:extent cx="6115050" cy="1519555"/>
             <wp:effectExtent l="0" t="0" r="0" b="4445"/>
             <wp:docPr id="8610463" name="Grafik 1"/>
@@ -23710,7 +23710,7 @@
           <w:noProof/>
         </w:rPr>
         <w:drawing>
-          <wp:inline distT="0" distB="0" distL="0" distR="0" wp14:anchorId="676C1816" wp14:editId="6A2F65CA">
+          <wp:inline distT="0" distB="0" distL="0" distR="0" wp14:anchorId="676C1816" wp14:editId="2036CADA">
             <wp:extent cx="6110605" cy="1343025"/>
             <wp:effectExtent l="0" t="0" r="4445" b="9525"/>
             <wp:docPr id="2071514475" name="Grafik 2"/>
@@ -23885,7 +23885,7 @@
           <w:noProof/>
         </w:rPr>
         <w:drawing>
-          <wp:inline distT="0" distB="0" distL="0" distR="0" wp14:anchorId="1FA42B5C" wp14:editId="631CFD54">
+          <wp:inline distT="0" distB="0" distL="0" distR="0" wp14:anchorId="1FA42B5C" wp14:editId="1BB23F65">
             <wp:extent cx="6110605" cy="1252855"/>
             <wp:effectExtent l="0" t="0" r="4445" b="4445"/>
             <wp:docPr id="1909613587" name="Grafik 3"/>
@@ -25793,26 +25793,118 @@
           <w:p>
             <w:pPr>
               <w:pStyle w:val="TextCDB"/>
+              <w:numPr>
+                <w:ilvl w:val="1"/>
+                <w:numId w:val="48"/>
+              </w:numPr>
               <w:rPr>
                 <w:lang w:val="de-CH"/>
               </w:rPr>
             </w:pPr>
+            <w:r>
+              <w:rPr>
+                <w:lang w:val="de-CH"/>
+              </w:rPr>
+              <w:t>GitHub Repository aufrufen und README.md lesen.</w:t>
+            </w:r>
           </w:p>
           <w:p>
             <w:pPr>
               <w:pStyle w:val="TextCDB"/>
+              <w:numPr>
+                <w:ilvl w:val="1"/>
+                <w:numId w:val="48"/>
+              </w:numPr>
               <w:rPr>
                 <w:lang w:val="de-CH"/>
               </w:rPr>
             </w:pPr>
+            <w:r>
+              <w:rPr>
+                <w:lang w:val="de-CH"/>
+              </w:rPr>
+              <w:t xml:space="preserve">Navigieren zum Ordner </w:t>
+            </w:r>
+            <w:r>
+              <w:rPr>
+                <w:lang w:val="de-CH"/>
+              </w:rPr>
+              <w:t>«</w:t>
+            </w:r>
+            <w:proofErr w:type="spellStart"/>
+            <w:r>
+              <w:rPr>
+                <w:lang w:val="de-CH"/>
+              </w:rPr>
+              <w:t>games</w:t>
+            </w:r>
+            <w:proofErr w:type="spellEnd"/>
+            <w:r>
+              <w:rPr>
+                <w:lang w:val="de-CH"/>
+              </w:rPr>
+              <w:t>»</w:t>
+            </w:r>
+            <w:r>
+              <w:rPr>
+                <w:lang w:val="de-CH"/>
+              </w:rPr>
+              <w:t xml:space="preserve"> und Download der TD-Shooter.exe.</w:t>
+            </w:r>
           </w:p>
           <w:p>
             <w:pPr>
               <w:pStyle w:val="TextCDB"/>
+              <w:numPr>
+                <w:ilvl w:val="1"/>
+                <w:numId w:val="48"/>
+              </w:numPr>
               <w:rPr>
                 <w:lang w:val="de-CH"/>
               </w:rPr>
             </w:pPr>
+            <w:r>
+              <w:rPr>
+                <w:lang w:val="de-CH"/>
+              </w:rPr>
+              <w:t>Ausführen der Datei (ggf. Bestätigung der Windows-Sicherheitswarnung).</w:t>
+            </w:r>
+          </w:p>
+          <w:p>
+            <w:pPr>
+              <w:pStyle w:val="TextCDB"/>
+              <w:numPr>
+                <w:ilvl w:val="1"/>
+                <w:numId w:val="48"/>
+              </w:numPr>
+              <w:rPr>
+                <w:lang w:val="de-CH"/>
+              </w:rPr>
+            </w:pPr>
+            <w:r>
+              <w:rPr>
+                <w:lang w:val="de-CH"/>
+              </w:rPr>
+              <w:t>Prüfung: Erscheint das Hauptmenü korrekt?</w:t>
+            </w:r>
+          </w:p>
+          <w:p>
+            <w:pPr>
+              <w:pStyle w:val="TextCDB"/>
+              <w:numPr>
+                <w:ilvl w:val="1"/>
+                <w:numId w:val="48"/>
+              </w:numPr>
+              <w:rPr>
+                <w:lang w:val="de-CH"/>
+              </w:rPr>
+            </w:pPr>
+            <w:r>
+              <w:rPr>
+                <w:lang w:val="de-CH"/>
+              </w:rPr>
+              <w:t>Drücken der Enter-Taste, um den Spielmodus zu starten.</w:t>
+            </w:r>
           </w:p>
           <w:p>
             <w:pPr>
@@ -25860,21 +25952,16 @@
                 <w:lang w:val="de-CH"/>
               </w:rPr>
             </w:pPr>
+            <w:r>
+              <w:rPr>
+                <w:lang w:val="de-CH"/>
+              </w:rPr>
+              <w:t>Das Spiel lädt ohne Absturz in das Hauptmenü. Nach Betätigen der Enter-Taste wechselt die Ansicht flüssig in das erste Level.</w:t>
+            </w:r>
           </w:p>
         </w:tc>
       </w:tr>
     </w:tbl>
-    <w:p>
-      <w:pPr>
-        <w:pStyle w:val="TextCDB"/>
-        <w:tabs>
-          <w:tab w:val="left" w:pos="3262"/>
-        </w:tabs>
-        <w:rPr>
-          <w:lang w:val="de-CH"/>
-        </w:rPr>
-      </w:pPr>
-    </w:p>
     <w:p>
       <w:pPr>
         <w:suppressAutoHyphens w:val="0"/>
@@ -25887,6 +25974,113 @@
       </w:pPr>
       <w:r>
         <w:br w:type="page"/>
+      </w:r>
+      <w:r>
+        <w:rPr>
+          <w:noProof/>
+        </w:rPr>
+        <w:lastRenderedPageBreak/>
+        <w:drawing>
+          <wp:inline distT="0" distB="0" distL="0" distR="0" wp14:anchorId="49F821B8" wp14:editId="631E88E2">
+            <wp:extent cx="4962525" cy="4724400"/>
+            <wp:effectExtent l="0" t="0" r="9525" b="0"/>
+            <wp:docPr id="1598221462" name="Grafik 1"/>
+            <wp:cNvGraphicFramePr>
+              <a:graphicFrameLocks xmlns:a="http://schemas.openxmlformats.org/drawingml/2006/main" noChangeAspect="1"/>
+            </wp:cNvGraphicFramePr>
+            <a:graphic xmlns:a="http://schemas.openxmlformats.org/drawingml/2006/main">
+              <a:graphicData uri="http://schemas.openxmlformats.org/drawingml/2006/picture">
+                <pic:pic xmlns:pic="http://schemas.openxmlformats.org/drawingml/2006/picture">
+                  <pic:nvPicPr>
+                    <pic:cNvPr id="0" name="Picture 2"/>
+                    <pic:cNvPicPr>
+                      <a:picLocks noChangeAspect="1" noChangeArrowheads="1"/>
+                    </pic:cNvPicPr>
+                  </pic:nvPicPr>
+                  <pic:blipFill>
+                    <a:blip r:embed="rId36">
+                      <a:extLst>
+                        <a:ext uri="{28A0092B-C50C-407E-A947-70E740481C1C}">
+                          <a14:useLocalDpi xmlns:a14="http://schemas.microsoft.com/office/drawing/2010/main" val="0"/>
+                        </a:ext>
+                      </a:extLst>
+                    </a:blip>
+                    <a:srcRect/>
+                    <a:stretch>
+                      <a:fillRect/>
+                    </a:stretch>
+                  </pic:blipFill>
+                  <pic:spPr bwMode="auto">
+                    <a:xfrm>
+                      <a:off x="0" y="0"/>
+                      <a:ext cx="4962525" cy="4724400"/>
+                    </a:xfrm>
+                    <a:prstGeom prst="rect">
+                      <a:avLst/>
+                    </a:prstGeom>
+                    <a:noFill/>
+                    <a:ln>
+                      <a:noFill/>
+                    </a:ln>
+                  </pic:spPr>
+                </pic:pic>
+              </a:graphicData>
+            </a:graphic>
+          </wp:inline>
+        </w:drawing>
+      </w:r>
+      <w:r>
+        <w:rPr>
+          <w:noProof/>
+        </w:rPr>
+        <w:drawing>
+          <wp:inline distT="0" distB="0" distL="0" distR="0" wp14:anchorId="437A8E0B" wp14:editId="591D4021">
+            <wp:extent cx="6120130" cy="3491230"/>
+            <wp:effectExtent l="0" t="0" r="0" b="0"/>
+            <wp:docPr id="1610291357" name="Grafik 2"/>
+            <wp:cNvGraphicFramePr>
+              <a:graphicFrameLocks xmlns:a="http://schemas.openxmlformats.org/drawingml/2006/main" noChangeAspect="1"/>
+            </wp:cNvGraphicFramePr>
+            <a:graphic xmlns:a="http://schemas.openxmlformats.org/drawingml/2006/main">
+              <a:graphicData uri="http://schemas.openxmlformats.org/drawingml/2006/picture">
+                <pic:pic xmlns:pic="http://schemas.openxmlformats.org/drawingml/2006/picture">
+                  <pic:nvPicPr>
+                    <pic:cNvPr id="0" name="Picture 3"/>
+                    <pic:cNvPicPr>
+                      <a:picLocks noChangeAspect="1" noChangeArrowheads="1"/>
+                    </pic:cNvPicPr>
+                  </pic:nvPicPr>
+                  <pic:blipFill>
+                    <a:blip r:embed="rId37" cstate="print">
+                      <a:extLst>
+                        <a:ext uri="{28A0092B-C50C-407E-A947-70E740481C1C}">
+                          <a14:useLocalDpi xmlns:a14="http://schemas.microsoft.com/office/drawing/2010/main" val="0"/>
+                        </a:ext>
+                      </a:extLst>
+                    </a:blip>
+                    <a:srcRect/>
+                    <a:stretch>
+                      <a:fillRect/>
+                    </a:stretch>
+                  </pic:blipFill>
+                  <pic:spPr bwMode="auto">
+                    <a:xfrm>
+                      <a:off x="0" y="0"/>
+                      <a:ext cx="6120130" cy="3491230"/>
+                    </a:xfrm>
+                    <a:prstGeom prst="rect">
+                      <a:avLst/>
+                    </a:prstGeom>
+                    <a:noFill/>
+                    <a:ln>
+                      <a:noFill/>
+                    </a:ln>
+                  </pic:spPr>
+                </pic:pic>
+              </a:graphicData>
+            </a:graphic>
+          </wp:inline>
+        </w:drawing>
       </w:r>
     </w:p>
     <w:tbl>
@@ -26341,18 +26535,74 @@
           <w:p>
             <w:pPr>
               <w:pStyle w:val="TextCDB"/>
+              <w:numPr>
+                <w:ilvl w:val="1"/>
+                <w:numId w:val="46"/>
+              </w:numPr>
               <w:rPr>
                 <w:lang w:val="de-CH"/>
               </w:rPr>
             </w:pPr>
+            <w:r>
+              <w:rPr>
+                <w:lang w:val="de-CH"/>
+              </w:rPr>
+              <w:t>Den Mauszeiger auf ein Ziel (rotes Dreieck» ausrichten.</w:t>
+            </w:r>
           </w:p>
           <w:p>
             <w:pPr>
               <w:pStyle w:val="TextCDB"/>
+              <w:numPr>
+                <w:ilvl w:val="1"/>
+                <w:numId w:val="46"/>
+              </w:numPr>
               <w:rPr>
                 <w:lang w:val="de-CH"/>
               </w:rPr>
             </w:pPr>
+            <w:r>
+              <w:rPr>
+                <w:lang w:val="de-CH"/>
+              </w:rPr>
+              <w:t>Die linke Maustaste drücken</w:t>
+            </w:r>
+          </w:p>
+          <w:p>
+            <w:pPr>
+              <w:pStyle w:val="TextCDB"/>
+              <w:numPr>
+                <w:ilvl w:val="1"/>
+                <w:numId w:val="46"/>
+              </w:numPr>
+              <w:rPr>
+                <w:lang w:val="de-CH"/>
+              </w:rPr>
+            </w:pPr>
+            <w:r>
+              <w:rPr>
+                <w:lang w:val="de-CH"/>
+              </w:rPr>
+              <w:t>Prüfen, ob ein Projektil vom Spieler in Richtung des Cursors fliegt.</w:t>
+            </w:r>
+          </w:p>
+          <w:p>
+            <w:pPr>
+              <w:pStyle w:val="TextCDB"/>
+              <w:numPr>
+                <w:ilvl w:val="1"/>
+                <w:numId w:val="46"/>
+              </w:numPr>
+              <w:rPr>
+                <w:lang w:val="de-CH"/>
+              </w:rPr>
+            </w:pPr>
+            <w:r>
+              <w:rPr>
+                <w:lang w:val="de-CH"/>
+              </w:rPr>
+              <w:t>Den Gegner so lange beschiessen, bis seine Lebenspunkte (HP) auf null sinken.</w:t>
+            </w:r>
           </w:p>
           <w:p>
             <w:pPr>
@@ -26408,6 +26658,12 @@
                 <w:lang w:val="de-CH"/>
               </w:rPr>
             </w:pPr>
+            <w:r>
+              <w:rPr>
+                <w:lang w:val="de-CH"/>
+              </w:rPr>
+              <w:t>Beim Klicken wird ein Projektil instanziiert, das sich linear zum Ziel bewegt. Bei Kollision mit dem Gegner erleidet dieser Schaden. Sobald die HP des Gegners 0 erreichen, wird das Objekt vom Spielfeld entfernt.</w:t>
+            </w:r>
           </w:p>
         </w:tc>
       </w:tr>
@@ -26417,6 +26673,59 @@
       <w:pPr>
         <w:suppressAutoHyphens w:val="0"/>
       </w:pPr>
+      <w:r>
+        <w:rPr>
+          <w:noProof/>
+        </w:rPr>
+        <w:drawing>
+          <wp:inline distT="0" distB="0" distL="0" distR="0" wp14:anchorId="1692A981" wp14:editId="56A6D3EE">
+            <wp:extent cx="6076950" cy="3481705"/>
+            <wp:effectExtent l="0" t="0" r="0" b="4445"/>
+            <wp:docPr id="88837381" name="Grafik 3"/>
+            <wp:cNvGraphicFramePr>
+              <a:graphicFrameLocks xmlns:a="http://schemas.openxmlformats.org/drawingml/2006/main" noChangeAspect="1"/>
+            </wp:cNvGraphicFramePr>
+            <a:graphic xmlns:a="http://schemas.openxmlformats.org/drawingml/2006/main">
+              <a:graphicData uri="http://schemas.openxmlformats.org/drawingml/2006/picture">
+                <pic:pic xmlns:pic="http://schemas.openxmlformats.org/drawingml/2006/picture">
+                  <pic:nvPicPr>
+                    <pic:cNvPr id="0" name="Picture 4"/>
+                    <pic:cNvPicPr>
+                      <a:picLocks noChangeAspect="1" noChangeArrowheads="1"/>
+                    </pic:cNvPicPr>
+                  </pic:nvPicPr>
+                  <pic:blipFill>
+                    <a:blip r:embed="rId38" cstate="print">
+                      <a:extLst>
+                        <a:ext uri="{28A0092B-C50C-407E-A947-70E740481C1C}">
+                          <a14:useLocalDpi xmlns:a14="http://schemas.microsoft.com/office/drawing/2010/main" val="0"/>
+                        </a:ext>
+                      </a:extLst>
+                    </a:blip>
+                    <a:srcRect/>
+                    <a:stretch>
+                      <a:fillRect/>
+                    </a:stretch>
+                  </pic:blipFill>
+                  <pic:spPr bwMode="auto">
+                    <a:xfrm>
+                      <a:off x="0" y="0"/>
+                      <a:ext cx="6076950" cy="3481705"/>
+                    </a:xfrm>
+                    <a:prstGeom prst="rect">
+                      <a:avLst/>
+                    </a:prstGeom>
+                    <a:noFill/>
+                    <a:ln>
+                      <a:noFill/>
+                    </a:ln>
+                  </pic:spPr>
+                </pic:pic>
+              </a:graphicData>
+            </a:graphic>
+          </wp:inline>
+        </w:drawing>
+      </w:r>
       <w:r>
         <w:br w:type="page"/>
       </w:r>
@@ -26738,34 +27047,56 @@
           <w:p>
             <w:pPr>
               <w:pStyle w:val="TextCDB"/>
+              <w:numPr>
+                <w:ilvl w:val="1"/>
+                <w:numId w:val="45"/>
+              </w:numPr>
               <w:rPr>
                 <w:lang w:val="de-CH"/>
               </w:rPr>
             </w:pPr>
+            <w:r>
+              <w:rPr>
+                <w:lang w:val="de-CH"/>
+              </w:rPr>
+              <w:t>Den Spieler gezielt in ein Gegner steuern.</w:t>
+            </w:r>
           </w:p>
           <w:p>
             <w:pPr>
               <w:pStyle w:val="TextCDB"/>
+              <w:numPr>
+                <w:ilvl w:val="1"/>
+                <w:numId w:val="45"/>
+              </w:numPr>
               <w:rPr>
                 <w:lang w:val="de-CH"/>
               </w:rPr>
             </w:pPr>
+            <w:r>
+              <w:rPr>
+                <w:lang w:val="de-CH"/>
+              </w:rPr>
+              <w:t>Die grafische Anzeige oben links beobachten.</w:t>
+            </w:r>
           </w:p>
           <w:p>
             <w:pPr>
               <w:pStyle w:val="TextCDB"/>
+              <w:numPr>
+                <w:ilvl w:val="1"/>
+                <w:numId w:val="45"/>
+              </w:numPr>
               <w:rPr>
                 <w:lang w:val="de-CH"/>
               </w:rPr>
             </w:pPr>
-          </w:p>
-          <w:p>
-            <w:pPr>
-              <w:pStyle w:val="TextCDB"/>
+            <w:r>
               <w:rPr>
                 <w:lang w:val="de-CH"/>
               </w:rPr>
-            </w:pPr>
+              <w:t>Den Vorgang wiederholen, bis das letzte Herz aufgebracht ist.</w:t>
+            </w:r>
           </w:p>
         </w:tc>
       </w:tr>
@@ -26805,6 +27136,12 @@
                 <w:lang w:val="de-CH"/>
               </w:rPr>
             </w:pPr>
+            <w:r>
+              <w:rPr>
+                <w:lang w:val="de-CH"/>
+              </w:rPr>
+              <w:t>Jede Berührung mit einem Gegner reduziert die HP um genau einen Punkt. Die Herzen im UI werden synchron dazu ausgeblendet.</w:t>
+            </w:r>
           </w:p>
         </w:tc>
       </w:tr>
@@ -26835,6 +27172,143 @@
           <w:lang w:val="en-US" w:eastAsia="de-DE"/>
         </w:rPr>
       </w:pPr>
+      <w:r>
+        <w:rPr>
+          <w:rFonts w:cs="Arial"/>
+          <w:b/>
+          <w:bCs/>
+          <w:noProof/>
+          <w:kern w:val="1"/>
+          <w:sz w:val="24"/>
+          <w:szCs w:val="32"/>
+        </w:rPr>
+        <w:drawing>
+          <wp:inline distT="0" distB="0" distL="0" distR="0" wp14:anchorId="79BA0969" wp14:editId="7107FA3A">
+            <wp:extent cx="1628775" cy="676275"/>
+            <wp:effectExtent l="0" t="0" r="9525" b="9525"/>
+            <wp:docPr id="175076578" name="Grafik 4"/>
+            <wp:cNvGraphicFramePr>
+              <a:graphicFrameLocks xmlns:a="http://schemas.openxmlformats.org/drawingml/2006/main" noChangeAspect="1"/>
+            </wp:cNvGraphicFramePr>
+            <a:graphic xmlns:a="http://schemas.openxmlformats.org/drawingml/2006/main">
+              <a:graphicData uri="http://schemas.openxmlformats.org/drawingml/2006/picture">
+                <pic:pic xmlns:pic="http://schemas.openxmlformats.org/drawingml/2006/picture">
+                  <pic:nvPicPr>
+                    <pic:cNvPr id="0" name="Picture 5"/>
+                    <pic:cNvPicPr>
+                      <a:picLocks noChangeAspect="1" noChangeArrowheads="1"/>
+                    </pic:cNvPicPr>
+                  </pic:nvPicPr>
+                  <pic:blipFill>
+                    <a:blip r:embed="rId39">
+                      <a:extLst>
+                        <a:ext uri="{28A0092B-C50C-407E-A947-70E740481C1C}">
+                          <a14:useLocalDpi xmlns:a14="http://schemas.microsoft.com/office/drawing/2010/main" val="0"/>
+                        </a:ext>
+                      </a:extLst>
+                    </a:blip>
+                    <a:srcRect/>
+                    <a:stretch>
+                      <a:fillRect/>
+                    </a:stretch>
+                  </pic:blipFill>
+                  <pic:spPr bwMode="auto">
+                    <a:xfrm>
+                      <a:off x="0" y="0"/>
+                      <a:ext cx="1628775" cy="676275"/>
+                    </a:xfrm>
+                    <a:prstGeom prst="rect">
+                      <a:avLst/>
+                    </a:prstGeom>
+                    <a:noFill/>
+                    <a:ln>
+                      <a:noFill/>
+                    </a:ln>
+                  </pic:spPr>
+                </pic:pic>
+              </a:graphicData>
+            </a:graphic>
+          </wp:inline>
+        </w:drawing>
+      </w:r>
+      <w:r>
+        <w:rPr>
+          <w:rFonts w:eastAsia="Times New Roman" w:cs="Arial"/>
+          <w:b/>
+          <w:bCs/>
+          <w:kern w:val="1"/>
+          <w:sz w:val="24"/>
+          <w:szCs w:val="32"/>
+          <w:lang w:val="en-US" w:eastAsia="de-DE"/>
+        </w:rPr>
+        <w:br/>
+      </w:r>
+    </w:p>
+    <w:p>
+      <w:pPr>
+        <w:suppressAutoHyphens w:val="0"/>
+        <w:rPr>
+          <w:rFonts w:cs="Arial"/>
+          <w:b/>
+          <w:bCs/>
+          <w:noProof/>
+          <w:kern w:val="1"/>
+          <w:sz w:val="24"/>
+          <w:szCs w:val="32"/>
+        </w:rPr>
+      </w:pPr>
+      <w:r>
+        <w:rPr>
+          <w:rFonts w:cs="Arial"/>
+          <w:b/>
+          <w:bCs/>
+          <w:noProof/>
+          <w:kern w:val="1"/>
+          <w:sz w:val="24"/>
+          <w:szCs w:val="32"/>
+        </w:rPr>
+        <w:br/>
+      </w:r>
+    </w:p>
+    <w:p>
+      <w:pPr>
+        <w:suppressAutoHyphens w:val="0"/>
+        <w:rPr>
+          <w:rFonts w:cs="Arial"/>
+          <w:b/>
+          <w:bCs/>
+          <w:noProof/>
+          <w:kern w:val="1"/>
+          <w:sz w:val="24"/>
+          <w:szCs w:val="32"/>
+        </w:rPr>
+      </w:pPr>
+      <w:r>
+        <w:rPr>
+          <w:rFonts w:cs="Arial"/>
+          <w:b/>
+          <w:bCs/>
+          <w:noProof/>
+          <w:kern w:val="1"/>
+          <w:sz w:val="24"/>
+          <w:szCs w:val="32"/>
+        </w:rPr>
+        <w:br w:type="page"/>
+      </w:r>
+    </w:p>
+    <w:p>
+      <w:pPr>
+        <w:suppressAutoHyphens w:val="0"/>
+        <w:rPr>
+          <w:rFonts w:eastAsia="Times New Roman" w:cs="Arial"/>
+          <w:b/>
+          <w:bCs/>
+          <w:kern w:val="1"/>
+          <w:sz w:val="24"/>
+          <w:szCs w:val="32"/>
+          <w:lang w:val="en-US" w:eastAsia="de-DE"/>
+        </w:rPr>
+      </w:pPr>
     </w:p>
     <w:p>
       <w:pPr>
@@ -26848,17 +27322,6 @@
           <w:szCs w:val="32"/>
         </w:rPr>
       </w:pPr>
-      <w:r>
-        <w:rPr>
-          <w:rFonts w:cs="Arial"/>
-          <w:b/>
-          <w:bCs/>
-          <w:kern w:val="1"/>
-          <w:sz w:val="24"/>
-          <w:szCs w:val="32"/>
-        </w:rPr>
-        <w:br w:type="page"/>
-      </w:r>
     </w:p>
     <w:tbl>
       <w:tblPr>
@@ -26901,7 +27364,6 @@
               <w:pStyle w:val="TextCDB"/>
             </w:pPr>
             <w:r>
-              <w:lastRenderedPageBreak/>
               <w:t xml:space="preserve">ID / </w:t>
             </w:r>
             <w:proofErr w:type="spellStart"/>
@@ -27179,34 +27641,68 @@
           <w:p>
             <w:pPr>
               <w:pStyle w:val="TextCDB"/>
+              <w:numPr>
+                <w:ilvl w:val="2"/>
+                <w:numId w:val="38"/>
+              </w:numPr>
               <w:rPr>
                 <w:lang w:val="de-CH"/>
               </w:rPr>
             </w:pPr>
+            <w:r>
+              <w:rPr>
+                <w:lang w:val="de-CH"/>
+              </w:rPr>
+              <w:t>Den aktuellen Punktestand im User Interface (UI) notieren.</w:t>
+            </w:r>
           </w:p>
           <w:p>
             <w:pPr>
               <w:pStyle w:val="TextCDB"/>
+              <w:numPr>
+                <w:ilvl w:val="2"/>
+                <w:numId w:val="38"/>
+              </w:numPr>
               <w:rPr>
                 <w:lang w:val="de-CH"/>
               </w:rPr>
             </w:pPr>
+            <w:r>
+              <w:rPr>
+                <w:lang w:val="de-CH"/>
+              </w:rPr>
+              <w:t>Einen Gegner</w:t>
+            </w:r>
+            <w:r>
+              <w:rPr>
+                <w:lang w:val="de-CH"/>
+              </w:rPr>
+              <w:t xml:space="preserve"> </w:t>
+            </w:r>
+            <w:r>
+              <w:rPr>
+                <w:lang w:val="de-CH"/>
+              </w:rPr>
+              <w:t>anvisieren und vollständig eliminieren.</w:t>
+            </w:r>
           </w:p>
           <w:p>
             <w:pPr>
               <w:pStyle w:val="TextCDB"/>
+              <w:numPr>
+                <w:ilvl w:val="2"/>
+                <w:numId w:val="38"/>
+              </w:numPr>
               <w:rPr>
                 <w:lang w:val="de-CH"/>
               </w:rPr>
             </w:pPr>
-          </w:p>
-          <w:p>
-            <w:pPr>
-              <w:pStyle w:val="TextCDB"/>
+            <w:r>
               <w:rPr>
                 <w:lang w:val="de-CH"/>
               </w:rPr>
-            </w:pPr>
+              <w:t>Die Veränderung der Punkteanzeige unmittelbar nach dem Verschwinden des Gegners prüfen.</w:t>
+            </w:r>
           </w:p>
         </w:tc>
       </w:tr>
@@ -27246,6 +27742,36 @@
                 <w:lang w:val="de-CH"/>
               </w:rPr>
             </w:pPr>
+            <w:r>
+              <w:rPr>
+                <w:lang w:val="de-CH"/>
+              </w:rPr>
+              <w:t xml:space="preserve">Der Score-Wert erhöht sich </w:t>
+            </w:r>
+            <w:r>
+              <w:rPr>
+                <w:lang w:val="de-CH"/>
+              </w:rPr>
+              <w:t>pro besiegte Gegner</w:t>
+            </w:r>
+            <w:r>
+              <w:rPr>
+                <w:lang w:val="de-CH"/>
+              </w:rPr>
+              <w:t xml:space="preserve"> um den in der Konfiguration definierten Wert (</w:t>
+            </w:r>
+            <w:r>
+              <w:rPr>
+                <w:lang w:val="de-CH"/>
+              </w:rPr>
+              <w:t xml:space="preserve">im normalen Fall: </w:t>
+            </w:r>
+            <w:r>
+              <w:rPr>
+                <w:lang w:val="de-CH"/>
+              </w:rPr>
+              <w:t>+1 Punkt). Die grafische Anzeige im UI wird ohne Verzögerung aktualisiert.</w:t>
+            </w:r>
           </w:p>
         </w:tc>
       </w:tr>
@@ -27270,6 +27796,147 @@
           <w:lang w:val="en-US" w:eastAsia="de-DE"/>
         </w:rPr>
       </w:pPr>
+      <w:r>
+        <w:rPr>
+          <w:rFonts w:eastAsia="Times New Roman"/>
+          <w:noProof/>
+          <w:sz w:val="22"/>
+          <w:szCs w:val="22"/>
+          <w:lang w:val="en-US" w:eastAsia="de-DE"/>
+        </w:rPr>
+        <w:drawing>
+          <wp:inline distT="0" distB="0" distL="0" distR="0" wp14:anchorId="7D6AE41E" wp14:editId="08BE4C96">
+            <wp:extent cx="1676400" cy="314325"/>
+            <wp:effectExtent l="0" t="0" r="0" b="9525"/>
+            <wp:docPr id="127194811" name="Grafik 6"/>
+            <wp:cNvGraphicFramePr>
+              <a:graphicFrameLocks xmlns:a="http://schemas.openxmlformats.org/drawingml/2006/main" noChangeAspect="1"/>
+            </wp:cNvGraphicFramePr>
+            <a:graphic xmlns:a="http://schemas.openxmlformats.org/drawingml/2006/main">
+              <a:graphicData uri="http://schemas.openxmlformats.org/drawingml/2006/picture">
+                <pic:pic xmlns:pic="http://schemas.openxmlformats.org/drawingml/2006/picture">
+                  <pic:nvPicPr>
+                    <pic:cNvPr id="0" name="Picture 7"/>
+                    <pic:cNvPicPr>
+                      <a:picLocks noChangeAspect="1" noChangeArrowheads="1"/>
+                    </pic:cNvPicPr>
+                  </pic:nvPicPr>
+                  <pic:blipFill>
+                    <a:blip r:embed="rId40">
+                      <a:extLst>
+                        <a:ext uri="{28A0092B-C50C-407E-A947-70E740481C1C}">
+                          <a14:useLocalDpi xmlns:a14="http://schemas.microsoft.com/office/drawing/2010/main" val="0"/>
+                        </a:ext>
+                      </a:extLst>
+                    </a:blip>
+                    <a:srcRect/>
+                    <a:stretch>
+                      <a:fillRect/>
+                    </a:stretch>
+                  </pic:blipFill>
+                  <pic:spPr bwMode="auto">
+                    <a:xfrm>
+                      <a:off x="0" y="0"/>
+                      <a:ext cx="1676400" cy="314325"/>
+                    </a:xfrm>
+                    <a:prstGeom prst="rect">
+                      <a:avLst/>
+                    </a:prstGeom>
+                    <a:noFill/>
+                    <a:ln>
+                      <a:noFill/>
+                    </a:ln>
+                  </pic:spPr>
+                </pic:pic>
+              </a:graphicData>
+            </a:graphic>
+          </wp:inline>
+        </w:drawing>
+      </w:r>
+      <w:r>
+        <w:rPr>
+          <w:rFonts w:eastAsia="Times New Roman"/>
+          <w:sz w:val="22"/>
+          <w:szCs w:val="22"/>
+          <w:lang w:val="en-US" w:eastAsia="de-DE"/>
+        </w:rPr>
+        <w:br/>
+      </w:r>
+      <w:r>
+        <w:rPr>
+          <w:rFonts w:eastAsia="Times New Roman"/>
+          <w:sz w:val="22"/>
+          <w:szCs w:val="22"/>
+          <w:lang w:val="en-US" w:eastAsia="de-DE"/>
+        </w:rPr>
+        <w:br/>
+      </w:r>
+      <w:r>
+        <w:rPr>
+          <w:rFonts w:eastAsia="Times New Roman"/>
+          <w:sz w:val="22"/>
+          <w:szCs w:val="22"/>
+          <w:lang w:val="en-US" w:eastAsia="de-DE"/>
+        </w:rPr>
+        <w:br/>
+      </w:r>
+      <w:r>
+        <w:rPr>
+          <w:rFonts w:eastAsia="Times New Roman"/>
+          <w:noProof/>
+          <w:sz w:val="22"/>
+          <w:szCs w:val="22"/>
+          <w:lang w:val="en-US" w:eastAsia="de-DE"/>
+        </w:rPr>
+        <w:drawing>
+          <wp:inline distT="0" distB="0" distL="0" distR="0" wp14:anchorId="2922DDF2" wp14:editId="39A95572">
+            <wp:extent cx="1476375" cy="304800"/>
+            <wp:effectExtent l="0" t="0" r="9525" b="0"/>
+            <wp:docPr id="1202291723" name="Grafik 7"/>
+            <wp:cNvGraphicFramePr>
+              <a:graphicFrameLocks xmlns:a="http://schemas.openxmlformats.org/drawingml/2006/main" noChangeAspect="1"/>
+            </wp:cNvGraphicFramePr>
+            <a:graphic xmlns:a="http://schemas.openxmlformats.org/drawingml/2006/main">
+              <a:graphicData uri="http://schemas.openxmlformats.org/drawingml/2006/picture">
+                <pic:pic xmlns:pic="http://schemas.openxmlformats.org/drawingml/2006/picture">
+                  <pic:nvPicPr>
+                    <pic:cNvPr id="0" name="Picture 8"/>
+                    <pic:cNvPicPr>
+                      <a:picLocks noChangeAspect="1" noChangeArrowheads="1"/>
+                    </pic:cNvPicPr>
+                  </pic:nvPicPr>
+                  <pic:blipFill>
+                    <a:blip r:embed="rId41">
+                      <a:extLst>
+                        <a:ext uri="{28A0092B-C50C-407E-A947-70E740481C1C}">
+                          <a14:useLocalDpi xmlns:a14="http://schemas.microsoft.com/office/drawing/2010/main" val="0"/>
+                        </a:ext>
+                      </a:extLst>
+                    </a:blip>
+                    <a:srcRect/>
+                    <a:stretch>
+                      <a:fillRect/>
+                    </a:stretch>
+                  </pic:blipFill>
+                  <pic:spPr bwMode="auto">
+                    <a:xfrm>
+                      <a:off x="0" y="0"/>
+                      <a:ext cx="1476375" cy="304800"/>
+                    </a:xfrm>
+                    <a:prstGeom prst="rect">
+                      <a:avLst/>
+                    </a:prstGeom>
+                    <a:noFill/>
+                    <a:ln>
+                      <a:noFill/>
+                    </a:ln>
+                  </pic:spPr>
+                </pic:pic>
+              </a:graphicData>
+            </a:graphic>
+          </wp:inline>
+        </w:drawing>
+      </w:r>
       <w:r>
         <w:rPr>
           <w:rFonts w:eastAsia="Times New Roman"/>
@@ -27531,7 +28198,7 @@
               <w:rPr>
                 <w:lang w:val="de-CH"/>
               </w:rPr>
-              <w:t>Der Punktestand erhöht sich korrekt nach dem Besiegen eines Gegners.</w:t>
+              <w:t>Überprüfung des automatischen Szenenwechsels und der korrekten Neupositionierung des Spielers beim Erreichen des Level-Endes.</w:t>
             </w:r>
           </w:p>
         </w:tc>
@@ -27619,34 +28286,56 @@
           <w:p>
             <w:pPr>
               <w:pStyle w:val="TextCDB"/>
+              <w:numPr>
+                <w:ilvl w:val="1"/>
+                <w:numId w:val="36"/>
+              </w:numPr>
               <w:rPr>
                 <w:lang w:val="de-CH"/>
               </w:rPr>
             </w:pPr>
+            <w:r>
+              <w:rPr>
+                <w:lang w:val="de-CH"/>
+              </w:rPr>
+              <w:t>Den Spieler aktiv in die grüne Fläche (Ziel-Zone) am rechten Rand steuern.</w:t>
+            </w:r>
           </w:p>
           <w:p>
             <w:pPr>
               <w:pStyle w:val="TextCDB"/>
+              <w:numPr>
+                <w:ilvl w:val="1"/>
+                <w:numId w:val="36"/>
+              </w:numPr>
               <w:rPr>
                 <w:lang w:val="de-CH"/>
               </w:rPr>
             </w:pPr>
+            <w:r>
+              <w:rPr>
+                <w:lang w:val="de-CH"/>
+              </w:rPr>
+              <w:t>Den Ladevorgang von Level 2 beobachten.</w:t>
+            </w:r>
           </w:p>
           <w:p>
             <w:pPr>
               <w:pStyle w:val="TextCDB"/>
+              <w:numPr>
+                <w:ilvl w:val="1"/>
+                <w:numId w:val="36"/>
+              </w:numPr>
               <w:rPr>
                 <w:lang w:val="de-CH"/>
               </w:rPr>
             </w:pPr>
-          </w:p>
-          <w:p>
-            <w:pPr>
-              <w:pStyle w:val="TextCDB"/>
+            <w:r>
               <w:rPr>
                 <w:lang w:val="de-CH"/>
               </w:rPr>
-            </w:pPr>
+              <w:t>Die Startposition des Spielers im neuen Level verifizieren.</w:t>
+            </w:r>
           </w:p>
         </w:tc>
       </w:tr>
@@ -27662,6 +28351,10 @@
           <w:p>
             <w:pPr>
               <w:pStyle w:val="TextCDB"/>
+              <w:numPr>
+                <w:ilvl w:val="0"/>
+                <w:numId w:val="50"/>
+              </w:numPr>
               <w:rPr>
                 <w:lang w:val="de-CH"/>
               </w:rPr>
@@ -27686,6 +28379,26 @@
                 <w:lang w:val="de-CH"/>
               </w:rPr>
             </w:pPr>
+            <w:r>
+              <w:rPr>
+                <w:lang w:val="de-CH"/>
+              </w:rPr>
+              <w:t>Bei Kollision mit der grünen Ziel-Zone wird Level 1 beendet und Level 2 geladen. Der Spieler wird dabei automatisch an den linken</w:t>
+            </w:r>
+            <w:r>
+              <w:rPr>
+                <w:b/>
+                <w:bCs/>
+                <w:lang w:val="de-CH"/>
+              </w:rPr>
+              <w:t xml:space="preserve"> </w:t>
+            </w:r>
+            <w:r>
+              <w:rPr>
+                <w:lang w:val="de-CH"/>
+              </w:rPr>
+              <w:t>Rand (Startpunkt) des neuen Levels zurückgesetzt.</w:t>
+            </w:r>
           </w:p>
         </w:tc>
       </w:tr>
@@ -27705,6 +28418,112 @@
           <w:lang w:val="en-US" w:eastAsia="de-DE"/>
         </w:rPr>
       </w:pPr>
+      <w:r>
+        <w:rPr>
+          <w:noProof/>
+        </w:rPr>
+        <w:drawing>
+          <wp:inline distT="0" distB="0" distL="0" distR="0" wp14:anchorId="00005E2F" wp14:editId="2753C7E1">
+            <wp:extent cx="3276600" cy="1889158"/>
+            <wp:effectExtent l="0" t="0" r="0" b="0"/>
+            <wp:docPr id="778950936" name="Grafik 8"/>
+            <wp:cNvGraphicFramePr>
+              <a:graphicFrameLocks xmlns:a="http://schemas.openxmlformats.org/drawingml/2006/main" noChangeAspect="1"/>
+            </wp:cNvGraphicFramePr>
+            <a:graphic xmlns:a="http://schemas.openxmlformats.org/drawingml/2006/main">
+              <a:graphicData uri="http://schemas.openxmlformats.org/drawingml/2006/picture">
+                <pic:pic xmlns:pic="http://schemas.openxmlformats.org/drawingml/2006/picture">
+                  <pic:nvPicPr>
+                    <pic:cNvPr id="0" name="Picture 9"/>
+                    <pic:cNvPicPr>
+                      <a:picLocks noChangeAspect="1" noChangeArrowheads="1"/>
+                    </pic:cNvPicPr>
+                  </pic:nvPicPr>
+                  <pic:blipFill>
+                    <a:blip r:embed="rId42" cstate="print">
+                      <a:extLst>
+                        <a:ext uri="{28A0092B-C50C-407E-A947-70E740481C1C}">
+                          <a14:useLocalDpi xmlns:a14="http://schemas.microsoft.com/office/drawing/2010/main" val="0"/>
+                        </a:ext>
+                      </a:extLst>
+                    </a:blip>
+                    <a:srcRect/>
+                    <a:stretch>
+                      <a:fillRect/>
+                    </a:stretch>
+                  </pic:blipFill>
+                  <pic:spPr bwMode="auto">
+                    <a:xfrm>
+                      <a:off x="0" y="0"/>
+                      <a:ext cx="3288835" cy="1896212"/>
+                    </a:xfrm>
+                    <a:prstGeom prst="rect">
+                      <a:avLst/>
+                    </a:prstGeom>
+                    <a:noFill/>
+                    <a:ln>
+                      <a:noFill/>
+                    </a:ln>
+                  </pic:spPr>
+                </pic:pic>
+              </a:graphicData>
+            </a:graphic>
+          </wp:inline>
+        </w:drawing>
+      </w:r>
+      <w:r>
+        <w:rPr>
+          <w:noProof/>
+        </w:rPr>
+        <w:drawing>
+          <wp:inline distT="0" distB="0" distL="0" distR="0" wp14:anchorId="11415816" wp14:editId="1210BDF3">
+            <wp:extent cx="3276600" cy="1869942"/>
+            <wp:effectExtent l="0" t="0" r="0" b="0"/>
+            <wp:docPr id="205714589" name="Grafik 9"/>
+            <wp:cNvGraphicFramePr>
+              <a:graphicFrameLocks xmlns:a="http://schemas.openxmlformats.org/drawingml/2006/main" noChangeAspect="1"/>
+            </wp:cNvGraphicFramePr>
+            <a:graphic xmlns:a="http://schemas.openxmlformats.org/drawingml/2006/main">
+              <a:graphicData uri="http://schemas.openxmlformats.org/drawingml/2006/picture">
+                <pic:pic xmlns:pic="http://schemas.openxmlformats.org/drawingml/2006/picture">
+                  <pic:nvPicPr>
+                    <pic:cNvPr id="0" name="Picture 10"/>
+                    <pic:cNvPicPr>
+                      <a:picLocks noChangeAspect="1" noChangeArrowheads="1"/>
+                    </pic:cNvPicPr>
+                  </pic:nvPicPr>
+                  <pic:blipFill>
+                    <a:blip r:embed="rId43" cstate="print">
+                      <a:extLst>
+                        <a:ext uri="{28A0092B-C50C-407E-A947-70E740481C1C}">
+                          <a14:useLocalDpi xmlns:a14="http://schemas.microsoft.com/office/drawing/2010/main" val="0"/>
+                        </a:ext>
+                      </a:extLst>
+                    </a:blip>
+                    <a:srcRect/>
+                    <a:stretch>
+                      <a:fillRect/>
+                    </a:stretch>
+                  </pic:blipFill>
+                  <pic:spPr bwMode="auto">
+                    <a:xfrm>
+                      <a:off x="0" y="0"/>
+                      <a:ext cx="3303807" cy="1885469"/>
+                    </a:xfrm>
+                    <a:prstGeom prst="rect">
+                      <a:avLst/>
+                    </a:prstGeom>
+                    <a:noFill/>
+                    <a:ln>
+                      <a:noFill/>
+                    </a:ln>
+                  </pic:spPr>
+                </pic:pic>
+              </a:graphicData>
+            </a:graphic>
+          </wp:inline>
+        </w:drawing>
+      </w:r>
       <w:r>
         <w:br w:type="page"/>
       </w:r>
@@ -27849,7 +28668,13 @@
               <w:rPr>
                 <w:lang w:val="de-CH"/>
               </w:rPr>
-              <w:t>Das Spiel muss beendet werden, wenn der Spieler keine Lebenspunkte mehr hat oder das Spielziel erreicht wurde.</w:t>
+              <w:t>Das Spiel muss beendet werden, wenn der Spieler keine Lebenspunkte mehr hat</w:t>
+            </w:r>
+            <w:r>
+              <w:rPr>
+                <w:lang w:val="de-CH"/>
+              </w:rPr>
+              <w:t>.</w:t>
             </w:r>
           </w:p>
         </w:tc>
@@ -27943,13 +28768,7 @@
               <w:rPr>
                 <w:lang w:val="de-CH"/>
               </w:rPr>
-              <w:t>Das Spiel wird beendet, wenn der Spieler keine Leben mehr hat</w:t>
-            </w:r>
-            <w:r>
-              <w:rPr>
-                <w:lang w:val="de-CH"/>
-              </w:rPr>
-              <w:t xml:space="preserve"> oder Level 2 erreicht wird</w:t>
+              <w:t>Verifizierung des Übergangs in den Game-Over-Zustand sowie der korrekten Rücksetzung aller globalen Spielparameter bei Verlust aller HP.</w:t>
             </w:r>
           </w:p>
         </w:tc>
@@ -28000,13 +28819,19 @@
               <w:rPr>
                 <w:lang w:val="de-CH"/>
               </w:rPr>
-              <w:t xml:space="preserve">Lebenspunkte des Spielers = 0 oder </w:t>
+              <w:t>Spiel läuft</w:t>
             </w:r>
             <w:r>
               <w:rPr>
                 <w:lang w:val="de-CH"/>
               </w:rPr>
-              <w:t>Level 2 erreicht</w:t>
+              <w:t>.</w:t>
+            </w:r>
+            <w:r>
+              <w:rPr>
+                <w:lang w:val="de-CH"/>
+              </w:rPr>
+              <w:t xml:space="preserve"> Spieler hat nur noch einen Lebenspunkt (1 Herz).</w:t>
             </w:r>
           </w:p>
         </w:tc>
@@ -28043,26 +28868,74 @@
           <w:p>
             <w:pPr>
               <w:pStyle w:val="TextCDB"/>
+              <w:numPr>
+                <w:ilvl w:val="1"/>
+                <w:numId w:val="34"/>
+              </w:numPr>
               <w:rPr>
                 <w:lang w:val="de-CH"/>
               </w:rPr>
             </w:pPr>
+            <w:r>
+              <w:rPr>
+                <w:lang w:val="de-CH"/>
+              </w:rPr>
+              <w:t>Eine finale Kollision mit einem Gegner provozieren.</w:t>
+            </w:r>
           </w:p>
           <w:p>
             <w:pPr>
               <w:pStyle w:val="TextCDB"/>
+              <w:numPr>
+                <w:ilvl w:val="1"/>
+                <w:numId w:val="34"/>
+              </w:numPr>
               <w:rPr>
                 <w:lang w:val="de-CH"/>
               </w:rPr>
             </w:pPr>
+            <w:r>
+              <w:rPr>
+                <w:lang w:val="de-CH"/>
+              </w:rPr>
+              <w:t>Das Erscheinen des Game-Over-Overlays prüfen.</w:t>
+            </w:r>
           </w:p>
           <w:p>
             <w:pPr>
               <w:pStyle w:val="TextCDB"/>
+              <w:numPr>
+                <w:ilvl w:val="1"/>
+                <w:numId w:val="34"/>
+              </w:numPr>
               <w:rPr>
                 <w:lang w:val="de-CH"/>
               </w:rPr>
             </w:pPr>
+            <w:r>
+              <w:rPr>
+                <w:lang w:val="de-CH"/>
+              </w:rPr>
+              <w:t>Den Neustart des Spiels einleiten.</w:t>
+            </w:r>
+          </w:p>
+          <w:p>
+            <w:pPr>
+              <w:pStyle w:val="TextCDB"/>
+              <w:numPr>
+                <w:ilvl w:val="1"/>
+                <w:numId w:val="34"/>
+              </w:numPr>
+              <w:rPr>
+                <w:lang w:val="de-CH"/>
+              </w:rPr>
+            </w:pPr>
+            <w:r>
+              <w:rPr>
+                <w:lang w:val="de-CH"/>
+              </w:rPr>
+              <w:t>Kontrollieren, ob HP, Score und Gegner-Schwierigkeit (Speed/ Spawn) wieder auf den Initialwert stehen.</w:t>
+            </w:r>
           </w:p>
           <w:p>
             <w:pPr>
@@ -28110,10 +28983,240 @@
                 <w:lang w:val="de-CH"/>
               </w:rPr>
             </w:pPr>
+            <w:r>
+              <w:rPr>
+                <w:lang w:val="de-CH"/>
+              </w:rPr>
+              <w:t>Bei 0 HP wird das Spiel unterbrochen und das Game-Over-Menü eingeblendet. Alle Variablen (Score, Leben, Gegner-Speed und Spawn-Rate) werden zwingend auf die Standardwerte der config.py zurückgesetzt.</w:t>
+            </w:r>
           </w:p>
         </w:tc>
       </w:tr>
     </w:tbl>
+    <w:p>
+      <w:pPr>
+        <w:rPr>
+          <w:lang w:val="en-US" w:eastAsia="de-DE"/>
+        </w:rPr>
+      </w:pPr>
+      <w:r>
+        <w:rPr>
+          <w:lang w:val="en-US" w:eastAsia="de-DE"/>
+        </w:rPr>
+        <w:br/>
+      </w:r>
+      <w:r>
+        <w:rPr>
+          <w:noProof/>
+        </w:rPr>
+        <w:drawing>
+          <wp:inline distT="0" distB="0" distL="0" distR="0" wp14:anchorId="6807C63A" wp14:editId="0B51DF24">
+            <wp:extent cx="5719762" cy="3238158"/>
+            <wp:effectExtent l="0" t="0" r="0" b="635"/>
+            <wp:docPr id="183539276" name="Grafik 10"/>
+            <wp:cNvGraphicFramePr>
+              <a:graphicFrameLocks xmlns:a="http://schemas.openxmlformats.org/drawingml/2006/main" noChangeAspect="1"/>
+            </wp:cNvGraphicFramePr>
+            <a:graphic xmlns:a="http://schemas.openxmlformats.org/drawingml/2006/main">
+              <a:graphicData uri="http://schemas.openxmlformats.org/drawingml/2006/picture">
+                <pic:pic xmlns:pic="http://schemas.openxmlformats.org/drawingml/2006/picture">
+                  <pic:nvPicPr>
+                    <pic:cNvPr id="0" name="Picture 11"/>
+                    <pic:cNvPicPr>
+                      <a:picLocks noChangeAspect="1" noChangeArrowheads="1"/>
+                    </pic:cNvPicPr>
+                  </pic:nvPicPr>
+                  <pic:blipFill>
+                    <a:blip r:embed="rId44" cstate="print">
+                      <a:extLst>
+                        <a:ext uri="{28A0092B-C50C-407E-A947-70E740481C1C}">
+                          <a14:useLocalDpi xmlns:a14="http://schemas.microsoft.com/office/drawing/2010/main" val="0"/>
+                        </a:ext>
+                      </a:extLst>
+                    </a:blip>
+                    <a:srcRect/>
+                    <a:stretch>
+                      <a:fillRect/>
+                    </a:stretch>
+                  </pic:blipFill>
+                  <pic:spPr bwMode="auto">
+                    <a:xfrm>
+                      <a:off x="0" y="0"/>
+                      <a:ext cx="5728070" cy="3242861"/>
+                    </a:xfrm>
+                    <a:prstGeom prst="rect">
+                      <a:avLst/>
+                    </a:prstGeom>
+                    <a:noFill/>
+                    <a:ln>
+                      <a:noFill/>
+                    </a:ln>
+                  </pic:spPr>
+                </pic:pic>
+              </a:graphicData>
+            </a:graphic>
+          </wp:inline>
+        </w:drawing>
+      </w:r>
+      <w:r>
+        <w:rPr>
+          <w:lang w:val="en-US" w:eastAsia="de-DE"/>
+        </w:rPr>
+        <w:br/>
+      </w:r>
+      <w:r>
+        <w:rPr>
+          <w:lang w:val="en-US" w:eastAsia="de-DE"/>
+        </w:rPr>
+        <w:br/>
+      </w:r>
+      <w:r>
+        <w:rPr>
+          <w:rFonts w:cs="Arial"/>
+          <w:b/>
+          <w:bCs/>
+          <w:noProof/>
+          <w:kern w:val="1"/>
+          <w:sz w:val="24"/>
+          <w:szCs w:val="32"/>
+        </w:rPr>
+        <w:lastRenderedPageBreak/>
+        <w:drawing>
+          <wp:inline distT="0" distB="0" distL="0" distR="0" wp14:anchorId="192DB752" wp14:editId="09DE8408">
+            <wp:extent cx="6067425" cy="3443605"/>
+            <wp:effectExtent l="0" t="0" r="9525" b="4445"/>
+            <wp:docPr id="731965232" name="Grafik 5"/>
+            <wp:cNvGraphicFramePr>
+              <a:graphicFrameLocks xmlns:a="http://schemas.openxmlformats.org/drawingml/2006/main" noChangeAspect="1"/>
+            </wp:cNvGraphicFramePr>
+            <a:graphic xmlns:a="http://schemas.openxmlformats.org/drawingml/2006/main">
+              <a:graphicData uri="http://schemas.openxmlformats.org/drawingml/2006/picture">
+                <pic:pic xmlns:pic="http://schemas.openxmlformats.org/drawingml/2006/picture">
+                  <pic:nvPicPr>
+                    <pic:cNvPr id="0" name="Picture 6"/>
+                    <pic:cNvPicPr>
+                      <a:picLocks noChangeAspect="1" noChangeArrowheads="1"/>
+                    </pic:cNvPicPr>
+                  </pic:nvPicPr>
+                  <pic:blipFill>
+                    <a:blip r:embed="rId45" cstate="print">
+                      <a:extLst>
+                        <a:ext uri="{28A0092B-C50C-407E-A947-70E740481C1C}">
+                          <a14:useLocalDpi xmlns:a14="http://schemas.microsoft.com/office/drawing/2010/main" val="0"/>
+                        </a:ext>
+                      </a:extLst>
+                    </a:blip>
+                    <a:srcRect/>
+                    <a:stretch>
+                      <a:fillRect/>
+                    </a:stretch>
+                  </pic:blipFill>
+                  <pic:spPr bwMode="auto">
+                    <a:xfrm>
+                      <a:off x="0" y="0"/>
+                      <a:ext cx="6067425" cy="3443605"/>
+                    </a:xfrm>
+                    <a:prstGeom prst="rect">
+                      <a:avLst/>
+                    </a:prstGeom>
+                    <a:noFill/>
+                    <a:ln>
+                      <a:noFill/>
+                    </a:ln>
+                  </pic:spPr>
+                </pic:pic>
+              </a:graphicData>
+            </a:graphic>
+          </wp:inline>
+        </w:drawing>
+      </w:r>
+      <w:r>
+        <w:rPr>
+          <w:lang w:val="en-US" w:eastAsia="de-DE"/>
+        </w:rPr>
+        <w:br/>
+      </w:r>
+      <w:r>
+        <w:rPr>
+          <w:lang w:val="en-US" w:eastAsia="de-DE"/>
+        </w:rPr>
+        <w:br/>
+      </w:r>
+      <w:r>
+        <w:rPr>
+          <w:noProof/>
+          <w:lang w:val="en-US" w:eastAsia="de-DE"/>
+        </w:rPr>
+        <w:drawing>
+          <wp:inline distT="0" distB="0" distL="0" distR="0" wp14:anchorId="73A0613C" wp14:editId="49924445">
+            <wp:extent cx="6110605" cy="3495675"/>
+            <wp:effectExtent l="0" t="0" r="4445" b="9525"/>
+            <wp:docPr id="1789576988" name="Grafik 11"/>
+            <wp:cNvGraphicFramePr>
+              <a:graphicFrameLocks xmlns:a="http://schemas.openxmlformats.org/drawingml/2006/main" noChangeAspect="1"/>
+            </wp:cNvGraphicFramePr>
+            <a:graphic xmlns:a="http://schemas.openxmlformats.org/drawingml/2006/main">
+              <a:graphicData uri="http://schemas.openxmlformats.org/drawingml/2006/picture">
+                <pic:pic xmlns:pic="http://schemas.openxmlformats.org/drawingml/2006/picture">
+                  <pic:nvPicPr>
+                    <pic:cNvPr id="0" name="Picture 12"/>
+                    <pic:cNvPicPr>
+                      <a:picLocks noChangeAspect="1" noChangeArrowheads="1"/>
+                    </pic:cNvPicPr>
+                  </pic:nvPicPr>
+                  <pic:blipFill>
+                    <a:blip r:embed="rId46" cstate="print">
+                      <a:extLst>
+                        <a:ext uri="{28A0092B-C50C-407E-A947-70E740481C1C}">
+                          <a14:useLocalDpi xmlns:a14="http://schemas.microsoft.com/office/drawing/2010/main" val="0"/>
+                        </a:ext>
+                      </a:extLst>
+                    </a:blip>
+                    <a:srcRect/>
+                    <a:stretch>
+                      <a:fillRect/>
+                    </a:stretch>
+                  </pic:blipFill>
+                  <pic:spPr bwMode="auto">
+                    <a:xfrm>
+                      <a:off x="0" y="0"/>
+                      <a:ext cx="6110605" cy="3495675"/>
+                    </a:xfrm>
+                    <a:prstGeom prst="rect">
+                      <a:avLst/>
+                    </a:prstGeom>
+                    <a:noFill/>
+                    <a:ln>
+                      <a:noFill/>
+                    </a:ln>
+                  </pic:spPr>
+                </pic:pic>
+              </a:graphicData>
+            </a:graphic>
+          </wp:inline>
+        </w:drawing>
+      </w:r>
+    </w:p>
+    <w:p>
+      <w:pPr>
+        <w:suppressAutoHyphens w:val="0"/>
+        <w:rPr>
+          <w:lang w:val="en-US" w:eastAsia="de-DE"/>
+        </w:rPr>
+      </w:pPr>
+      <w:r>
+        <w:rPr>
+          <w:lang w:val="en-US" w:eastAsia="de-DE"/>
+        </w:rPr>
+        <w:br/>
+      </w:r>
+      <w:r>
+        <w:rPr>
+          <w:lang w:val="en-US" w:eastAsia="de-DE"/>
+        </w:rPr>
+        <w:br/>
+      </w:r>
+    </w:p>
     <w:p>
       <w:pPr>
         <w:rPr>
@@ -28592,7 +29695,7 @@
               <w:sz w:val="20"/>
               <w:szCs w:val="20"/>
             </w:rPr>
-            <w:t>17. März 2026</w:t>
+            <w:t>19. März 2026</w:t>
           </w:r>
           <w:r>
             <w:rPr>
@@ -30274,7 +31377,7 @@
   <w:abstractNum w:abstractNumId="8" w15:restartNumberingAfterBreak="0">
     <w:nsid w:val="118553B6"/>
     <w:multiLevelType w:val="multilevel"/>
-    <w:tmpl w:val="626E82DA"/>
+    <w:tmpl w:val="4D10E992"/>
     <w:lvl w:ilvl="0">
       <w:start w:val="1"/>
       <w:numFmt w:val="bullet"/>
@@ -30291,20 +31394,16 @@
         <w:sz w:val="20"/>
       </w:rPr>
     </w:lvl>
-    <w:lvl w:ilvl="1" w:tentative="1">
+    <w:lvl w:ilvl="1">
       <w:start w:val="1"/>
-      <w:numFmt w:val="bullet"/>
-      <w:lvlText w:val="o"/>
+      <w:numFmt w:val="decimal"/>
+      <w:lvlText w:val="%2."/>
       <w:lvlJc w:val="left"/>
       <w:pPr>
-        <w:tabs>
-          <w:tab w:val="num" w:pos="1440"/>
-        </w:tabs>
         <w:ind w:left="1440" w:hanging="360"/>
       </w:pPr>
       <w:rPr>
-        <w:rFonts w:ascii="Courier New" w:hAnsi="Courier New" w:hint="default"/>
-        <w:sz w:val="20"/>
+        <w:rFonts w:hint="default"/>
       </w:rPr>
     </w:lvl>
     <w:lvl w:ilvl="2" w:tentative="1">
@@ -30534,6 +31633,119 @@
     </w:lvl>
   </w:abstractNum>
   <w:abstractNum w:abstractNumId="10" w15:restartNumberingAfterBreak="0">
+    <w:nsid w:val="13F96C6A"/>
+    <w:multiLevelType w:val="hybridMultilevel"/>
+    <w:tmpl w:val="DE4CAB2C"/>
+    <w:lvl w:ilvl="0" w:tplc="08070001">
+      <w:start w:val="1"/>
+      <w:numFmt w:val="bullet"/>
+      <w:lvlText w:val=""/>
+      <w:lvlJc w:val="left"/>
+      <w:pPr>
+        <w:ind w:left="720" w:hanging="360"/>
+      </w:pPr>
+      <w:rPr>
+        <w:rFonts w:ascii="Symbol" w:hAnsi="Symbol" w:hint="default"/>
+      </w:rPr>
+    </w:lvl>
+    <w:lvl w:ilvl="1" w:tplc="08070003" w:tentative="1">
+      <w:start w:val="1"/>
+      <w:numFmt w:val="bullet"/>
+      <w:lvlText w:val="o"/>
+      <w:lvlJc w:val="left"/>
+      <w:pPr>
+        <w:ind w:left="1440" w:hanging="360"/>
+      </w:pPr>
+      <w:rPr>
+        <w:rFonts w:ascii="Courier New" w:hAnsi="Courier New" w:cs="Courier New" w:hint="default"/>
+      </w:rPr>
+    </w:lvl>
+    <w:lvl w:ilvl="2" w:tplc="08070005" w:tentative="1">
+      <w:start w:val="1"/>
+      <w:numFmt w:val="bullet"/>
+      <w:lvlText w:val=""/>
+      <w:lvlJc w:val="left"/>
+      <w:pPr>
+        <w:ind w:left="2160" w:hanging="360"/>
+      </w:pPr>
+      <w:rPr>
+        <w:rFonts w:ascii="Wingdings" w:hAnsi="Wingdings" w:hint="default"/>
+      </w:rPr>
+    </w:lvl>
+    <w:lvl w:ilvl="3" w:tplc="08070001" w:tentative="1">
+      <w:start w:val="1"/>
+      <w:numFmt w:val="bullet"/>
+      <w:lvlText w:val=""/>
+      <w:lvlJc w:val="left"/>
+      <w:pPr>
+        <w:ind w:left="2880" w:hanging="360"/>
+      </w:pPr>
+      <w:rPr>
+        <w:rFonts w:ascii="Symbol" w:hAnsi="Symbol" w:hint="default"/>
+      </w:rPr>
+    </w:lvl>
+    <w:lvl w:ilvl="4" w:tplc="08070003" w:tentative="1">
+      <w:start w:val="1"/>
+      <w:numFmt w:val="bullet"/>
+      <w:lvlText w:val="o"/>
+      <w:lvlJc w:val="left"/>
+      <w:pPr>
+        <w:ind w:left="3600" w:hanging="360"/>
+      </w:pPr>
+      <w:rPr>
+        <w:rFonts w:ascii="Courier New" w:hAnsi="Courier New" w:cs="Courier New" w:hint="default"/>
+      </w:rPr>
+    </w:lvl>
+    <w:lvl w:ilvl="5" w:tplc="08070005" w:tentative="1">
+      <w:start w:val="1"/>
+      <w:numFmt w:val="bullet"/>
+      <w:lvlText w:val=""/>
+      <w:lvlJc w:val="left"/>
+      <w:pPr>
+        <w:ind w:left="4320" w:hanging="360"/>
+      </w:pPr>
+      <w:rPr>
+        <w:rFonts w:ascii="Wingdings" w:hAnsi="Wingdings" w:hint="default"/>
+      </w:rPr>
+    </w:lvl>
+    <w:lvl w:ilvl="6" w:tplc="08070001" w:tentative="1">
+      <w:start w:val="1"/>
+      <w:numFmt w:val="bullet"/>
+      <w:lvlText w:val=""/>
+      <w:lvlJc w:val="left"/>
+      <w:pPr>
+        <w:ind w:left="5040" w:hanging="360"/>
+      </w:pPr>
+      <w:rPr>
+        <w:rFonts w:ascii="Symbol" w:hAnsi="Symbol" w:hint="default"/>
+      </w:rPr>
+    </w:lvl>
+    <w:lvl w:ilvl="7" w:tplc="08070003" w:tentative="1">
+      <w:start w:val="1"/>
+      <w:numFmt w:val="bullet"/>
+      <w:lvlText w:val="o"/>
+      <w:lvlJc w:val="left"/>
+      <w:pPr>
+        <w:ind w:left="5760" w:hanging="360"/>
+      </w:pPr>
+      <w:rPr>
+        <w:rFonts w:ascii="Courier New" w:hAnsi="Courier New" w:cs="Courier New" w:hint="default"/>
+      </w:rPr>
+    </w:lvl>
+    <w:lvl w:ilvl="8" w:tplc="08070005" w:tentative="1">
+      <w:start w:val="1"/>
+      <w:numFmt w:val="bullet"/>
+      <w:lvlText w:val=""/>
+      <w:lvlJc w:val="left"/>
+      <w:pPr>
+        <w:ind w:left="6480" w:hanging="360"/>
+      </w:pPr>
+      <w:rPr>
+        <w:rFonts w:ascii="Wingdings" w:hAnsi="Wingdings" w:hint="default"/>
+      </w:rPr>
+    </w:lvl>
+  </w:abstractNum>
+  <w:abstractNum w:abstractNumId="11" w15:restartNumberingAfterBreak="0">
     <w:nsid w:val="21AB444C"/>
     <w:multiLevelType w:val="multilevel"/>
     <w:tmpl w:val="9E66557E"/>
@@ -30682,7 +31894,7 @@
       </w:rPr>
     </w:lvl>
   </w:abstractNum>
-  <w:abstractNum w:abstractNumId="11" w15:restartNumberingAfterBreak="0">
+  <w:abstractNum w:abstractNumId="12" w15:restartNumberingAfterBreak="0">
     <w:nsid w:val="26345599"/>
     <w:multiLevelType w:val="hybridMultilevel"/>
     <w:tmpl w:val="B8CE50CC"/>
@@ -30795,7 +32007,7 @@
       </w:rPr>
     </w:lvl>
   </w:abstractNum>
-  <w:abstractNum w:abstractNumId="12" w15:restartNumberingAfterBreak="0">
+  <w:abstractNum w:abstractNumId="13" w15:restartNumberingAfterBreak="0">
     <w:nsid w:val="293046D8"/>
     <w:multiLevelType w:val="multilevel"/>
     <w:tmpl w:val="268405DE"/>
@@ -30908,7 +32120,96 @@
       </w:pPr>
     </w:lvl>
   </w:abstractNum>
-  <w:abstractNum w:abstractNumId="13" w15:restartNumberingAfterBreak="0">
+  <w:abstractNum w:abstractNumId="14" w15:restartNumberingAfterBreak="0">
+    <w:nsid w:val="2A48546D"/>
+    <w:multiLevelType w:val="hybridMultilevel"/>
+    <w:tmpl w:val="8AD48710"/>
+    <w:lvl w:ilvl="0" w:tplc="08070017">
+      <w:start w:val="1"/>
+      <w:numFmt w:val="lowerLetter"/>
+      <w:lvlText w:val="%1)"/>
+      <w:lvlJc w:val="left"/>
+      <w:pPr>
+        <w:ind w:left="720" w:hanging="360"/>
+      </w:pPr>
+      <w:rPr>
+        <w:rFonts w:hint="default"/>
+      </w:rPr>
+    </w:lvl>
+    <w:lvl w:ilvl="1" w:tplc="08070019" w:tentative="1">
+      <w:start w:val="1"/>
+      <w:numFmt w:val="lowerLetter"/>
+      <w:lvlText w:val="%2."/>
+      <w:lvlJc w:val="left"/>
+      <w:pPr>
+        <w:ind w:left="1440" w:hanging="360"/>
+      </w:pPr>
+    </w:lvl>
+    <w:lvl w:ilvl="2" w:tplc="0807001B" w:tentative="1">
+      <w:start w:val="1"/>
+      <w:numFmt w:val="lowerRoman"/>
+      <w:lvlText w:val="%3."/>
+      <w:lvlJc w:val="right"/>
+      <w:pPr>
+        <w:ind w:left="2160" w:hanging="180"/>
+      </w:pPr>
+    </w:lvl>
+    <w:lvl w:ilvl="3" w:tplc="0807000F" w:tentative="1">
+      <w:start w:val="1"/>
+      <w:numFmt w:val="decimal"/>
+      <w:lvlText w:val="%4."/>
+      <w:lvlJc w:val="left"/>
+      <w:pPr>
+        <w:ind w:left="2880" w:hanging="360"/>
+      </w:pPr>
+    </w:lvl>
+    <w:lvl w:ilvl="4" w:tplc="08070019" w:tentative="1">
+      <w:start w:val="1"/>
+      <w:numFmt w:val="lowerLetter"/>
+      <w:lvlText w:val="%5."/>
+      <w:lvlJc w:val="left"/>
+      <w:pPr>
+        <w:ind w:left="3600" w:hanging="360"/>
+      </w:pPr>
+    </w:lvl>
+    <w:lvl w:ilvl="5" w:tplc="0807001B" w:tentative="1">
+      <w:start w:val="1"/>
+      <w:numFmt w:val="lowerRoman"/>
+      <w:lvlText w:val="%6."/>
+      <w:lvlJc w:val="right"/>
+      <w:pPr>
+        <w:ind w:left="4320" w:hanging="180"/>
+      </w:pPr>
+    </w:lvl>
+    <w:lvl w:ilvl="6" w:tplc="0807000F" w:tentative="1">
+      <w:start w:val="1"/>
+      <w:numFmt w:val="decimal"/>
+      <w:lvlText w:val="%7."/>
+      <w:lvlJc w:val="left"/>
+      <w:pPr>
+        <w:ind w:left="5040" w:hanging="360"/>
+      </w:pPr>
+    </w:lvl>
+    <w:lvl w:ilvl="7" w:tplc="08070019" w:tentative="1">
+      <w:start w:val="1"/>
+      <w:numFmt w:val="lowerLetter"/>
+      <w:lvlText w:val="%8."/>
+      <w:lvlJc w:val="left"/>
+      <w:pPr>
+        <w:ind w:left="5760" w:hanging="360"/>
+      </w:pPr>
+    </w:lvl>
+    <w:lvl w:ilvl="8" w:tplc="0807001B" w:tentative="1">
+      <w:start w:val="1"/>
+      <w:numFmt w:val="lowerRoman"/>
+      <w:lvlText w:val="%9."/>
+      <w:lvlJc w:val="right"/>
+      <w:pPr>
+        <w:ind w:left="6480" w:hanging="180"/>
+      </w:pPr>
+    </w:lvl>
+  </w:abstractNum>
+  <w:abstractNum w:abstractNumId="15" w15:restartNumberingAfterBreak="0">
     <w:nsid w:val="34D62EF0"/>
     <w:multiLevelType w:val="multilevel"/>
     <w:tmpl w:val="39666F7C"/>
@@ -31086,7 +32387,7 @@
       </w:rPr>
     </w:lvl>
   </w:abstractNum>
-  <w:abstractNum w:abstractNumId="14" w15:restartNumberingAfterBreak="0">
+  <w:abstractNum w:abstractNumId="16" w15:restartNumberingAfterBreak="0">
     <w:nsid w:val="3D9111FA"/>
     <w:multiLevelType w:val="hybridMultilevel"/>
     <w:tmpl w:val="8AF8F0B2"/>
@@ -31199,7 +32500,7 @@
       </w:rPr>
     </w:lvl>
   </w:abstractNum>
-  <w:abstractNum w:abstractNumId="15" w15:restartNumberingAfterBreak="0">
+  <w:abstractNum w:abstractNumId="17" w15:restartNumberingAfterBreak="0">
     <w:nsid w:val="423A6476"/>
     <w:multiLevelType w:val="multilevel"/>
     <w:tmpl w:val="ADF2C556"/>
@@ -31348,7 +32649,7 @@
       </w:rPr>
     </w:lvl>
   </w:abstractNum>
-  <w:abstractNum w:abstractNumId="16" w15:restartNumberingAfterBreak="0">
+  <w:abstractNum w:abstractNumId="18" w15:restartNumberingAfterBreak="0">
     <w:nsid w:val="44E600C3"/>
     <w:multiLevelType w:val="multilevel"/>
     <w:tmpl w:val="B268F2F6"/>
@@ -31461,10 +32762,100 @@
       </w:pPr>
     </w:lvl>
   </w:abstractNum>
-  <w:abstractNum w:abstractNumId="17" w15:restartNumberingAfterBreak="0">
+  <w:abstractNum w:abstractNumId="19" w15:restartNumberingAfterBreak="0">
+    <w:nsid w:val="467A0165"/>
+    <w:multiLevelType w:val="hybridMultilevel"/>
+    <w:tmpl w:val="3408A3B2"/>
+    <w:lvl w:ilvl="0" w:tplc="B6D82E58">
+      <w:start w:val="1"/>
+      <w:numFmt w:val="decimal"/>
+      <w:lvlText w:val="%1."/>
+      <w:lvlJc w:val="left"/>
+      <w:pPr>
+        <w:ind w:left="720" w:hanging="360"/>
+      </w:pPr>
+      <w:rPr>
+        <w:rFonts w:eastAsia="PMingLiU" w:hint="default"/>
+        <w:sz w:val="20"/>
+      </w:rPr>
+    </w:lvl>
+    <w:lvl w:ilvl="1" w:tplc="08070019">
+      <w:start w:val="1"/>
+      <w:numFmt w:val="lowerLetter"/>
+      <w:lvlText w:val="%2."/>
+      <w:lvlJc w:val="left"/>
+      <w:pPr>
+        <w:ind w:left="1440" w:hanging="360"/>
+      </w:pPr>
+    </w:lvl>
+    <w:lvl w:ilvl="2" w:tplc="0807001B" w:tentative="1">
+      <w:start w:val="1"/>
+      <w:numFmt w:val="lowerRoman"/>
+      <w:lvlText w:val="%3."/>
+      <w:lvlJc w:val="right"/>
+      <w:pPr>
+        <w:ind w:left="2160" w:hanging="180"/>
+      </w:pPr>
+    </w:lvl>
+    <w:lvl w:ilvl="3" w:tplc="0807000F" w:tentative="1">
+      <w:start w:val="1"/>
+      <w:numFmt w:val="decimal"/>
+      <w:lvlText w:val="%4."/>
+      <w:lvlJc w:val="left"/>
+      <w:pPr>
+        <w:ind w:left="2880" w:hanging="360"/>
+      </w:pPr>
+    </w:lvl>
+    <w:lvl w:ilvl="4" w:tplc="08070019" w:tentative="1">
+      <w:start w:val="1"/>
+      <w:numFmt w:val="lowerLetter"/>
+      <w:lvlText w:val="%5."/>
+      <w:lvlJc w:val="left"/>
+      <w:pPr>
+        <w:ind w:left="3600" w:hanging="360"/>
+      </w:pPr>
+    </w:lvl>
+    <w:lvl w:ilvl="5" w:tplc="0807001B" w:tentative="1">
+      <w:start w:val="1"/>
+      <w:numFmt w:val="lowerRoman"/>
+      <w:lvlText w:val="%6."/>
+      <w:lvlJc w:val="right"/>
+      <w:pPr>
+        <w:ind w:left="4320" w:hanging="180"/>
+      </w:pPr>
+    </w:lvl>
+    <w:lvl w:ilvl="6" w:tplc="0807000F" w:tentative="1">
+      <w:start w:val="1"/>
+      <w:numFmt w:val="decimal"/>
+      <w:lvlText w:val="%7."/>
+      <w:lvlJc w:val="left"/>
+      <w:pPr>
+        <w:ind w:left="5040" w:hanging="360"/>
+      </w:pPr>
+    </w:lvl>
+    <w:lvl w:ilvl="7" w:tplc="08070019" w:tentative="1">
+      <w:start w:val="1"/>
+      <w:numFmt w:val="lowerLetter"/>
+      <w:lvlText w:val="%8."/>
+      <w:lvlJc w:val="left"/>
+      <w:pPr>
+        <w:ind w:left="5760" w:hanging="360"/>
+      </w:pPr>
+    </w:lvl>
+    <w:lvl w:ilvl="8" w:tplc="0807001B" w:tentative="1">
+      <w:start w:val="1"/>
+      <w:numFmt w:val="lowerRoman"/>
+      <w:lvlText w:val="%9."/>
+      <w:lvlJc w:val="right"/>
+      <w:pPr>
+        <w:ind w:left="6480" w:hanging="180"/>
+      </w:pPr>
+    </w:lvl>
+  </w:abstractNum>
+  <w:abstractNum w:abstractNumId="20" w15:restartNumberingAfterBreak="0">
     <w:nsid w:val="4717135D"/>
     <w:multiLevelType w:val="multilevel"/>
-    <w:tmpl w:val="16143F62"/>
+    <w:tmpl w:val="77E4D65A"/>
     <w:lvl w:ilvl="0">
       <w:start w:val="1"/>
       <w:numFmt w:val="bullet"/>
@@ -31497,6 +32888,430 @@
         <w:sz w:val="20"/>
       </w:rPr>
     </w:lvl>
+    <w:lvl w:ilvl="2">
+      <w:start w:val="1"/>
+      <w:numFmt w:val="decimal"/>
+      <w:lvlText w:val="%3."/>
+      <w:lvlJc w:val="left"/>
+      <w:pPr>
+        <w:ind w:left="2160" w:hanging="360"/>
+      </w:pPr>
+      <w:rPr>
+        <w:rFonts w:hint="default"/>
+      </w:rPr>
+    </w:lvl>
+    <w:lvl w:ilvl="3" w:tentative="1">
+      <w:start w:val="1"/>
+      <w:numFmt w:val="bullet"/>
+      <w:lvlText w:val=""/>
+      <w:lvlJc w:val="left"/>
+      <w:pPr>
+        <w:tabs>
+          <w:tab w:val="num" w:pos="2880"/>
+        </w:tabs>
+        <w:ind w:left="2880" w:hanging="360"/>
+      </w:pPr>
+      <w:rPr>
+        <w:rFonts w:ascii="Symbol" w:hAnsi="Symbol" w:hint="default"/>
+        <w:sz w:val="20"/>
+      </w:rPr>
+    </w:lvl>
+    <w:lvl w:ilvl="4" w:tentative="1">
+      <w:start w:val="1"/>
+      <w:numFmt w:val="bullet"/>
+      <w:lvlText w:val=""/>
+      <w:lvlJc w:val="left"/>
+      <w:pPr>
+        <w:tabs>
+          <w:tab w:val="num" w:pos="3600"/>
+        </w:tabs>
+        <w:ind w:left="3600" w:hanging="360"/>
+      </w:pPr>
+      <w:rPr>
+        <w:rFonts w:ascii="Symbol" w:hAnsi="Symbol" w:hint="default"/>
+        <w:sz w:val="20"/>
+      </w:rPr>
+    </w:lvl>
+    <w:lvl w:ilvl="5" w:tentative="1">
+      <w:start w:val="1"/>
+      <w:numFmt w:val="bullet"/>
+      <w:lvlText w:val=""/>
+      <w:lvlJc w:val="left"/>
+      <w:pPr>
+        <w:tabs>
+          <w:tab w:val="num" w:pos="4320"/>
+        </w:tabs>
+        <w:ind w:left="4320" w:hanging="360"/>
+      </w:pPr>
+      <w:rPr>
+        <w:rFonts w:ascii="Symbol" w:hAnsi="Symbol" w:hint="default"/>
+        <w:sz w:val="20"/>
+      </w:rPr>
+    </w:lvl>
+    <w:lvl w:ilvl="6" w:tentative="1">
+      <w:start w:val="1"/>
+      <w:numFmt w:val="bullet"/>
+      <w:lvlText w:val=""/>
+      <w:lvlJc w:val="left"/>
+      <w:pPr>
+        <w:tabs>
+          <w:tab w:val="num" w:pos="5040"/>
+        </w:tabs>
+        <w:ind w:left="5040" w:hanging="360"/>
+      </w:pPr>
+      <w:rPr>
+        <w:rFonts w:ascii="Symbol" w:hAnsi="Symbol" w:hint="default"/>
+        <w:sz w:val="20"/>
+      </w:rPr>
+    </w:lvl>
+    <w:lvl w:ilvl="7" w:tentative="1">
+      <w:start w:val="1"/>
+      <w:numFmt w:val="bullet"/>
+      <w:lvlText w:val=""/>
+      <w:lvlJc w:val="left"/>
+      <w:pPr>
+        <w:tabs>
+          <w:tab w:val="num" w:pos="5760"/>
+        </w:tabs>
+        <w:ind w:left="5760" w:hanging="360"/>
+      </w:pPr>
+      <w:rPr>
+        <w:rFonts w:ascii="Symbol" w:hAnsi="Symbol" w:hint="default"/>
+        <w:sz w:val="20"/>
+      </w:rPr>
+    </w:lvl>
+    <w:lvl w:ilvl="8" w:tentative="1">
+      <w:start w:val="1"/>
+      <w:numFmt w:val="bullet"/>
+      <w:lvlText w:val=""/>
+      <w:lvlJc w:val="left"/>
+      <w:pPr>
+        <w:tabs>
+          <w:tab w:val="num" w:pos="6480"/>
+        </w:tabs>
+        <w:ind w:left="6480" w:hanging="360"/>
+      </w:pPr>
+      <w:rPr>
+        <w:rFonts w:ascii="Symbol" w:hAnsi="Symbol" w:hint="default"/>
+        <w:sz w:val="20"/>
+      </w:rPr>
+    </w:lvl>
+  </w:abstractNum>
+  <w:abstractNum w:abstractNumId="21" w15:restartNumberingAfterBreak="0">
+    <w:nsid w:val="4F6F2BCE"/>
+    <w:multiLevelType w:val="multilevel"/>
+    <w:tmpl w:val="6A8021EC"/>
+    <w:lvl w:ilvl="0">
+      <w:start w:val="1"/>
+      <w:numFmt w:val="bullet"/>
+      <w:lvlText w:val=""/>
+      <w:lvlJc w:val="left"/>
+      <w:pPr>
+        <w:tabs>
+          <w:tab w:val="num" w:pos="720"/>
+        </w:tabs>
+        <w:ind w:left="720" w:hanging="360"/>
+      </w:pPr>
+      <w:rPr>
+        <w:rFonts w:ascii="Symbol" w:hAnsi="Symbol" w:hint="default"/>
+        <w:sz w:val="20"/>
+      </w:rPr>
+    </w:lvl>
+    <w:lvl w:ilvl="1">
+      <w:start w:val="1"/>
+      <w:numFmt w:val="decimal"/>
+      <w:lvlText w:val="%2."/>
+      <w:lvlJc w:val="left"/>
+      <w:pPr>
+        <w:ind w:left="1440" w:hanging="360"/>
+      </w:pPr>
+      <w:rPr>
+        <w:rFonts w:hint="default"/>
+      </w:rPr>
+    </w:lvl>
+    <w:lvl w:ilvl="2" w:tentative="1">
+      <w:start w:val="1"/>
+      <w:numFmt w:val="bullet"/>
+      <w:lvlText w:val=""/>
+      <w:lvlJc w:val="left"/>
+      <w:pPr>
+        <w:tabs>
+          <w:tab w:val="num" w:pos="2160"/>
+        </w:tabs>
+        <w:ind w:left="2160" w:hanging="360"/>
+      </w:pPr>
+      <w:rPr>
+        <w:rFonts w:ascii="Wingdings" w:hAnsi="Wingdings" w:hint="default"/>
+        <w:sz w:val="20"/>
+      </w:rPr>
+    </w:lvl>
+    <w:lvl w:ilvl="3" w:tentative="1">
+      <w:start w:val="1"/>
+      <w:numFmt w:val="bullet"/>
+      <w:lvlText w:val=""/>
+      <w:lvlJc w:val="left"/>
+      <w:pPr>
+        <w:tabs>
+          <w:tab w:val="num" w:pos="2880"/>
+        </w:tabs>
+        <w:ind w:left="2880" w:hanging="360"/>
+      </w:pPr>
+      <w:rPr>
+        <w:rFonts w:ascii="Wingdings" w:hAnsi="Wingdings" w:hint="default"/>
+        <w:sz w:val="20"/>
+      </w:rPr>
+    </w:lvl>
+    <w:lvl w:ilvl="4" w:tentative="1">
+      <w:start w:val="1"/>
+      <w:numFmt w:val="bullet"/>
+      <w:lvlText w:val=""/>
+      <w:lvlJc w:val="left"/>
+      <w:pPr>
+        <w:tabs>
+          <w:tab w:val="num" w:pos="3600"/>
+        </w:tabs>
+        <w:ind w:left="3600" w:hanging="360"/>
+      </w:pPr>
+      <w:rPr>
+        <w:rFonts w:ascii="Wingdings" w:hAnsi="Wingdings" w:hint="default"/>
+        <w:sz w:val="20"/>
+      </w:rPr>
+    </w:lvl>
+    <w:lvl w:ilvl="5" w:tentative="1">
+      <w:start w:val="1"/>
+      <w:numFmt w:val="bullet"/>
+      <w:lvlText w:val=""/>
+      <w:lvlJc w:val="left"/>
+      <w:pPr>
+        <w:tabs>
+          <w:tab w:val="num" w:pos="4320"/>
+        </w:tabs>
+        <w:ind w:left="4320" w:hanging="360"/>
+      </w:pPr>
+      <w:rPr>
+        <w:rFonts w:ascii="Wingdings" w:hAnsi="Wingdings" w:hint="default"/>
+        <w:sz w:val="20"/>
+      </w:rPr>
+    </w:lvl>
+    <w:lvl w:ilvl="6" w:tentative="1">
+      <w:start w:val="1"/>
+      <w:numFmt w:val="bullet"/>
+      <w:lvlText w:val=""/>
+      <w:lvlJc w:val="left"/>
+      <w:pPr>
+        <w:tabs>
+          <w:tab w:val="num" w:pos="5040"/>
+        </w:tabs>
+        <w:ind w:left="5040" w:hanging="360"/>
+      </w:pPr>
+      <w:rPr>
+        <w:rFonts w:ascii="Wingdings" w:hAnsi="Wingdings" w:hint="default"/>
+        <w:sz w:val="20"/>
+      </w:rPr>
+    </w:lvl>
+    <w:lvl w:ilvl="7" w:tentative="1">
+      <w:start w:val="1"/>
+      <w:numFmt w:val="bullet"/>
+      <w:lvlText w:val=""/>
+      <w:lvlJc w:val="left"/>
+      <w:pPr>
+        <w:tabs>
+          <w:tab w:val="num" w:pos="5760"/>
+        </w:tabs>
+        <w:ind w:left="5760" w:hanging="360"/>
+      </w:pPr>
+      <w:rPr>
+        <w:rFonts w:ascii="Wingdings" w:hAnsi="Wingdings" w:hint="default"/>
+        <w:sz w:val="20"/>
+      </w:rPr>
+    </w:lvl>
+    <w:lvl w:ilvl="8" w:tentative="1">
+      <w:start w:val="1"/>
+      <w:numFmt w:val="bullet"/>
+      <w:lvlText w:val=""/>
+      <w:lvlJc w:val="left"/>
+      <w:pPr>
+        <w:tabs>
+          <w:tab w:val="num" w:pos="6480"/>
+        </w:tabs>
+        <w:ind w:left="6480" w:hanging="360"/>
+      </w:pPr>
+      <w:rPr>
+        <w:rFonts w:ascii="Wingdings" w:hAnsi="Wingdings" w:hint="default"/>
+        <w:sz w:val="20"/>
+      </w:rPr>
+    </w:lvl>
+  </w:abstractNum>
+  <w:abstractNum w:abstractNumId="22" w15:restartNumberingAfterBreak="0">
+    <w:nsid w:val="52D6283A"/>
+    <w:multiLevelType w:val="multilevel"/>
+    <w:tmpl w:val="70B2FFB4"/>
+    <w:lvl w:ilvl="0">
+      <w:start w:val="1"/>
+      <w:numFmt w:val="bullet"/>
+      <w:lvlText w:val=""/>
+      <w:lvlJc w:val="left"/>
+      <w:pPr>
+        <w:tabs>
+          <w:tab w:val="num" w:pos="720"/>
+        </w:tabs>
+        <w:ind w:left="720" w:hanging="360"/>
+      </w:pPr>
+      <w:rPr>
+        <w:rFonts w:ascii="Symbol" w:hAnsi="Symbol" w:hint="default"/>
+        <w:sz w:val="20"/>
+      </w:rPr>
+    </w:lvl>
+    <w:lvl w:ilvl="1">
+      <w:start w:val="1"/>
+      <w:numFmt w:val="decimal"/>
+      <w:lvlText w:val="%2."/>
+      <w:lvlJc w:val="left"/>
+      <w:pPr>
+        <w:ind w:left="1440" w:hanging="360"/>
+      </w:pPr>
+      <w:rPr>
+        <w:rFonts w:hint="default"/>
+      </w:rPr>
+    </w:lvl>
+    <w:lvl w:ilvl="2">
+      <w:start w:val="1"/>
+      <w:numFmt w:val="lowerLetter"/>
+      <w:lvlText w:val="%3."/>
+      <w:lvlJc w:val="left"/>
+      <w:pPr>
+        <w:ind w:left="2160" w:hanging="360"/>
+      </w:pPr>
+    </w:lvl>
+    <w:lvl w:ilvl="3" w:tentative="1">
+      <w:start w:val="1"/>
+      <w:numFmt w:val="bullet"/>
+      <w:lvlText w:val=""/>
+      <w:lvlJc w:val="left"/>
+      <w:pPr>
+        <w:tabs>
+          <w:tab w:val="num" w:pos="2880"/>
+        </w:tabs>
+        <w:ind w:left="2880" w:hanging="360"/>
+      </w:pPr>
+      <w:rPr>
+        <w:rFonts w:ascii="Wingdings" w:hAnsi="Wingdings" w:hint="default"/>
+        <w:sz w:val="20"/>
+      </w:rPr>
+    </w:lvl>
+    <w:lvl w:ilvl="4" w:tentative="1">
+      <w:start w:val="1"/>
+      <w:numFmt w:val="bullet"/>
+      <w:lvlText w:val=""/>
+      <w:lvlJc w:val="left"/>
+      <w:pPr>
+        <w:tabs>
+          <w:tab w:val="num" w:pos="3600"/>
+        </w:tabs>
+        <w:ind w:left="3600" w:hanging="360"/>
+      </w:pPr>
+      <w:rPr>
+        <w:rFonts w:ascii="Wingdings" w:hAnsi="Wingdings" w:hint="default"/>
+        <w:sz w:val="20"/>
+      </w:rPr>
+    </w:lvl>
+    <w:lvl w:ilvl="5" w:tentative="1">
+      <w:start w:val="1"/>
+      <w:numFmt w:val="bullet"/>
+      <w:lvlText w:val=""/>
+      <w:lvlJc w:val="left"/>
+      <w:pPr>
+        <w:tabs>
+          <w:tab w:val="num" w:pos="4320"/>
+        </w:tabs>
+        <w:ind w:left="4320" w:hanging="360"/>
+      </w:pPr>
+      <w:rPr>
+        <w:rFonts w:ascii="Wingdings" w:hAnsi="Wingdings" w:hint="default"/>
+        <w:sz w:val="20"/>
+      </w:rPr>
+    </w:lvl>
+    <w:lvl w:ilvl="6" w:tentative="1">
+      <w:start w:val="1"/>
+      <w:numFmt w:val="bullet"/>
+      <w:lvlText w:val=""/>
+      <w:lvlJc w:val="left"/>
+      <w:pPr>
+        <w:tabs>
+          <w:tab w:val="num" w:pos="5040"/>
+        </w:tabs>
+        <w:ind w:left="5040" w:hanging="360"/>
+      </w:pPr>
+      <w:rPr>
+        <w:rFonts w:ascii="Wingdings" w:hAnsi="Wingdings" w:hint="default"/>
+        <w:sz w:val="20"/>
+      </w:rPr>
+    </w:lvl>
+    <w:lvl w:ilvl="7" w:tentative="1">
+      <w:start w:val="1"/>
+      <w:numFmt w:val="bullet"/>
+      <w:lvlText w:val=""/>
+      <w:lvlJc w:val="left"/>
+      <w:pPr>
+        <w:tabs>
+          <w:tab w:val="num" w:pos="5760"/>
+        </w:tabs>
+        <w:ind w:left="5760" w:hanging="360"/>
+      </w:pPr>
+      <w:rPr>
+        <w:rFonts w:ascii="Wingdings" w:hAnsi="Wingdings" w:hint="default"/>
+        <w:sz w:val="20"/>
+      </w:rPr>
+    </w:lvl>
+    <w:lvl w:ilvl="8" w:tentative="1">
+      <w:start w:val="1"/>
+      <w:numFmt w:val="bullet"/>
+      <w:lvlText w:val=""/>
+      <w:lvlJc w:val="left"/>
+      <w:pPr>
+        <w:tabs>
+          <w:tab w:val="num" w:pos="6480"/>
+        </w:tabs>
+        <w:ind w:left="6480" w:hanging="360"/>
+      </w:pPr>
+      <w:rPr>
+        <w:rFonts w:ascii="Wingdings" w:hAnsi="Wingdings" w:hint="default"/>
+        <w:sz w:val="20"/>
+      </w:rPr>
+    </w:lvl>
+  </w:abstractNum>
+  <w:abstractNum w:abstractNumId="23" w15:restartNumberingAfterBreak="0">
+    <w:nsid w:val="562B7C97"/>
+    <w:multiLevelType w:val="multilevel"/>
+    <w:tmpl w:val="25E06888"/>
+    <w:lvl w:ilvl="0">
+      <w:start w:val="1"/>
+      <w:numFmt w:val="bullet"/>
+      <w:lvlText w:val=""/>
+      <w:lvlJc w:val="left"/>
+      <w:pPr>
+        <w:tabs>
+          <w:tab w:val="num" w:pos="720"/>
+        </w:tabs>
+        <w:ind w:left="720" w:hanging="360"/>
+      </w:pPr>
+      <w:rPr>
+        <w:rFonts w:ascii="Symbol" w:hAnsi="Symbol" w:hint="default"/>
+        <w:sz w:val="20"/>
+      </w:rPr>
+    </w:lvl>
+    <w:lvl w:ilvl="1">
+      <w:start w:val="1"/>
+      <w:numFmt w:val="decimal"/>
+      <w:lvlText w:val="%2."/>
+      <w:lvlJc w:val="left"/>
+      <w:pPr>
+        <w:ind w:left="1440" w:hanging="360"/>
+      </w:pPr>
+      <w:rPr>
+        <w:rFonts w:hint="default"/>
+      </w:rPr>
+    </w:lvl>
     <w:lvl w:ilvl="2" w:tentative="1">
       <w:start w:val="1"/>
       <w:numFmt w:val="bullet"/>
@@ -31610,10 +33425,268 @@
       </w:rPr>
     </w:lvl>
   </w:abstractNum>
-  <w:abstractNum w:abstractNumId="18" w15:restartNumberingAfterBreak="0">
-    <w:nsid w:val="4F6F2BCE"/>
+  <w:abstractNum w:abstractNumId="24" w15:restartNumberingAfterBreak="0">
+    <w:nsid w:val="5C4E76D9"/>
+    <w:multiLevelType w:val="hybridMultilevel"/>
+    <w:tmpl w:val="93F49EF4"/>
+    <w:lvl w:ilvl="0" w:tplc="08070001">
+      <w:start w:val="1"/>
+      <w:numFmt w:val="bullet"/>
+      <w:lvlText w:val=""/>
+      <w:lvlJc w:val="left"/>
+      <w:pPr>
+        <w:ind w:left="720" w:hanging="360"/>
+      </w:pPr>
+      <w:rPr>
+        <w:rFonts w:ascii="Symbol" w:hAnsi="Symbol" w:hint="default"/>
+      </w:rPr>
+    </w:lvl>
+    <w:lvl w:ilvl="1" w:tplc="08070003" w:tentative="1">
+      <w:start w:val="1"/>
+      <w:numFmt w:val="bullet"/>
+      <w:lvlText w:val="o"/>
+      <w:lvlJc w:val="left"/>
+      <w:pPr>
+        <w:ind w:left="1440" w:hanging="360"/>
+      </w:pPr>
+      <w:rPr>
+        <w:rFonts w:ascii="Courier New" w:hAnsi="Courier New" w:cs="Courier New" w:hint="default"/>
+      </w:rPr>
+    </w:lvl>
+    <w:lvl w:ilvl="2" w:tplc="08070005" w:tentative="1">
+      <w:start w:val="1"/>
+      <w:numFmt w:val="bullet"/>
+      <w:lvlText w:val=""/>
+      <w:lvlJc w:val="left"/>
+      <w:pPr>
+        <w:ind w:left="2160" w:hanging="360"/>
+      </w:pPr>
+      <w:rPr>
+        <w:rFonts w:ascii="Wingdings" w:hAnsi="Wingdings" w:hint="default"/>
+      </w:rPr>
+    </w:lvl>
+    <w:lvl w:ilvl="3" w:tplc="08070001" w:tentative="1">
+      <w:start w:val="1"/>
+      <w:numFmt w:val="bullet"/>
+      <w:lvlText w:val=""/>
+      <w:lvlJc w:val="left"/>
+      <w:pPr>
+        <w:ind w:left="2880" w:hanging="360"/>
+      </w:pPr>
+      <w:rPr>
+        <w:rFonts w:ascii="Symbol" w:hAnsi="Symbol" w:hint="default"/>
+      </w:rPr>
+    </w:lvl>
+    <w:lvl w:ilvl="4" w:tplc="08070003" w:tentative="1">
+      <w:start w:val="1"/>
+      <w:numFmt w:val="bullet"/>
+      <w:lvlText w:val="o"/>
+      <w:lvlJc w:val="left"/>
+      <w:pPr>
+        <w:ind w:left="3600" w:hanging="360"/>
+      </w:pPr>
+      <w:rPr>
+        <w:rFonts w:ascii="Courier New" w:hAnsi="Courier New" w:cs="Courier New" w:hint="default"/>
+      </w:rPr>
+    </w:lvl>
+    <w:lvl w:ilvl="5" w:tplc="08070005" w:tentative="1">
+      <w:start w:val="1"/>
+      <w:numFmt w:val="bullet"/>
+      <w:lvlText w:val=""/>
+      <w:lvlJc w:val="left"/>
+      <w:pPr>
+        <w:ind w:left="4320" w:hanging="360"/>
+      </w:pPr>
+      <w:rPr>
+        <w:rFonts w:ascii="Wingdings" w:hAnsi="Wingdings" w:hint="default"/>
+      </w:rPr>
+    </w:lvl>
+    <w:lvl w:ilvl="6" w:tplc="08070001" w:tentative="1">
+      <w:start w:val="1"/>
+      <w:numFmt w:val="bullet"/>
+      <w:lvlText w:val=""/>
+      <w:lvlJc w:val="left"/>
+      <w:pPr>
+        <w:ind w:left="5040" w:hanging="360"/>
+      </w:pPr>
+      <w:rPr>
+        <w:rFonts w:ascii="Symbol" w:hAnsi="Symbol" w:hint="default"/>
+      </w:rPr>
+    </w:lvl>
+    <w:lvl w:ilvl="7" w:tplc="08070003" w:tentative="1">
+      <w:start w:val="1"/>
+      <w:numFmt w:val="bullet"/>
+      <w:lvlText w:val="o"/>
+      <w:lvlJc w:val="left"/>
+      <w:pPr>
+        <w:ind w:left="5760" w:hanging="360"/>
+      </w:pPr>
+      <w:rPr>
+        <w:rFonts w:ascii="Courier New" w:hAnsi="Courier New" w:cs="Courier New" w:hint="default"/>
+      </w:rPr>
+    </w:lvl>
+    <w:lvl w:ilvl="8" w:tplc="08070005" w:tentative="1">
+      <w:start w:val="1"/>
+      <w:numFmt w:val="bullet"/>
+      <w:lvlText w:val=""/>
+      <w:lvlJc w:val="left"/>
+      <w:pPr>
+        <w:ind w:left="6480" w:hanging="360"/>
+      </w:pPr>
+      <w:rPr>
+        <w:rFonts w:ascii="Wingdings" w:hAnsi="Wingdings" w:hint="default"/>
+      </w:rPr>
+    </w:lvl>
+  </w:abstractNum>
+  <w:abstractNum w:abstractNumId="25" w15:restartNumberingAfterBreak="0">
+    <w:nsid w:val="605B4623"/>
     <w:multiLevelType w:val="multilevel"/>
-    <w:tmpl w:val="8D187C1A"/>
+    <w:tmpl w:val="153CF858"/>
+    <w:lvl w:ilvl="0">
+      <w:start w:val="1"/>
+      <w:numFmt w:val="bullet"/>
+      <w:lvlText w:val=""/>
+      <w:lvlJc w:val="left"/>
+      <w:pPr>
+        <w:tabs>
+          <w:tab w:val="num" w:pos="720"/>
+        </w:tabs>
+        <w:ind w:left="720" w:hanging="360"/>
+      </w:pPr>
+      <w:rPr>
+        <w:rFonts w:ascii="Symbol" w:hAnsi="Symbol" w:hint="default"/>
+        <w:sz w:val="20"/>
+      </w:rPr>
+    </w:lvl>
+    <w:lvl w:ilvl="1">
+      <w:start w:val="1"/>
+      <w:numFmt w:val="decimal"/>
+      <w:lvlText w:val="%2."/>
+      <w:lvlJc w:val="left"/>
+      <w:pPr>
+        <w:ind w:left="1440" w:hanging="360"/>
+      </w:pPr>
+      <w:rPr>
+        <w:rFonts w:hint="default"/>
+      </w:rPr>
+    </w:lvl>
+    <w:lvl w:ilvl="2" w:tentative="1">
+      <w:start w:val="1"/>
+      <w:numFmt w:val="bullet"/>
+      <w:lvlText w:val=""/>
+      <w:lvlJc w:val="left"/>
+      <w:pPr>
+        <w:tabs>
+          <w:tab w:val="num" w:pos="2160"/>
+        </w:tabs>
+        <w:ind w:left="2160" w:hanging="360"/>
+      </w:pPr>
+      <w:rPr>
+        <w:rFonts w:ascii="Symbol" w:hAnsi="Symbol" w:hint="default"/>
+        <w:sz w:val="20"/>
+      </w:rPr>
+    </w:lvl>
+    <w:lvl w:ilvl="3" w:tentative="1">
+      <w:start w:val="1"/>
+      <w:numFmt w:val="bullet"/>
+      <w:lvlText w:val=""/>
+      <w:lvlJc w:val="left"/>
+      <w:pPr>
+        <w:tabs>
+          <w:tab w:val="num" w:pos="2880"/>
+        </w:tabs>
+        <w:ind w:left="2880" w:hanging="360"/>
+      </w:pPr>
+      <w:rPr>
+        <w:rFonts w:ascii="Symbol" w:hAnsi="Symbol" w:hint="default"/>
+        <w:sz w:val="20"/>
+      </w:rPr>
+    </w:lvl>
+    <w:lvl w:ilvl="4" w:tentative="1">
+      <w:start w:val="1"/>
+      <w:numFmt w:val="bullet"/>
+      <w:lvlText w:val=""/>
+      <w:lvlJc w:val="left"/>
+      <w:pPr>
+        <w:tabs>
+          <w:tab w:val="num" w:pos="3600"/>
+        </w:tabs>
+        <w:ind w:left="3600" w:hanging="360"/>
+      </w:pPr>
+      <w:rPr>
+        <w:rFonts w:ascii="Symbol" w:hAnsi="Symbol" w:hint="default"/>
+        <w:sz w:val="20"/>
+      </w:rPr>
+    </w:lvl>
+    <w:lvl w:ilvl="5" w:tentative="1">
+      <w:start w:val="1"/>
+      <w:numFmt w:val="bullet"/>
+      <w:lvlText w:val=""/>
+      <w:lvlJc w:val="left"/>
+      <w:pPr>
+        <w:tabs>
+          <w:tab w:val="num" w:pos="4320"/>
+        </w:tabs>
+        <w:ind w:left="4320" w:hanging="360"/>
+      </w:pPr>
+      <w:rPr>
+        <w:rFonts w:ascii="Symbol" w:hAnsi="Symbol" w:hint="default"/>
+        <w:sz w:val="20"/>
+      </w:rPr>
+    </w:lvl>
+    <w:lvl w:ilvl="6" w:tentative="1">
+      <w:start w:val="1"/>
+      <w:numFmt w:val="bullet"/>
+      <w:lvlText w:val=""/>
+      <w:lvlJc w:val="left"/>
+      <w:pPr>
+        <w:tabs>
+          <w:tab w:val="num" w:pos="5040"/>
+        </w:tabs>
+        <w:ind w:left="5040" w:hanging="360"/>
+      </w:pPr>
+      <w:rPr>
+        <w:rFonts w:ascii="Symbol" w:hAnsi="Symbol" w:hint="default"/>
+        <w:sz w:val="20"/>
+      </w:rPr>
+    </w:lvl>
+    <w:lvl w:ilvl="7" w:tentative="1">
+      <w:start w:val="1"/>
+      <w:numFmt w:val="bullet"/>
+      <w:lvlText w:val=""/>
+      <w:lvlJc w:val="left"/>
+      <w:pPr>
+        <w:tabs>
+          <w:tab w:val="num" w:pos="5760"/>
+        </w:tabs>
+        <w:ind w:left="5760" w:hanging="360"/>
+      </w:pPr>
+      <w:rPr>
+        <w:rFonts w:ascii="Symbol" w:hAnsi="Symbol" w:hint="default"/>
+        <w:sz w:val="20"/>
+      </w:rPr>
+    </w:lvl>
+    <w:lvl w:ilvl="8" w:tentative="1">
+      <w:start w:val="1"/>
+      <w:numFmt w:val="bullet"/>
+      <w:lvlText w:val=""/>
+      <w:lvlJc w:val="left"/>
+      <w:pPr>
+        <w:tabs>
+          <w:tab w:val="num" w:pos="6480"/>
+        </w:tabs>
+        <w:ind w:left="6480" w:hanging="360"/>
+      </w:pPr>
+      <w:rPr>
+        <w:rFonts w:ascii="Symbol" w:hAnsi="Symbol" w:hint="default"/>
+        <w:sz w:val="20"/>
+      </w:rPr>
+    </w:lvl>
+  </w:abstractNum>
+  <w:abstractNum w:abstractNumId="26" w15:restartNumberingAfterBreak="0">
+    <w:nsid w:val="66006D9C"/>
+    <w:multiLevelType w:val="multilevel"/>
+    <w:tmpl w:val="A5E4BAFE"/>
     <w:lvl w:ilvl="0">
       <w:start w:val="1"/>
       <w:numFmt w:val="bullet"/>
@@ -31759,14 +33832,14 @@
       </w:rPr>
     </w:lvl>
   </w:abstractNum>
-  <w:abstractNum w:abstractNumId="19" w15:restartNumberingAfterBreak="0">
-    <w:nsid w:val="52D6283A"/>
+  <w:abstractNum w:abstractNumId="27" w15:restartNumberingAfterBreak="0">
+    <w:nsid w:val="685E19CD"/>
     <w:multiLevelType w:val="multilevel"/>
-    <w:tmpl w:val="FF700F8A"/>
+    <w:tmpl w:val="250E0862"/>
     <w:lvl w:ilvl="0">
       <w:start w:val="1"/>
-      <w:numFmt w:val="bullet"/>
-      <w:lvlText w:val=""/>
+      <w:numFmt w:val="decimal"/>
+      <w:lvlText w:val="%1."/>
       <w:lvlJc w:val="left"/>
       <w:pPr>
         <w:tabs>
@@ -31774,15 +33847,11 @@
         </w:tabs>
         <w:ind w:left="720" w:hanging="360"/>
       </w:pPr>
-      <w:rPr>
-        <w:rFonts w:ascii="Symbol" w:hAnsi="Symbol" w:hint="default"/>
-        <w:sz w:val="20"/>
-      </w:rPr>
     </w:lvl>
     <w:lvl w:ilvl="1" w:tentative="1">
       <w:start w:val="1"/>
-      <w:numFmt w:val="bullet"/>
-      <w:lvlText w:val="o"/>
+      <w:numFmt w:val="decimal"/>
+      <w:lvlText w:val="%2."/>
       <w:lvlJc w:val="left"/>
       <w:pPr>
         <w:tabs>
@@ -31790,15 +33859,11 @@
         </w:tabs>
         <w:ind w:left="1440" w:hanging="360"/>
       </w:pPr>
-      <w:rPr>
-        <w:rFonts w:ascii="Courier New" w:hAnsi="Courier New" w:hint="default"/>
-        <w:sz w:val="20"/>
-      </w:rPr>
     </w:lvl>
     <w:lvl w:ilvl="2" w:tentative="1">
       <w:start w:val="1"/>
-      <w:numFmt w:val="bullet"/>
-      <w:lvlText w:val=""/>
+      <w:numFmt w:val="decimal"/>
+      <w:lvlText w:val="%3."/>
       <w:lvlJc w:val="left"/>
       <w:pPr>
         <w:tabs>
@@ -31806,15 +33871,11 @@
         </w:tabs>
         <w:ind w:left="2160" w:hanging="360"/>
       </w:pPr>
-      <w:rPr>
-        <w:rFonts w:ascii="Wingdings" w:hAnsi="Wingdings" w:hint="default"/>
-        <w:sz w:val="20"/>
-      </w:rPr>
     </w:lvl>
     <w:lvl w:ilvl="3" w:tentative="1">
       <w:start w:val="1"/>
-      <w:numFmt w:val="bullet"/>
-      <w:lvlText w:val=""/>
+      <w:numFmt w:val="decimal"/>
+      <w:lvlText w:val="%4."/>
       <w:lvlJc w:val="left"/>
       <w:pPr>
         <w:tabs>
@@ -31822,15 +33883,11 @@
         </w:tabs>
         <w:ind w:left="2880" w:hanging="360"/>
       </w:pPr>
-      <w:rPr>
-        <w:rFonts w:ascii="Wingdings" w:hAnsi="Wingdings" w:hint="default"/>
-        <w:sz w:val="20"/>
-      </w:rPr>
     </w:lvl>
     <w:lvl w:ilvl="4" w:tentative="1">
       <w:start w:val="1"/>
-      <w:numFmt w:val="bullet"/>
-      <w:lvlText w:val=""/>
+      <w:numFmt w:val="decimal"/>
+      <w:lvlText w:val="%5."/>
       <w:lvlJc w:val="left"/>
       <w:pPr>
         <w:tabs>
@@ -31838,15 +33895,11 @@
         </w:tabs>
         <w:ind w:left="3600" w:hanging="360"/>
       </w:pPr>
-      <w:rPr>
-        <w:rFonts w:ascii="Wingdings" w:hAnsi="Wingdings" w:hint="default"/>
-        <w:sz w:val="20"/>
-      </w:rPr>
     </w:lvl>
     <w:lvl w:ilvl="5" w:tentative="1">
       <w:start w:val="1"/>
-      <w:numFmt w:val="bullet"/>
-      <w:lvlText w:val=""/>
+      <w:numFmt w:val="decimal"/>
+      <w:lvlText w:val="%6."/>
       <w:lvlJc w:val="left"/>
       <w:pPr>
         <w:tabs>
@@ -31854,15 +33907,11 @@
         </w:tabs>
         <w:ind w:left="4320" w:hanging="360"/>
       </w:pPr>
-      <w:rPr>
-        <w:rFonts w:ascii="Wingdings" w:hAnsi="Wingdings" w:hint="default"/>
-        <w:sz w:val="20"/>
-      </w:rPr>
     </w:lvl>
     <w:lvl w:ilvl="6" w:tentative="1">
       <w:start w:val="1"/>
-      <w:numFmt w:val="bullet"/>
-      <w:lvlText w:val=""/>
+      <w:numFmt w:val="decimal"/>
+      <w:lvlText w:val="%7."/>
       <w:lvlJc w:val="left"/>
       <w:pPr>
         <w:tabs>
@@ -31870,15 +33919,11 @@
         </w:tabs>
         <w:ind w:left="5040" w:hanging="360"/>
       </w:pPr>
-      <w:rPr>
-        <w:rFonts w:ascii="Wingdings" w:hAnsi="Wingdings" w:hint="default"/>
-        <w:sz w:val="20"/>
-      </w:rPr>
     </w:lvl>
     <w:lvl w:ilvl="7" w:tentative="1">
       <w:start w:val="1"/>
-      <w:numFmt w:val="bullet"/>
-      <w:lvlText w:val=""/>
+      <w:numFmt w:val="decimal"/>
+      <w:lvlText w:val="%8."/>
       <w:lvlJc w:val="left"/>
       <w:pPr>
         <w:tabs>
@@ -31886,15 +33931,11 @@
         </w:tabs>
         <w:ind w:left="5760" w:hanging="360"/>
       </w:pPr>
-      <w:rPr>
-        <w:rFonts w:ascii="Wingdings" w:hAnsi="Wingdings" w:hint="default"/>
-        <w:sz w:val="20"/>
-      </w:rPr>
     </w:lvl>
     <w:lvl w:ilvl="8" w:tentative="1">
       <w:start w:val="1"/>
-      <w:numFmt w:val="bullet"/>
-      <w:lvlText w:val=""/>
+      <w:numFmt w:val="decimal"/>
+      <w:lvlText w:val="%9."/>
       <w:lvlJc w:val="left"/>
       <w:pPr>
         <w:tabs>
@@ -31902,165 +33943,12 @@
         </w:tabs>
         <w:ind w:left="6480" w:hanging="360"/>
       </w:pPr>
-      <w:rPr>
-        <w:rFonts w:ascii="Wingdings" w:hAnsi="Wingdings" w:hint="default"/>
-        <w:sz w:val="20"/>
-      </w:rPr>
     </w:lvl>
   </w:abstractNum>
-  <w:abstractNum w:abstractNumId="20" w15:restartNumberingAfterBreak="0">
-    <w:nsid w:val="562B7C97"/>
-    <w:multiLevelType w:val="multilevel"/>
-    <w:tmpl w:val="DF8A7340"/>
-    <w:lvl w:ilvl="0">
-      <w:start w:val="1"/>
-      <w:numFmt w:val="bullet"/>
-      <w:lvlText w:val=""/>
-      <w:lvlJc w:val="left"/>
-      <w:pPr>
-        <w:tabs>
-          <w:tab w:val="num" w:pos="720"/>
-        </w:tabs>
-        <w:ind w:left="720" w:hanging="360"/>
-      </w:pPr>
-      <w:rPr>
-        <w:rFonts w:ascii="Symbol" w:hAnsi="Symbol" w:hint="default"/>
-        <w:sz w:val="20"/>
-      </w:rPr>
-    </w:lvl>
-    <w:lvl w:ilvl="1" w:tentative="1">
-      <w:start w:val="1"/>
-      <w:numFmt w:val="bullet"/>
-      <w:lvlText w:val=""/>
-      <w:lvlJc w:val="left"/>
-      <w:pPr>
-        <w:tabs>
-          <w:tab w:val="num" w:pos="1440"/>
-        </w:tabs>
-        <w:ind w:left="1440" w:hanging="360"/>
-      </w:pPr>
-      <w:rPr>
-        <w:rFonts w:ascii="Symbol" w:hAnsi="Symbol" w:hint="default"/>
-        <w:sz w:val="20"/>
-      </w:rPr>
-    </w:lvl>
-    <w:lvl w:ilvl="2" w:tentative="1">
-      <w:start w:val="1"/>
-      <w:numFmt w:val="bullet"/>
-      <w:lvlText w:val=""/>
-      <w:lvlJc w:val="left"/>
-      <w:pPr>
-        <w:tabs>
-          <w:tab w:val="num" w:pos="2160"/>
-        </w:tabs>
-        <w:ind w:left="2160" w:hanging="360"/>
-      </w:pPr>
-      <w:rPr>
-        <w:rFonts w:ascii="Symbol" w:hAnsi="Symbol" w:hint="default"/>
-        <w:sz w:val="20"/>
-      </w:rPr>
-    </w:lvl>
-    <w:lvl w:ilvl="3" w:tentative="1">
-      <w:start w:val="1"/>
-      <w:numFmt w:val="bullet"/>
-      <w:lvlText w:val=""/>
-      <w:lvlJc w:val="left"/>
-      <w:pPr>
-        <w:tabs>
-          <w:tab w:val="num" w:pos="2880"/>
-        </w:tabs>
-        <w:ind w:left="2880" w:hanging="360"/>
-      </w:pPr>
-      <w:rPr>
-        <w:rFonts w:ascii="Symbol" w:hAnsi="Symbol" w:hint="default"/>
-        <w:sz w:val="20"/>
-      </w:rPr>
-    </w:lvl>
-    <w:lvl w:ilvl="4" w:tentative="1">
-      <w:start w:val="1"/>
-      <w:numFmt w:val="bullet"/>
-      <w:lvlText w:val=""/>
-      <w:lvlJc w:val="left"/>
-      <w:pPr>
-        <w:tabs>
-          <w:tab w:val="num" w:pos="3600"/>
-        </w:tabs>
-        <w:ind w:left="3600" w:hanging="360"/>
-      </w:pPr>
-      <w:rPr>
-        <w:rFonts w:ascii="Symbol" w:hAnsi="Symbol" w:hint="default"/>
-        <w:sz w:val="20"/>
-      </w:rPr>
-    </w:lvl>
-    <w:lvl w:ilvl="5" w:tentative="1">
-      <w:start w:val="1"/>
-      <w:numFmt w:val="bullet"/>
-      <w:lvlText w:val=""/>
-      <w:lvlJc w:val="left"/>
-      <w:pPr>
-        <w:tabs>
-          <w:tab w:val="num" w:pos="4320"/>
-        </w:tabs>
-        <w:ind w:left="4320" w:hanging="360"/>
-      </w:pPr>
-      <w:rPr>
-        <w:rFonts w:ascii="Symbol" w:hAnsi="Symbol" w:hint="default"/>
-        <w:sz w:val="20"/>
-      </w:rPr>
-    </w:lvl>
-    <w:lvl w:ilvl="6" w:tentative="1">
-      <w:start w:val="1"/>
-      <w:numFmt w:val="bullet"/>
-      <w:lvlText w:val=""/>
-      <w:lvlJc w:val="left"/>
-      <w:pPr>
-        <w:tabs>
-          <w:tab w:val="num" w:pos="5040"/>
-        </w:tabs>
-        <w:ind w:left="5040" w:hanging="360"/>
-      </w:pPr>
-      <w:rPr>
-        <w:rFonts w:ascii="Symbol" w:hAnsi="Symbol" w:hint="default"/>
-        <w:sz w:val="20"/>
-      </w:rPr>
-    </w:lvl>
-    <w:lvl w:ilvl="7" w:tentative="1">
-      <w:start w:val="1"/>
-      <w:numFmt w:val="bullet"/>
-      <w:lvlText w:val=""/>
-      <w:lvlJc w:val="left"/>
-      <w:pPr>
-        <w:tabs>
-          <w:tab w:val="num" w:pos="5760"/>
-        </w:tabs>
-        <w:ind w:left="5760" w:hanging="360"/>
-      </w:pPr>
-      <w:rPr>
-        <w:rFonts w:ascii="Symbol" w:hAnsi="Symbol" w:hint="default"/>
-        <w:sz w:val="20"/>
-      </w:rPr>
-    </w:lvl>
-    <w:lvl w:ilvl="8" w:tentative="1">
-      <w:start w:val="1"/>
-      <w:numFmt w:val="bullet"/>
-      <w:lvlText w:val=""/>
-      <w:lvlJc w:val="left"/>
-      <w:pPr>
-        <w:tabs>
-          <w:tab w:val="num" w:pos="6480"/>
-        </w:tabs>
-        <w:ind w:left="6480" w:hanging="360"/>
-      </w:pPr>
-      <w:rPr>
-        <w:rFonts w:ascii="Symbol" w:hAnsi="Symbol" w:hint="default"/>
-        <w:sz w:val="20"/>
-      </w:rPr>
-    </w:lvl>
-  </w:abstractNum>
-  <w:abstractNum w:abstractNumId="21" w15:restartNumberingAfterBreak="0">
-    <w:nsid w:val="5C4E76D9"/>
+  <w:abstractNum w:abstractNumId="28" w15:restartNumberingAfterBreak="0">
+    <w:nsid w:val="6F7D5AC1"/>
     <w:multiLevelType w:val="hybridMultilevel"/>
-    <w:tmpl w:val="93F49EF4"/>
+    <w:tmpl w:val="D2D6F064"/>
     <w:lvl w:ilvl="0" w:tplc="08070001">
       <w:start w:val="1"/>
       <w:numFmt w:val="bullet"/>
@@ -32170,531 +34058,7 @@
       </w:rPr>
     </w:lvl>
   </w:abstractNum>
-  <w:abstractNum w:abstractNumId="22" w15:restartNumberingAfterBreak="0">
-    <w:nsid w:val="605B4623"/>
-    <w:multiLevelType w:val="multilevel"/>
-    <w:tmpl w:val="EC10CB8A"/>
-    <w:lvl w:ilvl="0">
-      <w:start w:val="1"/>
-      <w:numFmt w:val="bullet"/>
-      <w:lvlText w:val=""/>
-      <w:lvlJc w:val="left"/>
-      <w:pPr>
-        <w:tabs>
-          <w:tab w:val="num" w:pos="720"/>
-        </w:tabs>
-        <w:ind w:left="720" w:hanging="360"/>
-      </w:pPr>
-      <w:rPr>
-        <w:rFonts w:ascii="Symbol" w:hAnsi="Symbol" w:hint="default"/>
-        <w:sz w:val="20"/>
-      </w:rPr>
-    </w:lvl>
-    <w:lvl w:ilvl="1" w:tentative="1">
-      <w:start w:val="1"/>
-      <w:numFmt w:val="bullet"/>
-      <w:lvlText w:val=""/>
-      <w:lvlJc w:val="left"/>
-      <w:pPr>
-        <w:tabs>
-          <w:tab w:val="num" w:pos="1440"/>
-        </w:tabs>
-        <w:ind w:left="1440" w:hanging="360"/>
-      </w:pPr>
-      <w:rPr>
-        <w:rFonts w:ascii="Symbol" w:hAnsi="Symbol" w:hint="default"/>
-        <w:sz w:val="20"/>
-      </w:rPr>
-    </w:lvl>
-    <w:lvl w:ilvl="2" w:tentative="1">
-      <w:start w:val="1"/>
-      <w:numFmt w:val="bullet"/>
-      <w:lvlText w:val=""/>
-      <w:lvlJc w:val="left"/>
-      <w:pPr>
-        <w:tabs>
-          <w:tab w:val="num" w:pos="2160"/>
-        </w:tabs>
-        <w:ind w:left="2160" w:hanging="360"/>
-      </w:pPr>
-      <w:rPr>
-        <w:rFonts w:ascii="Symbol" w:hAnsi="Symbol" w:hint="default"/>
-        <w:sz w:val="20"/>
-      </w:rPr>
-    </w:lvl>
-    <w:lvl w:ilvl="3" w:tentative="1">
-      <w:start w:val="1"/>
-      <w:numFmt w:val="bullet"/>
-      <w:lvlText w:val=""/>
-      <w:lvlJc w:val="left"/>
-      <w:pPr>
-        <w:tabs>
-          <w:tab w:val="num" w:pos="2880"/>
-        </w:tabs>
-        <w:ind w:left="2880" w:hanging="360"/>
-      </w:pPr>
-      <w:rPr>
-        <w:rFonts w:ascii="Symbol" w:hAnsi="Symbol" w:hint="default"/>
-        <w:sz w:val="20"/>
-      </w:rPr>
-    </w:lvl>
-    <w:lvl w:ilvl="4" w:tentative="1">
-      <w:start w:val="1"/>
-      <w:numFmt w:val="bullet"/>
-      <w:lvlText w:val=""/>
-      <w:lvlJc w:val="left"/>
-      <w:pPr>
-        <w:tabs>
-          <w:tab w:val="num" w:pos="3600"/>
-        </w:tabs>
-        <w:ind w:left="3600" w:hanging="360"/>
-      </w:pPr>
-      <w:rPr>
-        <w:rFonts w:ascii="Symbol" w:hAnsi="Symbol" w:hint="default"/>
-        <w:sz w:val="20"/>
-      </w:rPr>
-    </w:lvl>
-    <w:lvl w:ilvl="5" w:tentative="1">
-      <w:start w:val="1"/>
-      <w:numFmt w:val="bullet"/>
-      <w:lvlText w:val=""/>
-      <w:lvlJc w:val="left"/>
-      <w:pPr>
-        <w:tabs>
-          <w:tab w:val="num" w:pos="4320"/>
-        </w:tabs>
-        <w:ind w:left="4320" w:hanging="360"/>
-      </w:pPr>
-      <w:rPr>
-        <w:rFonts w:ascii="Symbol" w:hAnsi="Symbol" w:hint="default"/>
-        <w:sz w:val="20"/>
-      </w:rPr>
-    </w:lvl>
-    <w:lvl w:ilvl="6" w:tentative="1">
-      <w:start w:val="1"/>
-      <w:numFmt w:val="bullet"/>
-      <w:lvlText w:val=""/>
-      <w:lvlJc w:val="left"/>
-      <w:pPr>
-        <w:tabs>
-          <w:tab w:val="num" w:pos="5040"/>
-        </w:tabs>
-        <w:ind w:left="5040" w:hanging="360"/>
-      </w:pPr>
-      <w:rPr>
-        <w:rFonts w:ascii="Symbol" w:hAnsi="Symbol" w:hint="default"/>
-        <w:sz w:val="20"/>
-      </w:rPr>
-    </w:lvl>
-    <w:lvl w:ilvl="7" w:tentative="1">
-      <w:start w:val="1"/>
-      <w:numFmt w:val="bullet"/>
-      <w:lvlText w:val=""/>
-      <w:lvlJc w:val="left"/>
-      <w:pPr>
-        <w:tabs>
-          <w:tab w:val="num" w:pos="5760"/>
-        </w:tabs>
-        <w:ind w:left="5760" w:hanging="360"/>
-      </w:pPr>
-      <w:rPr>
-        <w:rFonts w:ascii="Symbol" w:hAnsi="Symbol" w:hint="default"/>
-        <w:sz w:val="20"/>
-      </w:rPr>
-    </w:lvl>
-    <w:lvl w:ilvl="8" w:tentative="1">
-      <w:start w:val="1"/>
-      <w:numFmt w:val="bullet"/>
-      <w:lvlText w:val=""/>
-      <w:lvlJc w:val="left"/>
-      <w:pPr>
-        <w:tabs>
-          <w:tab w:val="num" w:pos="6480"/>
-        </w:tabs>
-        <w:ind w:left="6480" w:hanging="360"/>
-      </w:pPr>
-      <w:rPr>
-        <w:rFonts w:ascii="Symbol" w:hAnsi="Symbol" w:hint="default"/>
-        <w:sz w:val="20"/>
-      </w:rPr>
-    </w:lvl>
-  </w:abstractNum>
-  <w:abstractNum w:abstractNumId="23" w15:restartNumberingAfterBreak="0">
-    <w:nsid w:val="66006D9C"/>
-    <w:multiLevelType w:val="multilevel"/>
-    <w:tmpl w:val="A5E4BAFE"/>
-    <w:lvl w:ilvl="0">
-      <w:start w:val="1"/>
-      <w:numFmt w:val="bullet"/>
-      <w:lvlText w:val=""/>
-      <w:lvlJc w:val="left"/>
-      <w:pPr>
-        <w:tabs>
-          <w:tab w:val="num" w:pos="720"/>
-        </w:tabs>
-        <w:ind w:left="720" w:hanging="360"/>
-      </w:pPr>
-      <w:rPr>
-        <w:rFonts w:ascii="Symbol" w:hAnsi="Symbol" w:hint="default"/>
-        <w:sz w:val="20"/>
-      </w:rPr>
-    </w:lvl>
-    <w:lvl w:ilvl="1" w:tentative="1">
-      <w:start w:val="1"/>
-      <w:numFmt w:val="bullet"/>
-      <w:lvlText w:val="o"/>
-      <w:lvlJc w:val="left"/>
-      <w:pPr>
-        <w:tabs>
-          <w:tab w:val="num" w:pos="1440"/>
-        </w:tabs>
-        <w:ind w:left="1440" w:hanging="360"/>
-      </w:pPr>
-      <w:rPr>
-        <w:rFonts w:ascii="Courier New" w:hAnsi="Courier New" w:hint="default"/>
-        <w:sz w:val="20"/>
-      </w:rPr>
-    </w:lvl>
-    <w:lvl w:ilvl="2" w:tentative="1">
-      <w:start w:val="1"/>
-      <w:numFmt w:val="bullet"/>
-      <w:lvlText w:val=""/>
-      <w:lvlJc w:val="left"/>
-      <w:pPr>
-        <w:tabs>
-          <w:tab w:val="num" w:pos="2160"/>
-        </w:tabs>
-        <w:ind w:left="2160" w:hanging="360"/>
-      </w:pPr>
-      <w:rPr>
-        <w:rFonts w:ascii="Wingdings" w:hAnsi="Wingdings" w:hint="default"/>
-        <w:sz w:val="20"/>
-      </w:rPr>
-    </w:lvl>
-    <w:lvl w:ilvl="3" w:tentative="1">
-      <w:start w:val="1"/>
-      <w:numFmt w:val="bullet"/>
-      <w:lvlText w:val=""/>
-      <w:lvlJc w:val="left"/>
-      <w:pPr>
-        <w:tabs>
-          <w:tab w:val="num" w:pos="2880"/>
-        </w:tabs>
-        <w:ind w:left="2880" w:hanging="360"/>
-      </w:pPr>
-      <w:rPr>
-        <w:rFonts w:ascii="Wingdings" w:hAnsi="Wingdings" w:hint="default"/>
-        <w:sz w:val="20"/>
-      </w:rPr>
-    </w:lvl>
-    <w:lvl w:ilvl="4" w:tentative="1">
-      <w:start w:val="1"/>
-      <w:numFmt w:val="bullet"/>
-      <w:lvlText w:val=""/>
-      <w:lvlJc w:val="left"/>
-      <w:pPr>
-        <w:tabs>
-          <w:tab w:val="num" w:pos="3600"/>
-        </w:tabs>
-        <w:ind w:left="3600" w:hanging="360"/>
-      </w:pPr>
-      <w:rPr>
-        <w:rFonts w:ascii="Wingdings" w:hAnsi="Wingdings" w:hint="default"/>
-        <w:sz w:val="20"/>
-      </w:rPr>
-    </w:lvl>
-    <w:lvl w:ilvl="5" w:tentative="1">
-      <w:start w:val="1"/>
-      <w:numFmt w:val="bullet"/>
-      <w:lvlText w:val=""/>
-      <w:lvlJc w:val="left"/>
-      <w:pPr>
-        <w:tabs>
-          <w:tab w:val="num" w:pos="4320"/>
-        </w:tabs>
-        <w:ind w:left="4320" w:hanging="360"/>
-      </w:pPr>
-      <w:rPr>
-        <w:rFonts w:ascii="Wingdings" w:hAnsi="Wingdings" w:hint="default"/>
-        <w:sz w:val="20"/>
-      </w:rPr>
-    </w:lvl>
-    <w:lvl w:ilvl="6" w:tentative="1">
-      <w:start w:val="1"/>
-      <w:numFmt w:val="bullet"/>
-      <w:lvlText w:val=""/>
-      <w:lvlJc w:val="left"/>
-      <w:pPr>
-        <w:tabs>
-          <w:tab w:val="num" w:pos="5040"/>
-        </w:tabs>
-        <w:ind w:left="5040" w:hanging="360"/>
-      </w:pPr>
-      <w:rPr>
-        <w:rFonts w:ascii="Wingdings" w:hAnsi="Wingdings" w:hint="default"/>
-        <w:sz w:val="20"/>
-      </w:rPr>
-    </w:lvl>
-    <w:lvl w:ilvl="7" w:tentative="1">
-      <w:start w:val="1"/>
-      <w:numFmt w:val="bullet"/>
-      <w:lvlText w:val=""/>
-      <w:lvlJc w:val="left"/>
-      <w:pPr>
-        <w:tabs>
-          <w:tab w:val="num" w:pos="5760"/>
-        </w:tabs>
-        <w:ind w:left="5760" w:hanging="360"/>
-      </w:pPr>
-      <w:rPr>
-        <w:rFonts w:ascii="Wingdings" w:hAnsi="Wingdings" w:hint="default"/>
-        <w:sz w:val="20"/>
-      </w:rPr>
-    </w:lvl>
-    <w:lvl w:ilvl="8" w:tentative="1">
-      <w:start w:val="1"/>
-      <w:numFmt w:val="bullet"/>
-      <w:lvlText w:val=""/>
-      <w:lvlJc w:val="left"/>
-      <w:pPr>
-        <w:tabs>
-          <w:tab w:val="num" w:pos="6480"/>
-        </w:tabs>
-        <w:ind w:left="6480" w:hanging="360"/>
-      </w:pPr>
-      <w:rPr>
-        <w:rFonts w:ascii="Wingdings" w:hAnsi="Wingdings" w:hint="default"/>
-        <w:sz w:val="20"/>
-      </w:rPr>
-    </w:lvl>
-  </w:abstractNum>
-  <w:abstractNum w:abstractNumId="24" w15:restartNumberingAfterBreak="0">
-    <w:nsid w:val="685E19CD"/>
-    <w:multiLevelType w:val="multilevel"/>
-    <w:tmpl w:val="250E0862"/>
-    <w:lvl w:ilvl="0">
-      <w:start w:val="1"/>
-      <w:numFmt w:val="decimal"/>
-      <w:lvlText w:val="%1."/>
-      <w:lvlJc w:val="left"/>
-      <w:pPr>
-        <w:tabs>
-          <w:tab w:val="num" w:pos="720"/>
-        </w:tabs>
-        <w:ind w:left="720" w:hanging="360"/>
-      </w:pPr>
-    </w:lvl>
-    <w:lvl w:ilvl="1" w:tentative="1">
-      <w:start w:val="1"/>
-      <w:numFmt w:val="decimal"/>
-      <w:lvlText w:val="%2."/>
-      <w:lvlJc w:val="left"/>
-      <w:pPr>
-        <w:tabs>
-          <w:tab w:val="num" w:pos="1440"/>
-        </w:tabs>
-        <w:ind w:left="1440" w:hanging="360"/>
-      </w:pPr>
-    </w:lvl>
-    <w:lvl w:ilvl="2" w:tentative="1">
-      <w:start w:val="1"/>
-      <w:numFmt w:val="decimal"/>
-      <w:lvlText w:val="%3."/>
-      <w:lvlJc w:val="left"/>
-      <w:pPr>
-        <w:tabs>
-          <w:tab w:val="num" w:pos="2160"/>
-        </w:tabs>
-        <w:ind w:left="2160" w:hanging="360"/>
-      </w:pPr>
-    </w:lvl>
-    <w:lvl w:ilvl="3" w:tentative="1">
-      <w:start w:val="1"/>
-      <w:numFmt w:val="decimal"/>
-      <w:lvlText w:val="%4."/>
-      <w:lvlJc w:val="left"/>
-      <w:pPr>
-        <w:tabs>
-          <w:tab w:val="num" w:pos="2880"/>
-        </w:tabs>
-        <w:ind w:left="2880" w:hanging="360"/>
-      </w:pPr>
-    </w:lvl>
-    <w:lvl w:ilvl="4" w:tentative="1">
-      <w:start w:val="1"/>
-      <w:numFmt w:val="decimal"/>
-      <w:lvlText w:val="%5."/>
-      <w:lvlJc w:val="left"/>
-      <w:pPr>
-        <w:tabs>
-          <w:tab w:val="num" w:pos="3600"/>
-        </w:tabs>
-        <w:ind w:left="3600" w:hanging="360"/>
-      </w:pPr>
-    </w:lvl>
-    <w:lvl w:ilvl="5" w:tentative="1">
-      <w:start w:val="1"/>
-      <w:numFmt w:val="decimal"/>
-      <w:lvlText w:val="%6."/>
-      <w:lvlJc w:val="left"/>
-      <w:pPr>
-        <w:tabs>
-          <w:tab w:val="num" w:pos="4320"/>
-        </w:tabs>
-        <w:ind w:left="4320" w:hanging="360"/>
-      </w:pPr>
-    </w:lvl>
-    <w:lvl w:ilvl="6" w:tentative="1">
-      <w:start w:val="1"/>
-      <w:numFmt w:val="decimal"/>
-      <w:lvlText w:val="%7."/>
-      <w:lvlJc w:val="left"/>
-      <w:pPr>
-        <w:tabs>
-          <w:tab w:val="num" w:pos="5040"/>
-        </w:tabs>
-        <w:ind w:left="5040" w:hanging="360"/>
-      </w:pPr>
-    </w:lvl>
-    <w:lvl w:ilvl="7" w:tentative="1">
-      <w:start w:val="1"/>
-      <w:numFmt w:val="decimal"/>
-      <w:lvlText w:val="%8."/>
-      <w:lvlJc w:val="left"/>
-      <w:pPr>
-        <w:tabs>
-          <w:tab w:val="num" w:pos="5760"/>
-        </w:tabs>
-        <w:ind w:left="5760" w:hanging="360"/>
-      </w:pPr>
-    </w:lvl>
-    <w:lvl w:ilvl="8" w:tentative="1">
-      <w:start w:val="1"/>
-      <w:numFmt w:val="decimal"/>
-      <w:lvlText w:val="%9."/>
-      <w:lvlJc w:val="left"/>
-      <w:pPr>
-        <w:tabs>
-          <w:tab w:val="num" w:pos="6480"/>
-        </w:tabs>
-        <w:ind w:left="6480" w:hanging="360"/>
-      </w:pPr>
-    </w:lvl>
-  </w:abstractNum>
-  <w:abstractNum w:abstractNumId="25" w15:restartNumberingAfterBreak="0">
-    <w:nsid w:val="6F7D5AC1"/>
-    <w:multiLevelType w:val="hybridMultilevel"/>
-    <w:tmpl w:val="D2D6F064"/>
-    <w:lvl w:ilvl="0" w:tplc="08070001">
-      <w:start w:val="1"/>
-      <w:numFmt w:val="bullet"/>
-      <w:lvlText w:val=""/>
-      <w:lvlJc w:val="left"/>
-      <w:pPr>
-        <w:ind w:left="720" w:hanging="360"/>
-      </w:pPr>
-      <w:rPr>
-        <w:rFonts w:ascii="Symbol" w:hAnsi="Symbol" w:hint="default"/>
-      </w:rPr>
-    </w:lvl>
-    <w:lvl w:ilvl="1" w:tplc="08070003" w:tentative="1">
-      <w:start w:val="1"/>
-      <w:numFmt w:val="bullet"/>
-      <w:lvlText w:val="o"/>
-      <w:lvlJc w:val="left"/>
-      <w:pPr>
-        <w:ind w:left="1440" w:hanging="360"/>
-      </w:pPr>
-      <w:rPr>
-        <w:rFonts w:ascii="Courier New" w:hAnsi="Courier New" w:cs="Courier New" w:hint="default"/>
-      </w:rPr>
-    </w:lvl>
-    <w:lvl w:ilvl="2" w:tplc="08070005" w:tentative="1">
-      <w:start w:val="1"/>
-      <w:numFmt w:val="bullet"/>
-      <w:lvlText w:val=""/>
-      <w:lvlJc w:val="left"/>
-      <w:pPr>
-        <w:ind w:left="2160" w:hanging="360"/>
-      </w:pPr>
-      <w:rPr>
-        <w:rFonts w:ascii="Wingdings" w:hAnsi="Wingdings" w:hint="default"/>
-      </w:rPr>
-    </w:lvl>
-    <w:lvl w:ilvl="3" w:tplc="08070001" w:tentative="1">
-      <w:start w:val="1"/>
-      <w:numFmt w:val="bullet"/>
-      <w:lvlText w:val=""/>
-      <w:lvlJc w:val="left"/>
-      <w:pPr>
-        <w:ind w:left="2880" w:hanging="360"/>
-      </w:pPr>
-      <w:rPr>
-        <w:rFonts w:ascii="Symbol" w:hAnsi="Symbol" w:hint="default"/>
-      </w:rPr>
-    </w:lvl>
-    <w:lvl w:ilvl="4" w:tplc="08070003" w:tentative="1">
-      <w:start w:val="1"/>
-      <w:numFmt w:val="bullet"/>
-      <w:lvlText w:val="o"/>
-      <w:lvlJc w:val="left"/>
-      <w:pPr>
-        <w:ind w:left="3600" w:hanging="360"/>
-      </w:pPr>
-      <w:rPr>
-        <w:rFonts w:ascii="Courier New" w:hAnsi="Courier New" w:cs="Courier New" w:hint="default"/>
-      </w:rPr>
-    </w:lvl>
-    <w:lvl w:ilvl="5" w:tplc="08070005" w:tentative="1">
-      <w:start w:val="1"/>
-      <w:numFmt w:val="bullet"/>
-      <w:lvlText w:val=""/>
-      <w:lvlJc w:val="left"/>
-      <w:pPr>
-        <w:ind w:left="4320" w:hanging="360"/>
-      </w:pPr>
-      <w:rPr>
-        <w:rFonts w:ascii="Wingdings" w:hAnsi="Wingdings" w:hint="default"/>
-      </w:rPr>
-    </w:lvl>
-    <w:lvl w:ilvl="6" w:tplc="08070001" w:tentative="1">
-      <w:start w:val="1"/>
-      <w:numFmt w:val="bullet"/>
-      <w:lvlText w:val=""/>
-      <w:lvlJc w:val="left"/>
-      <w:pPr>
-        <w:ind w:left="5040" w:hanging="360"/>
-      </w:pPr>
-      <w:rPr>
-        <w:rFonts w:ascii="Symbol" w:hAnsi="Symbol" w:hint="default"/>
-      </w:rPr>
-    </w:lvl>
-    <w:lvl w:ilvl="7" w:tplc="08070003" w:tentative="1">
-      <w:start w:val="1"/>
-      <w:numFmt w:val="bullet"/>
-      <w:lvlText w:val="o"/>
-      <w:lvlJc w:val="left"/>
-      <w:pPr>
-        <w:ind w:left="5760" w:hanging="360"/>
-      </w:pPr>
-      <w:rPr>
-        <w:rFonts w:ascii="Courier New" w:hAnsi="Courier New" w:cs="Courier New" w:hint="default"/>
-      </w:rPr>
-    </w:lvl>
-    <w:lvl w:ilvl="8" w:tplc="08070005" w:tentative="1">
-      <w:start w:val="1"/>
-      <w:numFmt w:val="bullet"/>
-      <w:lvlText w:val=""/>
-      <w:lvlJc w:val="left"/>
-      <w:pPr>
-        <w:ind w:left="6480" w:hanging="360"/>
-      </w:pPr>
-      <w:rPr>
-        <w:rFonts w:ascii="Wingdings" w:hAnsi="Wingdings" w:hint="default"/>
-      </w:rPr>
-    </w:lvl>
-  </w:abstractNum>
-  <w:abstractNum w:abstractNumId="26" w15:restartNumberingAfterBreak="0">
+  <w:abstractNum w:abstractNumId="29" w15:restartNumberingAfterBreak="0">
     <w:nsid w:val="776F4194"/>
     <w:multiLevelType w:val="multilevel"/>
     <w:tmpl w:val="3ADC7FF6"/>
@@ -32807,7 +34171,7 @@
       </w:pPr>
     </w:lvl>
   </w:abstractNum>
-  <w:abstractNum w:abstractNumId="27" w15:restartNumberingAfterBreak="0">
+  <w:abstractNum w:abstractNumId="30" w15:restartNumberingAfterBreak="0">
     <w:nsid w:val="7F320735"/>
     <w:multiLevelType w:val="multilevel"/>
     <w:tmpl w:val="97E2243C"/>
@@ -33033,10 +34397,10 @@
     <w:abstractNumId w:val="0"/>
   </w:num>
   <w:num w:numId="18" w16cid:durableId="189228653">
-    <w:abstractNumId w:val="27"/>
+    <w:abstractNumId w:val="30"/>
   </w:num>
   <w:num w:numId="19" w16cid:durableId="1287665530">
-    <w:abstractNumId w:val="13"/>
+    <w:abstractNumId w:val="15"/>
   </w:num>
   <w:num w:numId="20" w16cid:durableId="674117725">
     <w:abstractNumId w:val="0"/>
@@ -33060,7 +34424,7 @@
     <w:abstractNumId w:val="0"/>
   </w:num>
   <w:num w:numId="27" w16cid:durableId="765344840">
-    <w:abstractNumId w:val="13"/>
+    <w:abstractNumId w:val="15"/>
   </w:num>
   <w:num w:numId="28" w16cid:durableId="1357080163">
     <w:abstractNumId w:val="0"/>
@@ -33072,58 +34436,67 @@
     <w:abstractNumId w:val="0"/>
   </w:num>
   <w:num w:numId="31" w16cid:durableId="132255942">
+    <w:abstractNumId w:val="27"/>
+  </w:num>
+  <w:num w:numId="32" w16cid:durableId="399715933">
+    <w:abstractNumId w:val="11"/>
+  </w:num>
+  <w:num w:numId="33" w16cid:durableId="1016885734">
+    <w:abstractNumId w:val="13"/>
+  </w:num>
+  <w:num w:numId="34" w16cid:durableId="1763448326">
+    <w:abstractNumId w:val="23"/>
+  </w:num>
+  <w:num w:numId="35" w16cid:durableId="908997861">
+    <w:abstractNumId w:val="18"/>
+  </w:num>
+  <w:num w:numId="36" w16cid:durableId="2140343056">
+    <w:abstractNumId w:val="25"/>
+  </w:num>
+  <w:num w:numId="37" w16cid:durableId="1215771005">
+    <w:abstractNumId w:val="29"/>
+  </w:num>
+  <w:num w:numId="38" w16cid:durableId="1986541778">
+    <w:abstractNumId w:val="20"/>
+  </w:num>
+  <w:num w:numId="39" w16cid:durableId="2090806921">
+    <w:abstractNumId w:val="17"/>
+  </w:num>
+  <w:num w:numId="40" w16cid:durableId="728698545">
     <w:abstractNumId w:val="24"/>
   </w:num>
-  <w:num w:numId="32" w16cid:durableId="399715933">
-    <w:abstractNumId w:val="10"/>
-  </w:num>
-  <w:num w:numId="33" w16cid:durableId="1016885734">
-    <w:abstractNumId w:val="12"/>
-  </w:num>
-  <w:num w:numId="34" w16cid:durableId="1763448326">
-    <w:abstractNumId w:val="20"/>
-  </w:num>
-  <w:num w:numId="35" w16cid:durableId="908997861">
-    <w:abstractNumId w:val="16"/>
-  </w:num>
-  <w:num w:numId="36" w16cid:durableId="2140343056">
-    <w:abstractNumId w:val="22"/>
-  </w:num>
-  <w:num w:numId="37" w16cid:durableId="1215771005">
-    <w:abstractNumId w:val="26"/>
-  </w:num>
-  <w:num w:numId="38" w16cid:durableId="1986541778">
-    <w:abstractNumId w:val="17"/>
-  </w:num>
-  <w:num w:numId="39" w16cid:durableId="2090806921">
-    <w:abstractNumId w:val="15"/>
-  </w:num>
-  <w:num w:numId="40" w16cid:durableId="728698545">
-    <w:abstractNumId w:val="21"/>
-  </w:num>
   <w:num w:numId="41" w16cid:durableId="1975065263">
-    <w:abstractNumId w:val="25"/>
+    <w:abstractNumId w:val="28"/>
   </w:num>
   <w:num w:numId="42" w16cid:durableId="688988692">
     <w:abstractNumId w:val="9"/>
   </w:num>
   <w:num w:numId="43" w16cid:durableId="358236088">
-    <w:abstractNumId w:val="11"/>
+    <w:abstractNumId w:val="12"/>
   </w:num>
   <w:num w:numId="44" w16cid:durableId="1599364847">
-    <w:abstractNumId w:val="14"/>
+    <w:abstractNumId w:val="16"/>
   </w:num>
   <w:num w:numId="45" w16cid:durableId="790437946">
-    <w:abstractNumId w:val="18"/>
+    <w:abstractNumId w:val="21"/>
   </w:num>
   <w:num w:numId="46" w16cid:durableId="1111556430">
     <w:abstractNumId w:val="8"/>
   </w:num>
   <w:num w:numId="47" w16cid:durableId="308290342">
-    <w:abstractNumId w:val="23"/>
+    <w:abstractNumId w:val="26"/>
   </w:num>
   <w:num w:numId="48" w16cid:durableId="850989534">
+    <w:abstractNumId w:val="22"/>
+  </w:num>
+  <w:num w:numId="49" w16cid:durableId="1300838108">
     <w:abstractNumId w:val="19"/>
+  </w:num>
+  <w:num w:numId="50" w16cid:durableId="1579556812">
+    <w:abstractNumId w:val="10"/>
+  </w:num>
+  <w:num w:numId="51" w16cid:durableId="978191908">
+    <w:abstractNumId w:val="14"/>
   </w:num>
 </w:numbering>
 </file>
@@ -34686,19 +36059,6 @@
 </file>
 
 <file path=customXml/item2.xml><?xml version="1.0" encoding="utf-8"?>
-<b:Sources xmlns:b="http://schemas.openxmlformats.org/officeDocument/2006/bibliography" xmlns="http://schemas.openxmlformats.org/officeDocument/2006/bibliography" SelectedStyle="\APASixthEditionOfficeOnline.xsl" StyleName="APA" Version="6"/>
-</file>
-
-<file path=customXml/item3.xml><?xml version="1.0" encoding="utf-8"?>
-<?mso-contentType ?>
-<FormTemplates xmlns="http://schemas.microsoft.com/sharepoint/v3/contenttype/forms">
-  <Display>DocumentLibraryForm</Display>
-  <Edit>DocumentLibraryForm</Edit>
-  <New>DocumentLibraryForm</New>
-</FormTemplates>
-</file>
-
-<file path=customXml/item4.xml><?xml version="1.0" encoding="utf-8"?>
 <ct:contentTypeSchema xmlns:ct="http://schemas.microsoft.com/office/2006/metadata/contentType" xmlns:ma="http://schemas.microsoft.com/office/2006/metadata/properties/metaAttributes" ct:_="" ma:_="" ma:contentTypeName="Dokument" ma:contentTypeID="0x010100C89A348DBC280C4BB08D29548E58533C" ma:contentTypeVersion="10" ma:contentTypeDescription="Ein neues Dokument erstellen." ma:contentTypeScope="" ma:versionID="46a6087d9fea8580f185a0ea868da469">
   <xsd:schema xmlns:xsd="http://www.w3.org/2001/XMLSchema" xmlns:xs="http://www.w3.org/2001/XMLSchema" xmlns:p="http://schemas.microsoft.com/office/2006/metadata/properties" xmlns:ns2="83c7e37f-cb9c-4af6-99b9-72a827d5e6dc" xmlns:ns3="5030cb7a-6be5-477a-957d-975e4d3028a7" targetNamespace="http://schemas.microsoft.com/office/2006/metadata/properties" ma:root="true" ma:fieldsID="b2782d6ccc790305c9f50df66f3552fa" ns2:_="" ns3:_="">
     <xsd:import namespace="83c7e37f-cb9c-4af6-99b9-72a827d5e6dc"/>
@@ -34887,6 +36247,19 @@
 </ct:contentTypeSchema>
 </file>
 
+<file path=customXml/item3.xml><?xml version="1.0" encoding="utf-8"?>
+<?mso-contentType ?>
+<FormTemplates xmlns="http://schemas.microsoft.com/sharepoint/v3/contenttype/forms">
+  <Display>DocumentLibraryForm</Display>
+  <Edit>DocumentLibraryForm</Edit>
+  <New>DocumentLibraryForm</New>
+</FormTemplates>
+</file>
+
+<file path=customXml/item4.xml><?xml version="1.0" encoding="utf-8"?>
+<b:Sources xmlns:b="http://schemas.openxmlformats.org/officeDocument/2006/bibliography" xmlns="http://schemas.openxmlformats.org/officeDocument/2006/bibliography" SelectedStyle="\APASixthEditionOfficeOnline.xsl" StyleName="APA" Version="6"/>
+</file>
+
 <file path=customXml/itemProps1.xml><?xml version="1.0" encoding="utf-8"?>
 <ds:datastoreItem xmlns:ds="http://schemas.openxmlformats.org/officeDocument/2006/customXml" ds:itemID="{DD10C81C-5102-4A78-A03C-91060A758387}">
   <ds:schemaRefs>
@@ -34899,22 +36272,6 @@
 </file>
 
 <file path=customXml/itemProps2.xml><?xml version="1.0" encoding="utf-8"?>
-<ds:datastoreItem xmlns:ds="http://schemas.openxmlformats.org/officeDocument/2006/customXml" ds:itemID="{6EA21FE9-FCDC-40D5-A414-287367AA0E64}">
-  <ds:schemaRefs>
-    <ds:schemaRef ds:uri="http://schemas.openxmlformats.org/officeDocument/2006/bibliography"/>
-  </ds:schemaRefs>
-</ds:datastoreItem>
-</file>
-
-<file path=customXml/itemProps3.xml><?xml version="1.0" encoding="utf-8"?>
-<ds:datastoreItem xmlns:ds="http://schemas.openxmlformats.org/officeDocument/2006/customXml" ds:itemID="{85027515-5CF2-46FD-9F7F-FD7641D2836E}">
-  <ds:schemaRefs>
-    <ds:schemaRef ds:uri="http://schemas.microsoft.com/sharepoint/v3/contenttype/forms"/>
-  </ds:schemaRefs>
-</ds:datastoreItem>
-</file>
-
-<file path=customXml/itemProps4.xml><?xml version="1.0" encoding="utf-8"?>
 <ds:datastoreItem xmlns:ds="http://schemas.openxmlformats.org/officeDocument/2006/customXml" ds:itemID="{1B4D8889-5F63-4244-BBAC-17C1296DC3C9}">
   <ds:schemaRefs>
     <ds:schemaRef ds:uri="http://schemas.microsoft.com/office/2006/metadata/contentType"/>
@@ -34931,4 +36288,20 @@
     <ds:schemaRef ds:uri="http://schemas.microsoft.com/internal/obd"/>
   </ds:schemaRefs>
 </ds:datastoreItem>
+</file>
+
+<file path=customXml/itemProps3.xml><?xml version="1.0" encoding="utf-8"?>
+<ds:datastoreItem xmlns:ds="http://schemas.openxmlformats.org/officeDocument/2006/customXml" ds:itemID="{85027515-5CF2-46FD-9F7F-FD7641D2836E}">
+  <ds:schemaRefs>
+    <ds:schemaRef ds:uri="http://schemas.microsoft.com/sharepoint/v3/contenttype/forms"/>
+  </ds:schemaRefs>
+</ds:datastoreItem>
+</file>
+
+<file path=customXml/itemProps4.xml><?xml version="1.0" encoding="utf-8"?>
+<ds:datastoreItem xmlns:ds="http://schemas.openxmlformats.org/officeDocument/2006/customXml" ds:itemID="{6EA21FE9-FCDC-40D5-A414-287367AA0E64}">
+  <ds:schemaRefs>
+    <ds:schemaRef ds:uri="http://schemas.openxmlformats.org/officeDocument/2006/bibliography"/>
+  </ds:schemaRefs>
+</ds:datastoreItem>
 </file>
</xml_diff>